<commit_message>
Expand HearthBound web workflows with scoped permissions and self-paced tours
</commit_message>
<xml_diff>
--- a/HearthBound_User_Admin_Guide.docx
+++ b/HearthBound_User_Admin_Guide.docx
@@ -718,7 +718,7 @@
     </w:p>
     <w:p>
       <w:r>
-        <w:t>Open a house you manage to edit its supported details, such as nickname, description and tags. Favorites and saved-search management remain available through Discord; the web provides the personal collection view in My Address Book.</w:t>
+        <w:t>Open a house you manage to edit its official catalog selection, ESO owner, nickname, description and tags. My Address Book includes favorites, visit state, recent views, saved searches and personal tour progress on the web. Deletion and visibility changes require a separate impact preview and explicit confirmation.</w:t>
       </w:r>
     </w:p>
     <w:p>
@@ -1129,12 +1129,12 @@
     </w:p>
     <w:p>
       <w:r>
-        <w:t>Members request Server or Global moderator access through Discord Help. Current HearthBound Server administrators approve Server requests for their server and can revoke individual grants. Users cannot approve their own request. Removing a grant does not remove an independent Discord role.</w:t>
+        <w:t>Members request Server or Global moderator access through Help in Discord or Help &amp; Access on the web. Current HearthBound Server administrators approve Server requests for their server and can revoke individual grants. Users cannot approve their own request. Removing a grant does not remove an independent Discord role.</w:t>
       </w:r>
     </w:p>
     <w:p>
       <w:r>
-        <w:t>Configured bot owners manage environment-specific Global requests and grants on the web. Legacy approval-only user IDs retain their existing Discord approval workflow, without becoming owners or Global administrators. Initial settings bootstrap behavior does not grant general editing or request approval.</w:t>
+        <w:t>Configured bot owners manage environment-specific Global requests and grants on the web. Existing designated approval-only IDs also have a dedicated Global approval page without becoming owners or Global administrators. Initial settings bootstrap access does not grant general editing or request approval.</w:t>
       </w:r>
     </w:p>
     <w:p>
@@ -1419,7 +1419,7 @@
     </w:p>
     <w:p>
       <w:r>
-        <w:t>Members recover their own legacy unassigned Private records through My Address Book. Administrators recover only provably guild-linked shared tours through the existing Discord recovery workflow. Catalog conflict warnings require owner review rather than silently overwriting definitions.</w:t>
+        <w:t>Members recover their own legacy unassigned Private records through My Address Book. Administrators recover only provably guild-linked shared tours through Discord or web recovery previews. Catalog conflict warnings require owner review rather than silently overwriting definitions.</w:t>
       </w:r>
     </w:p>
     <w:p>
@@ -1433,6 +1433,136 @@
     <w:p>
       <w:r>
         <w:t>README.md links to docs/member-guide.md, docs/administration.md, docs/HearthBound-current-state.md and docs/upgrade-v1.0.62.md. docs/historical-documentation.md identifies older AddressBook references and historical design notes. Use the current guides for deployment and the portal; retain older documents only as history.</w:t>
+      </w:r>
+    </w:p>
+    <w:p>
+      <w:r>
+        <w:br w:type="page"/>
+      </w:r>
+    </w:p>
+    <w:p>
+      <w:pPr>
+        <w:pStyle w:val="Heading1"/>
+      </w:pPr>
+      <w:r>
+        <w:t>Expanded web collections and tours</w:t>
+      </w:r>
+    </w:p>
+    <w:p>
+      <w:pPr>
+        <w:pStyle w:val="Heading2"/>
+      </w:pPr>
+      <w:r>
+        <w:t>Access based controls</w:t>
+      </w:r>
+    </w:p>
+    <w:p>
+      <w:r>
+        <w:t>Administration, settings, catalog tools and record actions appear only when your current HearthBound capabilities permit them. Direct URLs and submissions independently recheck membership, ownership, server and ESO environment. Other members’ Private records remain protected even from administrators and bot owners.</w:t>
+      </w:r>
+    </w:p>
+    <w:p>
+      <w:pPr>
+        <w:pStyle w:val="Heading2"/>
+      </w:pPr>
+      <w:r>
+        <w:t>House actions</w:t>
+      </w:r>
+    </w:p>
+    <w:p>
+      <w:r>
+        <w:t>Open a house to favorite it, set Want to Visit or Visited, read or add comments, report a problem and copy ESO access links. Official metadata is available below the house. Authorized editors can change visibility or delete the registration after reviewing the impact. The catalog definition and other registrations remain.</w:t>
+      </w:r>
+    </w:p>
+    <w:p>
+      <w:pPr>
+        <w:pStyle w:val="Heading2"/>
+      </w:pPr>
+      <w:r>
+        <w:t>Saved searches and ordered results</w:t>
+      </w:r>
+    </w:p>
+    <w:p>
+      <w:r>
+        <w:t>Advanced Search supports names, owners, tags, zones, types, styles and visibility. Save filters, run, rename or delete searches from My Address Book. Select multiple results to add to an eligible tour. Checkbox selection order is retained; review and drag stops or use Move up and Move down before saving.</w:t>
+      </w:r>
+    </w:p>
+    <w:p>
+      <w:pPr>
+        <w:pStyle w:val="Heading2"/>
+      </w:pPr>
+      <w:r>
+        <w:t>Independent web player</w:t>
+      </w:r>
+    </w:p>
+    <w:p>
+      <w:r>
+        <w:t>Start or resume a tour to see the current house, notes and jump links. Complete a stop and advance, return to the previous stop or restart deliberately. Progress is saved and reconciled with route changes. The web player does not create or control a live Discord session. Tour editors can update stop titles and notes or confirm tour deletion.</w:t>
+      </w:r>
+    </w:p>
+    <w:p>
+      <w:r>
+        <w:br w:type="page"/>
+      </w:r>
+    </w:p>
+    <w:p>
+      <w:pPr>
+        <w:pStyle w:val="Heading1"/>
+      </w:pPr>
+      <w:r>
+        <w:t>Web sharing and server operations</w:t>
+      </w:r>
+    </w:p>
+    <w:p>
+      <w:pPr>
+        <w:pStyle w:val="Heading2"/>
+      </w:pPr>
+      <w:r>
+        <w:t>Share Passes</w:t>
+      </w:r>
+    </w:p>
+    <w:p>
+      <w:r>
+        <w:t>Create a revocable web link from a house or tour, or choose a Discord channel and optional existing thread. Review and confirm before posting. Both your and the bot’s permissions are checked again before sending. Manage your own passes under My Address Book. Issuing a replacement link invalidates the old token, including old Discord cards.</w:t>
+      </w:r>
+    </w:p>
+    <w:p>
+      <w:pPr>
+        <w:pStyle w:val="Heading2"/>
+      </w:pPr>
+      <w:r>
+        <w:t>Private pass access</w:t>
+      </w:r>
+    </w:p>
+    <w:p>
+      <w:r>
+        <w:t>An explicit pass provides limited viewing without ordinary Private visibility or editing rights. A shared tour supports independent web navigation; copy it to My Address Book to save persistent personal progress. Copies belong to their creators and remain after pass revocation. Further pass access stops when the pass is revoked.</w:t>
+      </w:r>
+    </w:p>
+    <w:p>
+      <w:pPr>
+        <w:pStyle w:val="Heading2"/>
+      </w:pPr>
+      <w:r>
+        <w:t>Configuration and recovery</w:t>
+      </w:r>
+    </w:p>
+    <w:p>
+      <w:r>
+        <w:t>Authorized server settings include channel, timezone, registration roles and policies, Featured expiration and ordering, environment changes and legacy recovery. Environment and recovery actions show impact counts before confirmation. Private recovery applies only to the signed-in creator’s records. Owner-only catalog and Global approval controls retain their existing boundaries.</w:t>
+      </w:r>
+    </w:p>
+    <w:p>
+      <w:pPr>
+        <w:pStyle w:val="Heading2"/>
+      </w:pPr>
+      <w:r>
+        <w:t>Deploying this update</w:t>
+      </w:r>
+    </w:p>
+    <w:p>
+      <w:r>
+        <w:t>No new database schema is required beyond the existing schema 12. Back up production as usual, pull the merged code, run npm ci and restart hearthbound.service. Preserve the deployed .env, WEB_SESSION_SECRET and database settings. Do not replace the production database with a Windows test database. Scheduled events remain retired; live leader-controlled Discord sessions remain in Discord.</w:t>
       </w:r>
     </w:p>
     <w:sectPr>

</xml_diff>

<commit_message>
Normalize owner catalog metadata and add safe catalog editing
</commit_message>
<xml_diff>
--- a/HearthBound_User_Admin_Guide.docx
+++ b/HearthBound_User_Admin_Guide.docx
@@ -767,7 +767,7 @@
     </w:p>
     <w:p>
       <w:r>
-        <w:t>The web picker shows up to 25 matching houses. After saving, additional houses can be added from their detail pages. If another editor changed the route, a stale save is rejected: reopen the tour before reapplying your edits.</w:t>
+        <w:t>The web picker loads all accessible active houses. Name or owner, tag and visibility filters apply immediately; More filters offers zone, style, type and classification. Filtering preserves selected stops and their order. Enter inside the filters does not save the draft. A stale save is rejected; reopen the tour before reapplying edits.</w:t>
       </w:r>
     </w:p>
     <w:tbl>
@@ -1191,7 +1191,7 @@
     </w:p>
     <w:p>
       <w:r>
-        <w:t>Only Discord user IDs in BOT_OWNER_IDS can add newly released official ESO houses. Open House Catalog on the web or Administration then Add Official House in Discord. Server and Global administration alone do not grant this tool.</w:t>
+        <w:t>Only Discord user IDs in BOT_OWNER_IDS can add or edit official ESO houses. Open House Catalog on the web, or Administration then Add Official House or Edit Official House in Discord. Server and Global administration alone do not grant this tool.</w:t>
       </w:r>
     </w:p>
     <w:p>
@@ -1201,7 +1201,7 @@
     </w:p>
     <w:p>
       <w:r>
-        <w:t>Existing IDs are rejected rather than overwritten; similar names trigger a warning. This creates an official catalog definition, not a player registration. New definitions become available without a code release. Owner-added provenance survives startup seeds and supported transfers. Conflicting packaged data produces a review warning while preserving the owner definition. This tool does not overwrite or delete existing definitions.</w:t>
+        <w:t>Adding a duplicate ID is rejected. Existing definitions can be edited with changed-field preview and explicit confirmation; their in-game IDs remain fixed. Edited definitions survive startup seeding and supported database transfers. Catalog deletion is not offered.</w:t>
       </w:r>
     </w:p>
     <w:p>
@@ -1378,7 +1378,7 @@
     </w:p>
     <w:p>
       <w:r>
-        <w:t>Schema 12 adds usage records and owner catalog provenance while retaining existing housing, tours, access grants and progress. Back up before startup and follow docs/upgrade-v1.0.62.md for checks and recovery. Do not replace the Linux production database with an old Windows development copy.</w:t>
+        <w:t>Schema 12 adds usage records and owner catalog provenance while retaining existing housing, tours, access grants and progress. Back up before startup and follow docs/upgrade-v1.0.62.md for checks and recovery. Do not replace the Linux production database with an old Windows development copy. Schema 13 adds normalized classification profiles, reusable catalog values and per-house capacity exceptions. Existing registrations and tour links are retained.</w:t>
       </w:r>
     </w:p>
     <w:p>
@@ -1562,7 +1562,85 @@
     </w:p>
     <w:p>
       <w:r>
-        <w:t>No new database schema is required beyond the existing schema 12. Back up production as usual, pull the merged code, run npm ci and restart hearthbound.service. Preserve the deployed .env, WEB_SESSION_SECRET and database settings. Do not replace the production database with a Windows test database. Scheduled events remain retired; live leader-controlled Discord sessions remain in Discord.</w:t>
+        <w:t>The catalog management update adds schema 13. Back up production, pull the merged code, run npm ci and restart hearthbound.service. Startup migrates the configured Linux database in place. Preserve .env, WEB_SESSION_SECRET and the existing database settings. Do not copy a Windows test database to production. Follow docs/upgrade-v1.0.63.md for verification and rollback.</w:t>
+      </w:r>
+    </w:p>
+    <w:p>
+      <w:r>
+        <w:br w:type="page"/>
+      </w:r>
+    </w:p>
+    <w:p>
+      <w:pPr>
+        <w:pStyle w:val="Heading1"/>
+      </w:pPr>
+      <w:r>
+        <w:t>Owner catalog management</w:t>
+      </w:r>
+    </w:p>
+    <w:p>
+      <w:pPr>
+        <w:pStyle w:val="Heading2"/>
+      </w:pPr>
+      <w:r>
+        <w:t>Editing an existing official house</w:t>
+      </w:r>
+    </w:p>
+    <w:p>
+      <w:r>
+        <w:t>Open House Catalog, search by official name or numeric ID, and choose Edit official house. Update the grouped metadata fields, preview the changed fields and explicitly confirm. The in-game ID is fixed. Registrations and tour stops remain linked; edited definitions are protected from startup seed replacement.</w:t>
+      </w:r>
+    </w:p>
+    <w:p>
+      <w:pPr>
+        <w:pStyle w:val="Heading2"/>
+      </w:pPr>
+      <w:r>
+        <w:t>Shared classification profiles</w:t>
+      </w:r>
+    </w:p>
+    <w:p>
+      <w:r>
+        <w:t>Classification profiles store furnishing, collectible and visitor defaults separately for Staple, Classic and Notable homes. Apply selected classification defaults changes only the current house draft; adjust individual fields for exceptions. Changing a shared profile previews the number of existing houses affected before confirmation, while preserving explicit house exceptions.</w:t>
+      </w:r>
+    </w:p>
+    <w:p>
+      <w:pPr>
+        <w:pStyle w:val="Heading2"/>
+      </w:pPr>
+      <w:r>
+        <w:t>Reusable metadata suggestions</w:t>
+      </w:r>
+    </w:p>
+    <w:p>
+      <w:r>
+        <w:t>Styles, zones, subzones, house types, purchase types and availability values live in a shared lookup table. Autocomplete suggests existing values and permits new text. New values become reusable after a house is saved. Shared values also supports adding suggestions, previewing a rename across houses and removing unused values.</w:t>
+      </w:r>
+    </w:p>
+    <w:p>
+      <w:pPr>
+        <w:pStyle w:val="Heading2"/>
+      </w:pPr>
+      <w:r>
+        <w:t>Database upgrade and safety</w:t>
+      </w:r>
+    </w:p>
+    <w:p>
+      <w:r>
+        <w:t>Migration 13 creates house_classifications, house_catalog_values and house_capacity_overrides. Existing flat house fields remain populated for Discord and search compatibility. Startup upgrades the configured backend automatically after a verified backup. Restore matching old code and database together if rollback is necessary.</w:t>
+      </w:r>
+    </w:p>
+    <w:p>
+      <w:pPr>
+        <w:pStyle w:val="Heading2"/>
+      </w:pPr>
+      <w:r>
+        <w:t>Discord and web access</w:t>
+      </w:r>
+    </w:p>
+    <w:p>
+      <w:r>
+        <w:t>Bot owners can use Administration then Edit Official House in Discord for core fields, with lookup, preview and confirmation. Use the web portal for full capacity, purchase and shared-value management. These tools do not expand access to another creator’s Private houses or tours.</w:t>
       </w:r>
     </w:p>
     <w:sectPr>

</xml_diff>

<commit_message>
Refresh the downloadable HearthBound guide for current workflows
</commit_message>
<xml_diff>
--- a/HearthBound_User_Admin_Guide.docx
+++ b/HearthBound_User_Admin_Guide.docx
@@ -11,34 +11,179 @@
       </w:r>
     </w:p>
     <w:p>
-      <w:pPr>
-        <w:pStyle w:val="Subtitle"/>
-      </w:pPr>
       <w:r>
-        <w:t>Discord housing and the member web portal</w:t>
+        <w:rPr>
+          <w:b w:val="0"/>
+        </w:rPr>
+        <w:t>Discord and web workflows</w:t>
       </w:r>
     </w:p>
     <w:p>
       <w:r>
-        <w:t>Use HearthBound to register ESO houses, discover community creations and build housing tours. This guide covers member workflows, administration, privacy and operation of the web portal. It includes the remembered Discord login update following version 1.0.62.</w:t>
+        <w:rPr>
+          <w:b w:val="0"/>
+        </w:rPr>
+        <w:t>Updated 28 October 2026 for the 1.0.70 feature set</w:t>
+      </w:r>
+    </w:p>
+    <w:p>
+      <w:r>
+        <w:rPr>
+          <w:b w:val="0"/>
+        </w:rPr>
+        <w:t>HearthBound helps ESO players register decorated homes, build housing tours and save places they want to explore. Discord and the web portal use the same records. This guide explains everyday tasks, access rules and the production upgrade steps for the screenshot gallery release.</w:t>
       </w:r>
     </w:p>
     <w:p>
       <w:pPr>
-        <w:pStyle w:val="Heading2"/>
+        <w:pStyle w:val="Heading1"/>
       </w:pPr>
       <w:r>
-        <w:t>Getting started</w:t>
+        <w:t>Start with your task</w:t>
+      </w:r>
+    </w:p>
+    <w:p>
+      <w:pPr>
+        <w:pStyle w:val="ListBullet"/>
+      </w:pPr>
+      <w:r>
+        <w:rPr>
+          <w:b w:val="0"/>
+        </w:rPr>
+      </w:r>
+      <w:r>
+        <w:rPr>
+          <w:b/>
+        </w:rPr>
+        <w:t>Register a home:</w:t>
+      </w:r>
+      <w:r>
+        <w:rPr>
+          <w:b w:val="0"/>
+        </w:rPr>
+        <w:t xml:space="preserve"> choose Register New House on the web or from the Discord main menu. Add an ESO owner, description and tags, then optionally add it to a tour.</w:t>
+      </w:r>
+    </w:p>
+    <w:p>
+      <w:pPr>
+        <w:pStyle w:val="ListBullet"/>
+      </w:pPr>
+      <w:r>
+        <w:rPr>
+          <w:b w:val="0"/>
+        </w:rPr>
+      </w:r>
+      <w:r>
+        <w:rPr>
+          <w:b/>
+        </w:rPr>
+        <w:t>Build a route:</w:t>
+      </w:r>
+      <w:r>
+        <w:rPr>
+          <w:b w:val="0"/>
+        </w:rPr>
+        <w:t xml:space="preserve"> open Housing Tours, create or edit a tour, select houses and arrange the stops. The web editor supports drag and drop and notes for each stop.</w:t>
+      </w:r>
+    </w:p>
+    <w:p>
+      <w:pPr>
+        <w:pStyle w:val="ListBullet"/>
+      </w:pPr>
+      <w:r>
+        <w:rPr>
+          <w:b w:val="0"/>
+        </w:rPr>
+      </w:r>
+      <w:r>
+        <w:rPr>
+          <w:b/>
+        </w:rPr>
+        <w:t>Explore:</w:t>
+      </w:r>
+      <w:r>
+        <w:rPr>
+          <w:b w:val="0"/>
+        </w:rPr>
+        <w:t xml:space="preserve"> browse houses or tours, open Random House, or look through Featured Housing. Follow a self-paced route at your own speed.</w:t>
+      </w:r>
+    </w:p>
+    <w:p>
+      <w:pPr>
+        <w:pStyle w:val="ListBullet"/>
+      </w:pPr>
+      <w:r>
+        <w:rPr>
+          <w:b w:val="0"/>
+        </w:rPr>
+      </w:r>
+      <w:r>
+        <w:rPr>
+          <w:b/>
+        </w:rPr>
+        <w:t>Keep a collection:</w:t>
+      </w:r>
+      <w:r>
+        <w:rPr>
+          <w:b w:val="0"/>
+        </w:rPr>
+        <w:t xml:space="preserve"> Favorite a house or mark it Want to Visit or Visited. Find these places in My Address Book.</w:t>
+      </w:r>
+    </w:p>
+    <w:p>
+      <w:pPr>
+        <w:pStyle w:val="Heading1"/>
+      </w:pPr>
+      <w:r>
+        <w:t>Sign in and choose your server</w:t>
       </w:r>
     </w:p>
     <w:p>
       <w:r>
-        <w:t>Run /hearth in Discord. The existing /housing command opens the same menu. Choose Open Web Portal from Home or Help when your deployment enables it, then sign in with Discord and select a server.</w:t>
+        <w:rPr>
+          <w:b w:val="0"/>
+        </w:rPr>
+        <w:t xml:space="preserve">Use </w:t>
+      </w:r>
+      <w:r>
+        <w:rPr>
+          <w:b/>
+        </w:rPr>
+        <w:t>/hearth</w:t>
+      </w:r>
+      <w:r>
+        <w:rPr>
+          <w:b w:val="0"/>
+        </w:rPr>
+        <w:t xml:space="preserve"> in Discord. </w:t>
+      </w:r>
+      <w:r>
+        <w:rPr>
+          <w:b/>
+        </w:rPr>
+        <w:t>/housing</w:t>
+      </w:r>
+      <w:r>
+        <w:rPr>
+          <w:b w:val="0"/>
+        </w:rPr>
+        <w:t xml:space="preserve"> opens the same menu and accepts the same optional screenshot arguments. Open Web Portal appears when your deployment has a public portal URL configured. On the website, continue into HearthBound and sign in with Discord.</w:t>
       </w:r>
     </w:p>
     <w:p>
       <w:r>
-        <w:t>Check the server and ESO environment in the portal header before working. Your Access lists each applicable role, including the server or environment it covers. Native Discord Administrator permission alone does not grant HearthBound administration.</w:t>
+        <w:rPr>
+          <w:b w:val="0"/>
+        </w:rPr>
+        <w:t>Choose a connected Discord server, then check its ESO environment in the header. The avatar menu includes account actions and the downloadable guide; on small screens, Menu opens the grouped navigation. Your Access shows all applicable HearthBound roles and their scope.</w:t>
+      </w:r>
+    </w:p>
+    <w:p>
+      <w:pPr>
+        <w:pStyle w:val="Heading1"/>
+      </w:pPr>
+      <w:r>
+        <w:t>Understand visibility</w:t>
       </w:r>
     </w:p>
     <w:tbl>
@@ -46,327 +191,230 @@
         <w:tblW w:type="auto" w:w="0"/>
         <w:tblLayout w:type="fixed"/>
         <w:tblLook w:firstColumn="1" w:firstRow="1" w:lastColumn="0" w:lastRow="0" w:noHBand="0" w:noVBand="1" w:val="04A0"/>
+        <w:tblBorders>
+          <w:top w:val="single" w:sz="4" w:color="D9D9D9"/>
+          <w:left w:val="single" w:sz="4" w:color="D9D9D9"/>
+          <w:bottom w:val="single" w:sz="4" w:color="D9D9D9"/>
+          <w:right w:val="single" w:sz="4" w:color="D9D9D9"/>
+          <w:insideH w:val="single" w:sz="4" w:color="D9D9D9"/>
+          <w:insideV w:val="single" w:sz="4" w:color="D9D9D9"/>
+        </w:tblBorders>
       </w:tblPr>
       <w:tblGrid>
-        <w:gridCol w:w="2232"/>
-        <w:gridCol w:w="7848"/>
+        <w:gridCol w:w="1944"/>
+        <w:gridCol w:w="7992"/>
       </w:tblGrid>
       <w:tr>
+        <w:trPr>
+          <w:cantSplit/>
+          <w:tblHeader/>
+        </w:trPr>
         <w:tc>
           <w:tcPr>
-            <w:tcW w:type="dxa" w:w="2232"/>
+            <w:tcW w:type="dxa" w:w="1944"/>
             <w:vAlign w:val="center"/>
-            <w:tcBorders>
-              <w:top w:val="single" w:sz="4" w:color="D9D9D9"/>
-              <w:left w:val="single" w:sz="4" w:color="D9D9D9"/>
-              <w:bottom w:val="single" w:sz="4" w:color="D9D9D9"/>
-              <w:right w:val="single" w:sz="4" w:color="D9D9D9"/>
-            </w:tcBorders>
-            <w:shd w:fill="E7ECF0"/>
+            <w:shd w:fill="17324D"/>
             <w:tcMar>
-              <w:top w:w="90" w:type="dxa"/>
-              <w:left w:w="90" w:type="dxa"/>
-              <w:bottom w:w="90" w:type="dxa"/>
-              <w:right w:w="90" w:type="dxa"/>
+              <w:top w:w="100" w:type="dxa"/>
+              <w:left w:w="100" w:type="dxa"/>
+              <w:bottom w:w="100" w:type="dxa"/>
+              <w:right w:w="100" w:type="dxa"/>
             </w:tcMar>
           </w:tcPr>
           <w:p>
             <w:pPr>
-              <w:spacing w:after="60"/>
+              <w:spacing w:after="40" w:before="40"/>
             </w:pPr>
             <w:r>
               <w:rPr>
                 <w:b/>
-                <w:sz w:val="19"/>
+                <w:color w:val="FFFFFF"/>
               </w:rPr>
-              <w:t>Access</w:t>
+              <w:t>Visibility</w:t>
             </w:r>
           </w:p>
         </w:tc>
         <w:tc>
           <w:tcPr>
-            <w:tcW w:type="dxa" w:w="7848"/>
+            <w:tcW w:type="dxa" w:w="7992"/>
             <w:vAlign w:val="center"/>
-            <w:tcBorders>
-              <w:top w:val="single" w:sz="4" w:color="D9D9D9"/>
-              <w:left w:val="single" w:sz="4" w:color="D9D9D9"/>
-              <w:bottom w:val="single" w:sz="4" w:color="D9D9D9"/>
-              <w:right w:val="single" w:sz="4" w:color="D9D9D9"/>
-            </w:tcBorders>
-            <w:shd w:fill="E7ECF0"/>
+            <w:shd w:fill="17324D"/>
             <w:tcMar>
-              <w:top w:w="90" w:type="dxa"/>
-              <w:left w:w="90" w:type="dxa"/>
-              <w:bottom w:w="90" w:type="dxa"/>
-              <w:right w:w="90" w:type="dxa"/>
+              <w:top w:w="100" w:type="dxa"/>
+              <w:left w:w="100" w:type="dxa"/>
+              <w:bottom w:w="100" w:type="dxa"/>
+              <w:right w:w="100" w:type="dxa"/>
             </w:tcMar>
           </w:tcPr>
           <w:p>
             <w:pPr>
-              <w:spacing w:after="60"/>
+              <w:spacing w:after="40" w:before="40"/>
             </w:pPr>
             <w:r>
               <w:rPr>
                 <w:b/>
-                <w:sz w:val="19"/>
+                <w:color w:val="FFFFFF"/>
               </w:rPr>
-              <w:t>Capabilities</w:t>
+              <w:t>Who can use the record</w:t>
             </w:r>
           </w:p>
         </w:tc>
       </w:tr>
       <w:tr>
+        <w:trPr>
+          <w:cantSplit/>
+        </w:trPr>
         <w:tc>
           <w:tcPr>
-            <w:tcW w:type="dxa" w:w="2232"/>
+            <w:tcW w:type="dxa" w:w="1944"/>
             <w:vAlign w:val="center"/>
-            <w:tcBorders>
-              <w:top w:val="single" w:sz="4" w:color="D9D9D9"/>
-              <w:left w:val="single" w:sz="4" w:color="D9D9D9"/>
-              <w:bottom w:val="single" w:sz="4" w:color="D9D9D9"/>
-              <w:right w:val="single" w:sz="4" w:color="D9D9D9"/>
-            </w:tcBorders>
-            <w:shd w:fill="FFFFFF"/>
+            <w:shd w:fill="F2F5FA"/>
             <w:tcMar>
-              <w:top w:w="90" w:type="dxa"/>
-              <w:left w:w="90" w:type="dxa"/>
-              <w:bottom w:w="90" w:type="dxa"/>
-              <w:right w:w="90" w:type="dxa"/>
+              <w:top w:w="100" w:type="dxa"/>
+              <w:left w:w="100" w:type="dxa"/>
+              <w:bottom w:w="100" w:type="dxa"/>
+              <w:right w:w="100" w:type="dxa"/>
             </w:tcMar>
           </w:tcPr>
           <w:p>
             <w:pPr>
-              <w:spacing w:after="60"/>
+              <w:spacing w:after="40" w:before="40"/>
             </w:pPr>
             <w:r>
               <w:rPr>
                 <w:b w:val="0"/>
-                <w:sz w:val="19"/>
               </w:rPr>
-              <w:t>Member</w:t>
+              <w:t>Private</w:t>
             </w:r>
           </w:p>
         </w:tc>
         <w:tc>
           <w:tcPr>
-            <w:tcW w:type="dxa" w:w="7848"/>
+            <w:tcW w:type="dxa" w:w="7992"/>
             <w:vAlign w:val="center"/>
-            <w:tcBorders>
-              <w:top w:val="single" w:sz="4" w:color="D9D9D9"/>
-              <w:left w:val="single" w:sz="4" w:color="D9D9D9"/>
-              <w:bottom w:val="single" w:sz="4" w:color="D9D9D9"/>
-              <w:right w:val="single" w:sz="4" w:color="D9D9D9"/>
-            </w:tcBorders>
-            <w:shd w:fill="FFFFFF"/>
+            <w:shd w:fill="F2F5FA"/>
             <w:tcMar>
-              <w:top w:w="90" w:type="dxa"/>
-              <w:left w:w="90" w:type="dxa"/>
-              <w:bottom w:w="90" w:type="dxa"/>
-              <w:right w:w="90" w:type="dxa"/>
+              <w:top w:w="100" w:type="dxa"/>
+              <w:left w:w="100" w:type="dxa"/>
+              <w:bottom w:w="100" w:type="dxa"/>
+              <w:right w:w="100" w:type="dxa"/>
             </w:tcMar>
           </w:tcPr>
           <w:p>
             <w:pPr>
-              <w:spacing w:after="60"/>
+              <w:spacing w:after="40" w:before="40"/>
             </w:pPr>
             <w:r>
               <w:rPr>
                 <w:b w:val="0"/>
-                <w:sz w:val="19"/>
               </w:rPr>
-              <w:t>Browse accessible content and manage your own houses and tours.</w:t>
+              <w:t>Its creator. Administrators and bot owners cannot browse another creator's Private houses or tours.</w:t>
             </w:r>
           </w:p>
         </w:tc>
       </w:tr>
       <w:tr>
+        <w:trPr>
+          <w:cantSplit/>
+        </w:trPr>
         <w:tc>
           <w:tcPr>
-            <w:tcW w:type="dxa" w:w="2232"/>
+            <w:tcW w:type="dxa" w:w="1944"/>
             <w:vAlign w:val="center"/>
-            <w:tcBorders>
-              <w:top w:val="single" w:sz="4" w:color="D9D9D9"/>
-              <w:left w:val="single" w:sz="4" w:color="D9D9D9"/>
-              <w:bottom w:val="single" w:sz="4" w:color="D9D9D9"/>
-              <w:right w:val="single" w:sz="4" w:color="D9D9D9"/>
-            </w:tcBorders>
-            <w:shd w:fill="F7F8FA"/>
+            <w:shd w:fill="FFFFFF"/>
             <w:tcMar>
-              <w:top w:w="90" w:type="dxa"/>
-              <w:left w:w="90" w:type="dxa"/>
-              <w:bottom w:w="90" w:type="dxa"/>
-              <w:right w:w="90" w:type="dxa"/>
+              <w:top w:w="100" w:type="dxa"/>
+              <w:left w:w="100" w:type="dxa"/>
+              <w:bottom w:w="100" w:type="dxa"/>
+              <w:right w:w="100" w:type="dxa"/>
             </w:tcMar>
           </w:tcPr>
           <w:p>
             <w:pPr>
-              <w:spacing w:after="60"/>
+              <w:spacing w:after="40" w:before="40"/>
             </w:pPr>
             <w:r>
               <w:rPr>
                 <w:b w:val="0"/>
-                <w:sz w:val="19"/>
               </w:rPr>
-              <w:t>Server Administrator</w:t>
+              <w:t>Server</w:t>
             </w:r>
           </w:p>
         </w:tc>
         <w:tc>
           <w:tcPr>
-            <w:tcW w:type="dxa" w:w="7848"/>
+            <w:tcW w:type="dxa" w:w="7992"/>
             <w:vAlign w:val="center"/>
-            <w:tcBorders>
-              <w:top w:val="single" w:sz="4" w:color="D9D9D9"/>
-              <w:left w:val="single" w:sz="4" w:color="D9D9D9"/>
-              <w:bottom w:val="single" w:sz="4" w:color="D9D9D9"/>
-              <w:right w:val="single" w:sz="4" w:color="D9D9D9"/>
-            </w:tcBorders>
-            <w:shd w:fill="F7F8FA"/>
+            <w:shd w:fill="FFFFFF"/>
             <w:tcMar>
-              <w:top w:w="90" w:type="dxa"/>
-              <w:left w:w="90" w:type="dxa"/>
-              <w:bottom w:w="90" w:type="dxa"/>
-              <w:right w:w="90" w:type="dxa"/>
+              <w:top w:w="100" w:type="dxa"/>
+              <w:left w:w="100" w:type="dxa"/>
+              <w:bottom w:w="100" w:type="dxa"/>
+              <w:right w:w="100" w:type="dxa"/>
             </w:tcMar>
           </w:tcPr>
           <w:p>
             <w:pPr>
-              <w:spacing w:after="60"/>
+              <w:spacing w:after="40" w:before="40"/>
             </w:pPr>
             <w:r>
               <w:rPr>
                 <w:b w:val="0"/>
-                <w:sz w:val="19"/>
               </w:rPr>
-              <w:t>Manage Server houses and tours for that server and review eligible submissions and requests.</w:t>
+              <w:t>Eligible members of that Discord server, in its configured ESO environment.</w:t>
             </w:r>
           </w:p>
         </w:tc>
       </w:tr>
       <w:tr>
+        <w:trPr>
+          <w:cantSplit/>
+        </w:trPr>
         <w:tc>
           <w:tcPr>
-            <w:tcW w:type="dxa" w:w="2232"/>
+            <w:tcW w:type="dxa" w:w="1944"/>
             <w:vAlign w:val="center"/>
-            <w:tcBorders>
-              <w:top w:val="single" w:sz="4" w:color="D9D9D9"/>
-              <w:left w:val="single" w:sz="4" w:color="D9D9D9"/>
-              <w:bottom w:val="single" w:sz="4" w:color="D9D9D9"/>
-              <w:right w:val="single" w:sz="4" w:color="D9D9D9"/>
-            </w:tcBorders>
-            <w:shd w:fill="FFFFFF"/>
+            <w:shd w:fill="F2F5FA"/>
             <w:tcMar>
-              <w:top w:w="90" w:type="dxa"/>
-              <w:left w:w="90" w:type="dxa"/>
-              <w:bottom w:w="90" w:type="dxa"/>
-              <w:right w:w="90" w:type="dxa"/>
+              <w:top w:w="100" w:type="dxa"/>
+              <w:left w:w="100" w:type="dxa"/>
+              <w:bottom w:w="100" w:type="dxa"/>
+              <w:right w:w="100" w:type="dxa"/>
             </w:tcMar>
           </w:tcPr>
           <w:p>
             <w:pPr>
-              <w:spacing w:after="60"/>
+              <w:spacing w:after="40" w:before="40"/>
             </w:pPr>
             <w:r>
               <w:rPr>
                 <w:b w:val="0"/>
-                <w:sz w:val="19"/>
               </w:rPr>
-              <w:t>Global Administrator</w:t>
+              <w:t>Global</w:t>
             </w:r>
           </w:p>
         </w:tc>
         <w:tc>
           <w:tcPr>
-            <w:tcW w:type="dxa" w:w="7848"/>
+            <w:tcW w:type="dxa" w:w="7992"/>
             <w:vAlign w:val="center"/>
-            <w:tcBorders>
-              <w:top w:val="single" w:sz="4" w:color="D9D9D9"/>
-              <w:left w:val="single" w:sz="4" w:color="D9D9D9"/>
-              <w:bottom w:val="single" w:sz="4" w:color="D9D9D9"/>
-              <w:right w:val="single" w:sz="4" w:color="D9D9D9"/>
-            </w:tcBorders>
-            <w:shd w:fill="FFFFFF"/>
+            <w:shd w:fill="F2F5FA"/>
             <w:tcMar>
-              <w:top w:w="90" w:type="dxa"/>
-              <w:left w:w="90" w:type="dxa"/>
-              <w:bottom w:w="90" w:type="dxa"/>
-              <w:right w:w="90" w:type="dxa"/>
+              <w:top w:w="100" w:type="dxa"/>
+              <w:left w:w="100" w:type="dxa"/>
+              <w:bottom w:w="100" w:type="dxa"/>
+              <w:right w:w="100" w:type="dxa"/>
             </w:tcMar>
           </w:tcPr>
           <w:p>
             <w:pPr>
-              <w:spacing w:after="60"/>
+              <w:spacing w:after="40" w:before="40"/>
             </w:pPr>
             <w:r>
               <w:rPr>
                 <w:b w:val="0"/>
-                <w:sz w:val="19"/>
               </w:rPr>
-              <w:t>Manage Global houses and Global or Server tours in the approved ESO environment. Server-house editing is a separate permission.</w:t>
-            </w:r>
-          </w:p>
-        </w:tc>
-      </w:tr>
-      <w:tr>
-        <w:tc>
-          <w:tcPr>
-            <w:tcW w:type="dxa" w:w="2232"/>
-            <w:vAlign w:val="center"/>
-            <w:tcBorders>
-              <w:top w:val="single" w:sz="4" w:color="D9D9D9"/>
-              <w:left w:val="single" w:sz="4" w:color="D9D9D9"/>
-              <w:bottom w:val="single" w:sz="4" w:color="D9D9D9"/>
-              <w:right w:val="single" w:sz="4" w:color="D9D9D9"/>
-            </w:tcBorders>
-            <w:shd w:fill="F7F8FA"/>
-            <w:tcMar>
-              <w:top w:w="90" w:type="dxa"/>
-              <w:left w:w="90" w:type="dxa"/>
-              <w:bottom w:w="90" w:type="dxa"/>
-              <w:right w:w="90" w:type="dxa"/>
-            </w:tcMar>
-          </w:tcPr>
-          <w:p>
-            <w:pPr>
-              <w:spacing w:after="60"/>
-            </w:pPr>
-            <w:r>
-              <w:rPr>
-                <w:b w:val="0"/>
-                <w:sz w:val="19"/>
-              </w:rPr>
-              <w:t>Bot Owner</w:t>
-            </w:r>
-          </w:p>
-        </w:tc>
-        <w:tc>
-          <w:tcPr>
-            <w:tcW w:type="dxa" w:w="7848"/>
-            <w:vAlign w:val="center"/>
-            <w:tcBorders>
-              <w:top w:val="single" w:sz="4" w:color="D9D9D9"/>
-              <w:left w:val="single" w:sz="4" w:color="D9D9D9"/>
-              <w:bottom w:val="single" w:sz="4" w:color="D9D9D9"/>
-              <w:right w:val="single" w:sz="4" w:color="D9D9D9"/>
-            </w:tcBorders>
-            <w:shd w:fill="F7F8FA"/>
-            <w:tcMar>
-              <w:top w:w="90" w:type="dxa"/>
-              <w:left w:w="90" w:type="dxa"/>
-              <w:bottom w:w="90" w:type="dxa"/>
-              <w:right w:w="90" w:type="dxa"/>
-            </w:tcMar>
-          </w:tcPr>
-          <w:p>
-            <w:pPr>
-              <w:spacing w:after="60"/>
-            </w:pPr>
-            <w:r>
-              <w:rPr>
-                <w:b w:val="0"/>
-                <w:sz w:val="19"/>
-              </w:rPr>
-              <w:t>All configured role capabilities, Global grant management and official house catalog additions.</w:t>
+              <w:t>Eligible members of connected servers using that ESO environment.</w:t>
             </w:r>
           </w:p>
         </w:tc>
@@ -379,20 +427,10 @@
     </w:p>
     <w:p>
       <w:r>
-        <w:t>Private houses and tours remain creator-only, including against administrators and bot owners. A revocable Share Pass can provide limited viewing without administrative editing rights. Editing a tour does not automatically grant access to its houses.</w:t>
-      </w:r>
-    </w:p>
-    <w:p>
-      <w:pPr>
-        <w:pStyle w:val="Heading2"/>
-      </w:pPr>
-      <w:r>
-        <w:t>Using this guide</w:t>
-      </w:r>
-    </w:p>
-    <w:p>
-      <w:r>
-        <w:t>The following pages cover houses and discovery; tours and sharing; web administration; owner tools and community usage; configuration and remembered login; and database operations and troubleshooting. The repository Markdown guides provide the detailed reference.</w:t>
+        <w:rPr>
+          <w:b w:val="0"/>
+        </w:rPr>
+        <w:t>New houses and tours default to Server where registration policy permits. Visibility is separate from ESO environment. A Share Pass can grant limited, revocable viewing without granting editing rights. HearthBound links do not override the ESO house owner's in-game access settings.</w:t>
       </w:r>
     </w:p>
     <w:p>
@@ -405,7 +443,7 @@
         <w:pStyle w:val="Heading1"/>
       </w:pPr>
       <w:r>
-        <w:t>Houses and discovery</w:t>
+        <w:t>Register and manage houses</w:t>
       </w:r>
     </w:p>
     <w:p>
@@ -413,12 +451,924 @@
         <w:pStyle w:val="Heading2"/>
       </w:pPr>
       <w:r>
-        <w:t>Find and register a house</w:t>
+        <w:t>Register from a housing link or script</w:t>
+      </w:r>
+    </w:p>
+    <w:p>
+      <w:pPr>
+        <w:numPr>
+          <w:ilvl w:val="0"/>
+          <w:numId w:val="10"/>
+        </w:numPr>
+      </w:pPr>
+      <w:r>
+        <w:rPr>
+          <w:b w:val="0"/>
+        </w:rPr>
+        <w:t xml:space="preserve">Choose </w:t>
+      </w:r>
+      <w:r>
+        <w:rPr>
+          <w:b/>
+        </w:rPr>
+        <w:t>Register New House</w:t>
+      </w:r>
+      <w:r>
+        <w:rPr>
+          <w:b w:val="0"/>
+        </w:rPr>
+        <w:t xml:space="preserve">. You can paste an ESO Housing Link or a JumpToSpecificHouse script and select </w:t>
+      </w:r>
+      <w:r>
+        <w:rPr>
+          <w:b/>
+        </w:rPr>
+        <w:t>Submit</w:t>
+      </w:r>
+      <w:r>
+        <w:rPr>
+          <w:b w:val="0"/>
+        </w:rPr>
+        <w:t>, or find an official house by name or ID.</w:t>
+      </w:r>
+    </w:p>
+    <w:p>
+      <w:pPr>
+        <w:numPr>
+          <w:ilvl w:val="0"/>
+          <w:numId w:val="10"/>
+        </w:numPr>
+      </w:pPr>
+      <w:r>
+        <w:rPr>
+          <w:b w:val="0"/>
+        </w:rPr>
+        <w:t xml:space="preserve">Confirm the official house and </w:t>
+      </w:r>
+      <w:r>
+        <w:rPr>
+          <w:b/>
+        </w:rPr>
+        <w:t>ESO account owner</w:t>
+      </w:r>
+      <w:r>
+        <w:rPr>
+          <w:b w:val="0"/>
+        </w:rPr>
+        <w:t>. This is the account used by the visit command, not necessarily the Discord member submitting the record.</w:t>
+      </w:r>
+    </w:p>
+    <w:p>
+      <w:pPr>
+        <w:numPr>
+          <w:ilvl w:val="0"/>
+          <w:numId w:val="10"/>
+        </w:numPr>
+      </w:pPr>
+      <w:r>
+        <w:rPr>
+          <w:b w:val="0"/>
+        </w:rPr>
+        <w:t>Add a nickname, description and tags. Describe what visitors should look for; tags such as garden, halloween, puzzle or roleplay help others find the build. Blank lines in descriptions remain visible on the web.</w:t>
+      </w:r>
+    </w:p>
+    <w:p>
+      <w:pPr>
+        <w:numPr>
+          <w:ilvl w:val="0"/>
+          <w:numId w:val="10"/>
+        </w:numPr>
+      </w:pPr>
+      <w:r>
+        <w:rPr>
+          <w:b w:val="0"/>
+        </w:rPr>
+        <w:t>Review visibility and register. Shared submissions may require approval or a configured role. If an accessible registration already exists at the same or a broader visibility level, HearthBound identifies the duplicate instead of creating another.</w:t>
+      </w:r>
+    </w:p>
+    <w:p>
+      <w:pPr>
+        <w:numPr>
+          <w:ilvl w:val="0"/>
+          <w:numId w:val="10"/>
+        </w:numPr>
+      </w:pPr>
+      <w:r>
+        <w:rPr>
+          <w:b w:val="0"/>
+        </w:rPr>
+        <w:t xml:space="preserve">After an active registration is saved, choose </w:t>
+      </w:r>
+      <w:r>
+        <w:rPr>
+          <w:b/>
+        </w:rPr>
+        <w:t>Add to tour</w:t>
+      </w:r>
+      <w:r>
+        <w:rPr>
+          <w:b w:val="0"/>
+        </w:rPr>
+        <w:t xml:space="preserve"> or create a new tour with it. Canceling this optional step keeps the house registered. Pending houses must be approved first.</w:t>
       </w:r>
     </w:p>
     <w:p>
       <w:r>
-        <w:t>Search Houses finds accessible official names, ESO owners, nicknames and zones. Open a result for details and copy-ready jump, preview and housing links. Visibility, server, environment and record status are checked when opening saved results.</w:t>
+        <w:rPr>
+          <w:b w:val="0"/>
+        </w:rPr>
+        <w:t>If the official house is missing, check its name or ID. A bot owner can add a newly released official definition; registering a player build does not create an official catalog entry.</w:t>
+      </w:r>
+    </w:p>
+    <w:p>
+      <w:pPr>
+        <w:pStyle w:val="Heading2"/>
+      </w:pPr>
+      <w:r>
+        <w:t>View a house</w:t>
+      </w:r>
+    </w:p>
+    <w:p>
+      <w:r>
+        <w:rPr>
+          <w:b w:val="0"/>
+        </w:rPr>
+        <w:t>A house page identifies its nickname, official name, ESO owner and zone. Visit commands and official catalog details are available without opening a separate house screen. Descriptions, tags, screenshots and accessible tour memberships add context. Only tours you can access appear in its membership list.</w:t>
+      </w:r>
+    </w:p>
+    <w:p>
+      <w:r>
+        <w:rPr>
+          <w:b w:val="0"/>
+        </w:rPr>
+        <w:t xml:space="preserve">Use </w:t>
+      </w:r>
+      <w:r>
+        <w:rPr>
+          <w:b/>
+        </w:rPr>
+        <w:t>Add to tour</w:t>
+      </w:r>
+      <w:r>
+        <w:rPr>
+          <w:b w:val="0"/>
+        </w:rPr>
+        <w:t xml:space="preserve"> to choose an eligible existing route and add optional tour-specific notes. These notes belong to that route; they do not change the house description. Global tours accept Global houses. Server tours accept their source server's houses and Global houses. Private tours may also include their creator's Private houses.</w:t>
+      </w:r>
+    </w:p>
+    <w:p>
+      <w:pPr>
+        <w:pStyle w:val="Heading2"/>
+      </w:pPr>
+      <w:r>
+        <w:t>Manage a registration</w:t>
+      </w:r>
+    </w:p>
+    <w:p>
+      <w:r>
+        <w:rPr>
+          <w:b w:val="0"/>
+        </w:rPr>
+        <w:t xml:space="preserve">Authorized editors use </w:t>
+      </w:r>
+      <w:r>
+        <w:rPr>
+          <w:b/>
+        </w:rPr>
+        <w:t>Manage house</w:t>
+      </w:r>
+      <w:r>
+        <w:rPr>
+          <w:b w:val="0"/>
+        </w:rPr>
+        <w:t xml:space="preserve"> for metadata, visibility and deletion. Visibility changes show their effect on incompatible tour stops before confirmation. Delete is a separate red action with an impact preview. It removes this registration, not the official catalog definition or other registrations of the same ESO destination.</w:t>
+      </w:r>
+    </w:p>
+    <w:p>
+      <w:r>
+        <w:rPr>
+          <w:b w:val="0"/>
+        </w:rPr>
+        <w:t>Eligible administrators can copy a shared registration between servers or reassign its Discord submitter to a member of the relevant server. If the original submitter is not in the destination server, the person copying becomes the submitter. The ESO account owner remains a separate field. These administrative tools do not reassign another creator's Private content.</w:t>
+      </w:r>
+    </w:p>
+    <w:p>
+      <w:r>
+        <w:rPr>
+          <w:b w:val="0"/>
+        </w:rPr>
+        <w:t>If an edit fails, the web form retains entered fields and explains the problem. Check the selected server, environment and current access before retrying.</w:t>
+      </w:r>
+    </w:p>
+    <w:p>
+      <w:r>
+        <w:br w:type="page"/>
+      </w:r>
+    </w:p>
+    <w:p>
+      <w:pPr>
+        <w:pStyle w:val="Heading1"/>
+      </w:pPr>
+      <w:r>
+        <w:t>Save discoveries and add screenshots</w:t>
+      </w:r>
+    </w:p>
+    <w:p>
+      <w:pPr>
+        <w:pStyle w:val="Heading2"/>
+      </w:pPr>
+      <w:r>
+        <w:t>Use My Address Book</w:t>
+      </w:r>
+    </w:p>
+    <w:p>
+      <w:r>
+        <w:rPr>
+          <w:b w:val="0"/>
+        </w:rPr>
+      </w:r>
+      <w:r>
+        <w:rPr>
+          <w:b/>
+        </w:rPr>
+        <w:t>All saved</w:t>
+      </w:r>
+      <w:r>
+        <w:rPr>
+          <w:b w:val="0"/>
+        </w:rPr>
+        <w:t xml:space="preserve"> combines your submitted homes with places you intentionally saved. Favorites, Want to Visit and Visited provide focused collections. Submitted records, recent views, pending submissions, saved searches and tour progress have their own destinations.</w:t>
+      </w:r>
+    </w:p>
+    <w:p>
+      <w:r>
+        <w:rPr>
+          <w:b w:val="0"/>
+        </w:rPr>
+        <w:t>Favorite and visit state are independent. Use Unfavorite to remove a favorite. Change the visit selector to Visited after a visit, or choose Not marked to clear it. On the web, visit changes save automatically and report success or failure. Discord house and tour-stop cards expose reversible marks and Add Comment directly.</w:t>
+      </w:r>
+    </w:p>
+    <w:p>
+      <w:pPr>
+        <w:pStyle w:val="Heading2"/>
+      </w:pPr>
+      <w:r>
+        <w:t>Search and keep filters</w:t>
+      </w:r>
+    </w:p>
+    <w:p>
+      <w:r>
+        <w:rPr>
+          <w:b w:val="0"/>
+        </w:rPr>
+        <w:t>Search Houses supports quick text and visibility filters, with cards or a compact list. Advanced Search adds tags, zone, style, classification and multiple values. Save useful criteria under a name rather than bookmarking a fixed set of record IDs; each run checks current access again.</w:t>
+      </w:r>
+    </w:p>
+    <w:p>
+      <w:r>
+        <w:rPr>
+          <w:b w:val="0"/>
+        </w:rPr>
+        <w:t>Numbered pages and Jump to page preserve filters. A stale page link returns to an available page. Saved Search Run, Rename, Delete and Cancel retain the originating list page, including a results-to-house round trip. Deleting its final item returns to an earlier page if necessary.</w:t>
+      </w:r>
+    </w:p>
+    <w:p>
+      <w:pPr>
+        <w:pStyle w:val="Heading2"/>
+      </w:pPr>
+      <w:r>
+        <w:t>Leave a comment</w:t>
+      </w:r>
+    </w:p>
+    <w:p>
+      <w:r>
+        <w:rPr>
+          <w:b w:val="0"/>
+        </w:rPr>
+        <w:t>Share a detail you enjoyed, an observation or a thank-you. The author and date appear above each comment. Discord's newest-first reader has two comments per page, navigation and a direct page jump. Add Comment from a house or tour-stop card returns to that same card; adding from the reader returns to its newest page.</w:t>
+      </w:r>
+    </w:p>
+    <w:p>
+      <w:r>
+        <w:rPr>
+          <w:b w:val="0"/>
+        </w:rPr>
+        <w:t>Comments belong to an ESO destination in one environment. Matching registrations of that owner and official house share their comment history. Current house or Share Pass access is checked before reading or submitting.</w:t>
+      </w:r>
+    </w:p>
+    <w:p>
+      <w:pPr>
+        <w:pStyle w:val="Heading2"/>
+      </w:pPr>
+      <w:r>
+        <w:t>Use the house gallery</w:t>
+      </w:r>
+    </w:p>
+    <w:p>
+      <w:r>
+        <w:rPr>
+          <w:b w:val="0"/>
+        </w:rPr>
+        <w:t xml:space="preserve">A registration can hold </w:t>
+      </w:r>
+      <w:r>
+        <w:rPr>
+          <w:b/>
+        </w:rPr>
+        <w:t>up to eight still PNG, JPEG or WebP screenshots</w:t>
+      </w:r>
+      <w:r>
+        <w:rPr>
+          <w:b w:val="0"/>
+        </w:rPr>
+        <w:t xml:space="preserve">, up to </w:t>
+      </w:r>
+      <w:r>
+        <w:rPr>
+          <w:b/>
+        </w:rPr>
+        <w:t>5 MB each</w:t>
+      </w:r>
+      <w:r>
+        <w:rPr>
+          <w:b w:val="0"/>
+        </w:rPr>
+        <w:t>. Editors upload an image with an optional caption, choose a cover, edit captions or remove images. With no image, the house stays readable as a text card; no fake screenshot is substituted.</w:t>
+      </w:r>
+    </w:p>
+    <w:p>
+      <w:r>
+        <w:rPr>
+          <w:b w:val="0"/>
+        </w:rPr>
+        <w:t xml:space="preserve">On the web, find </w:t>
+      </w:r>
+      <w:r>
+        <w:rPr>
+          <w:b/>
+        </w:rPr>
+        <w:t>House screenshots</w:t>
+      </w:r>
+      <w:r>
+        <w:rPr>
+          <w:b w:val="0"/>
+        </w:rPr>
+        <w:t xml:space="preserve"> on the house page. Drag a file onto the upload area or choose one, review the preview and upload. Progress and errors appear in the form. Click an image to enlarge it; use Previous or Next, arrow keys, or Escape to close.</w:t>
+      </w:r>
+    </w:p>
+    <w:p>
+      <w:r>
+        <w:rPr>
+          <w:b w:val="0"/>
+        </w:rPr>
+        <w:t xml:space="preserve">In Discord, choose </w:t>
+      </w:r>
+      <w:r>
+        <w:rPr>
+          <w:b/>
+        </w:rPr>
+        <w:t>Screenshots</w:t>
+      </w:r>
+      <w:r>
+        <w:rPr>
+          <w:b w:val="0"/>
+        </w:rPr>
+        <w:t xml:space="preserve"> to browse. To upload, use /hearth or /housing with the </w:t>
+      </w:r>
+      <w:r>
+        <w:rPr>
+          <w:b/>
+        </w:rPr>
+        <w:t>house</w:t>
+      </w:r>
+      <w:r>
+        <w:rPr>
+          <w:b w:val="0"/>
+        </w:rPr>
+        <w:t xml:space="preserve"> option, attach a </w:t>
+      </w:r>
+      <w:r>
+        <w:rPr>
+          <w:b/>
+        </w:rPr>
+        <w:t>screenshot</w:t>
+      </w:r>
+      <w:r>
+        <w:rPr>
+          <w:b w:val="0"/>
+        </w:rPr>
+        <w:t xml:space="preserve"> and optionally enter a </w:t>
+      </w:r>
+      <w:r>
+        <w:rPr>
+          <w:b/>
+        </w:rPr>
+        <w:t>caption</w:t>
+      </w:r>
+      <w:r>
+        <w:rPr>
+          <w:b w:val="0"/>
+        </w:rPr>
+        <w:t>. Search the house option by nickname, official name or ESO owner. Existing edit permissions control uploads and gallery changes. Private image URLs remain creator-only. Copying a registration does not copy its gallery automatically.</w:t>
+      </w:r>
+    </w:p>
+    <w:p>
+      <w:r>
+        <w:br w:type="page"/>
+      </w:r>
+    </w:p>
+    <w:p>
+      <w:pPr>
+        <w:pStyle w:val="Heading1"/>
+      </w:pPr>
+      <w:r>
+        <w:t>Build and edit a housing tour</w:t>
+      </w:r>
+    </w:p>
+    <w:p>
+      <w:pPr>
+        <w:pStyle w:val="Heading2"/>
+      </w:pPr>
+      <w:r>
+        <w:t>Arrange the route on the web</w:t>
+      </w:r>
+    </w:p>
+    <w:p>
+      <w:pPr>
+        <w:numPr>
+          <w:ilvl w:val="0"/>
+          <w:numId w:val="11"/>
+        </w:numPr>
+      </w:pPr>
+      <w:r>
+        <w:rPr>
+          <w:b w:val="0"/>
+        </w:rPr>
+        <w:t xml:space="preserve">Open </w:t>
+      </w:r>
+      <w:r>
+        <w:rPr>
+          <w:b/>
+        </w:rPr>
+        <w:t>Housing Tours</w:t>
+      </w:r>
+      <w:r>
+        <w:rPr>
+          <w:b w:val="0"/>
+        </w:rPr>
+        <w:t xml:space="preserve"> and choose </w:t>
+      </w:r>
+      <w:r>
+        <w:rPr>
+          <w:b/>
+        </w:rPr>
+        <w:t>Create tour</w:t>
+      </w:r>
+      <w:r>
+        <w:rPr>
+          <w:b w:val="0"/>
+        </w:rPr>
+        <w:t xml:space="preserve">, or open a route you may edit and choose </w:t>
+      </w:r>
+      <w:r>
+        <w:rPr>
+          <w:b/>
+        </w:rPr>
+        <w:t>Add houses</w:t>
+      </w:r>
+      <w:r>
+        <w:rPr>
+          <w:b w:val="0"/>
+        </w:rPr>
+        <w:t xml:space="preserve"> or </w:t>
+      </w:r>
+      <w:r>
+        <w:rPr>
+          <w:b/>
+        </w:rPr>
+        <w:t>Edit tour</w:t>
+      </w:r>
+      <w:r>
+        <w:rPr>
+          <w:b w:val="0"/>
+        </w:rPr>
+        <w:t>. Tour lists are alphabetical.</w:t>
+      </w:r>
+    </w:p>
+    <w:p>
+      <w:pPr>
+        <w:numPr>
+          <w:ilvl w:val="0"/>
+          <w:numId w:val="11"/>
+        </w:numPr>
+      </w:pPr>
+      <w:r>
+        <w:rPr>
+          <w:b w:val="0"/>
+        </w:rPr>
+        <w:t>Enter a name, description and visibility. Explain the route's theme and what visitors can expect.</w:t>
+      </w:r>
+    </w:p>
+    <w:p>
+      <w:pPr>
+        <w:numPr>
+          <w:ilvl w:val="0"/>
+          <w:numId w:val="11"/>
+        </w:numPr>
+      </w:pPr>
+      <w:r>
+        <w:rPr>
+          <w:b w:val="0"/>
+        </w:rPr>
+        <w:t xml:space="preserve">In </w:t>
+      </w:r>
+      <w:r>
+        <w:rPr>
+          <w:b/>
+        </w:rPr>
+        <w:t>Find and add houses</w:t>
+      </w:r>
+      <w:r>
+        <w:rPr>
+          <w:b w:val="0"/>
+        </w:rPr>
+        <w:t>, filter by house or ESO owner, tags and visibility. More filters offers zone, style, house type and classification. Filters apply while typing; Enter in a filter does not submit the tour.</w:t>
+      </w:r>
+    </w:p>
+    <w:p>
+      <w:pPr>
+        <w:numPr>
+          <w:ilvl w:val="0"/>
+          <w:numId w:val="11"/>
+        </w:numPr>
+      </w:pPr>
+      <w:r>
+        <w:rPr>
+          <w:b w:val="0"/>
+        </w:rPr>
+        <w:t>Check houses to add them to the draft. Filtering preserves selected stops. Preview house opens another tab so the draft remains available.</w:t>
+      </w:r>
+    </w:p>
+    <w:p>
+      <w:pPr>
+        <w:numPr>
+          <w:ilvl w:val="0"/>
+          <w:numId w:val="11"/>
+        </w:numPr>
+      </w:pPr>
+      <w:r>
+        <w:rPr>
+          <w:b w:val="0"/>
+        </w:rPr>
+        <w:t xml:space="preserve">Enter </w:t>
+      </w:r>
+      <w:r>
+        <w:rPr>
+          <w:b/>
+        </w:rPr>
+        <w:t>Tour-specific notes</w:t>
+      </w:r>
+      <w:r>
+        <w:rPr>
+          <w:b w:val="0"/>
+        </w:rPr>
+        <w:t xml:space="preserve"> beside a stop. Point out a room, puzzle, viewpoint or feature relevant to this route. Drag stops or use the up/down buttons, then choose </w:t>
+      </w:r>
+      <w:r>
+        <w:rPr>
+          <w:b/>
+        </w:rPr>
+        <w:t>Save tour</w:t>
+      </w:r>
+      <w:r>
+        <w:rPr>
+          <w:b w:val="0"/>
+        </w:rPr>
+        <w:t>.</w:t>
+      </w:r>
+    </w:p>
+    <w:p>
+      <w:r>
+        <w:rPr>
+          <w:b w:val="0"/>
+        </w:rPr>
+        <w:t>A save supports at most 250 stops. Selection order becomes stop order. Removing a stop from the draft does not delete its house registration. Changes remain a draft until saved; leaving an edited route triggers a browser warning.</w:t>
+      </w:r>
+    </w:p>
+    <w:p>
+      <w:pPr>
+        <w:pStyle w:val="Heading2"/>
+      </w:pPr>
+      <w:r>
+        <w:t>Build from Discord</w:t>
+      </w:r>
+    </w:p>
+    <w:p>
+      <w:r>
+        <w:rPr>
+          <w:b w:val="0"/>
+        </w:rPr>
+        <w:t xml:space="preserve">Create a tour or open one you can manage, then choose </w:t>
+      </w:r>
+      <w:r>
+        <w:rPr>
+          <w:b/>
+        </w:rPr>
+        <w:t>Add House</w:t>
+      </w:r>
+      <w:r>
+        <w:rPr>
+          <w:b w:val="0"/>
+        </w:rPr>
+        <w:t>. The filter modal groups house or owner text, tags, visibility, zone and style or classification. The picker omits destinations already on the route and duplicate registration choices.</w:t>
+      </w:r>
+    </w:p>
+    <w:p>
+      <w:r>
+        <w:rPr>
+          <w:b w:val="0"/>
+        </w:rPr>
+        <w:t xml:space="preserve">Selecting a house adds it immediately. The confirmation offers </w:t>
+      </w:r>
+      <w:r>
+        <w:rPr>
+          <w:b/>
+        </w:rPr>
+        <w:t>Add Tour Notes</w:t>
+      </w:r>
+      <w:r>
+        <w:rPr>
+          <w:b w:val="0"/>
+        </w:rPr>
+        <w:t xml:space="preserve">, </w:t>
+      </w:r>
+      <w:r>
+        <w:rPr>
+          <w:b/>
+        </w:rPr>
+        <w:t>Add Another House</w:t>
+      </w:r>
+      <w:r>
+        <w:rPr>
+          <w:b w:val="0"/>
+        </w:rPr>
+        <w:t xml:space="preserve"> and </w:t>
+      </w:r>
+      <w:r>
+        <w:rPr>
+          <w:b/>
+        </w:rPr>
+        <w:t>View Tour</w:t>
+      </w:r>
+      <w:r>
+        <w:rPr>
+          <w:b w:val="0"/>
+        </w:rPr>
+        <w:t>. Add Another House retains the filter; saving notes returns to the same confirmation. Manage Stops provides ordering and stop-note editing.</w:t>
+      </w:r>
+    </w:p>
+    <w:p>
+      <w:r>
+        <w:rPr>
+          <w:b w:val="0"/>
+        </w:rPr>
+        <w:t>When adding several saved-search results, review their numbered order before confirming. Discord does not provide reliable click history within one multiselect submission; use the ordering controls whenever the displayed sequence needs adjustment.</w:t>
+      </w:r>
+    </w:p>
+    <w:p>
+      <w:pPr>
+        <w:pStyle w:val="Heading2"/>
+      </w:pPr>
+      <w:r>
+        <w:t>Recover after a failed save</w:t>
+      </w:r>
+    </w:p>
+    <w:p>
+      <w:r>
+        <w:rPr>
+          <w:b w:val="0"/>
+        </w:rPr>
+        <w:t>Validation errors keep the web editor open with the submitted name, description, visibility, stop order and notes. An inaccessible selected house becomes a generic removable placeholder rather than exposing its details. The recovered draft remains marked unsaved.</w:t>
+      </w:r>
+    </w:p>
+    <w:p>
+      <w:r>
+        <w:rPr>
+          <w:b w:val="0"/>
+        </w:rPr>
+        <w:t xml:space="preserve">If another person changed the tour, the old version cannot overwrite the new one. </w:t>
+      </w:r>
+      <w:r>
+        <w:rPr>
+          <w:b/>
+        </w:rPr>
+        <w:t>Open latest editor</w:t>
+      </w:r>
+      <w:r>
+        <w:rPr>
+          <w:b w:val="0"/>
+        </w:rPr>
+        <w:t xml:space="preserve"> opens a fresh editor in another tab. Compare and reapply your intended changes there; the stale editor's Save button remains disabled. Existing saved data is not replaced by an automatic merge.</w:t>
+      </w:r>
+    </w:p>
+    <w:p>
+      <w:r>
+        <w:br w:type="page"/>
+      </w:r>
+    </w:p>
+    <w:p>
+      <w:pPr>
+        <w:pStyle w:val="Heading1"/>
+      </w:pPr>
+      <w:r>
+        <w:t>Follow tours and share creations</w:t>
+      </w:r>
+    </w:p>
+    <w:p>
+      <w:pPr>
+        <w:pStyle w:val="Heading2"/>
+      </w:pPr>
+      <w:r>
+        <w:t>Follow a self paced route</w:t>
+      </w:r>
+    </w:p>
+    <w:p>
+      <w:r>
+        <w:rPr>
+          <w:b w:val="0"/>
+        </w:rPr>
+        <w:t xml:space="preserve">Open a tour and choose </w:t>
+      </w:r>
+      <w:r>
+        <w:rPr>
+          <w:b/>
+        </w:rPr>
+        <w:t>Open self-paced tour</w:t>
+      </w:r>
+      <w:r>
+        <w:rPr>
+          <w:b w:val="0"/>
+        </w:rPr>
+        <w:t xml:space="preserve"> on the web. Start or resume your own progress, view the current house and its visit commands, and complete stops at your own pace. Screenshots appear when the registration has them. Previous/Next controls and progress history help you return later; Restart begins a completed route again.</w:t>
+      </w:r>
+    </w:p>
+    <w:p>
+      <w:r>
+        <w:rPr>
+          <w:b w:val="0"/>
+        </w:rPr>
+        <w:t>Discord also supports Self Paced tours. The current stop includes house facts, visit commands and route-specific notes. Personal marks and direct comments do not advance your route. Expanded details and the originating progress-list page remain available when returning from comments or the tour list.</w:t>
+      </w:r>
+    </w:p>
+    <w:p>
+      <w:pPr>
+        <w:pStyle w:val="Heading2"/>
+      </w:pPr>
+      <w:r>
+        <w:t>Run a shared Discord tour</w:t>
+      </w:r>
+    </w:p>
+    <w:p>
+      <w:r>
+        <w:rPr>
+          <w:b w:val="0"/>
+        </w:rPr>
+        <w:t>A Shared session posts the current stop in a channel. Only its initiating leader can navigate or end it. Shared-tour permissions and source-server restrictions still apply. The web self-paced player is independent of a leader-controlled Discord session.</w:t>
+      </w:r>
+    </w:p>
+    <w:p>
+      <w:pPr>
+        <w:pStyle w:val="Heading2"/>
+      </w:pPr>
+      <w:r>
+        <w:t>Share a house or tour</w:t>
+      </w:r>
+    </w:p>
+    <w:p>
+      <w:r>
+        <w:rPr>
+          <w:b w:val="0"/>
+        </w:rPr>
+        <w:t xml:space="preserve">Use </w:t>
+      </w:r>
+      <w:r>
+        <w:rPr>
+          <w:b/>
+        </w:rPr>
+        <w:t>Share house</w:t>
+      </w:r>
+      <w:r>
+        <w:rPr>
+          <w:b w:val="0"/>
+        </w:rPr>
+        <w:t xml:space="preserve"> or </w:t>
+      </w:r>
+      <w:r>
+        <w:rPr>
+          <w:b/>
+        </w:rPr>
+        <w:t>Share tour</w:t>
+      </w:r>
+      <w:r>
+        <w:rPr>
+          <w:b w:val="0"/>
+        </w:rPr>
+        <w:t xml:space="preserve"> to create or post a Share Pass. Choose an accessible channel and, if offered, an optional thread, then confirm the destination. A pass is limited to its configured environment and can be revoked. Copy and editing actions appear only where the applicable access rules permit them.</w:t>
+      </w:r>
+    </w:p>
+    <w:p>
+      <w:r>
+        <w:rPr>
+          <w:b w:val="0"/>
+        </w:rPr>
+        <w:t>A Private Tour Pass gives each visitor an independent private run. Revocation closes pass-derived access and blocks stale viewing, navigation and comment submissions. A pass never grants general access to the creator's other Private records.</w:t>
+      </w:r>
+    </w:p>
+    <w:p>
+      <w:pPr>
+        <w:pStyle w:val="Heading2"/>
+      </w:pPr>
+      <w:r>
+        <w:t>Discover Random and Featured houses</w:t>
+      </w:r>
+    </w:p>
+    <w:p>
+      <w:r>
+        <w:rPr>
+          <w:b w:val="0"/>
+        </w:rPr>
+      </w:r>
+      <w:r>
+        <w:rPr>
+          <w:b/>
+        </w:rPr>
+        <w:t>Random House</w:t>
+      </w:r>
+      <w:r>
+        <w:rPr>
+          <w:b w:val="0"/>
+        </w:rPr>
+        <w:t xml:space="preserve"> gives an accessible registered destination with its official name, ESO owner, zone, classification, available tags and description, visit commands and recent comment context. Choose </w:t>
+      </w:r>
+      <w:r>
+        <w:rPr>
+          <w:b/>
+        </w:rPr>
+        <w:t>More details</w:t>
+      </w:r>
+      <w:r>
+        <w:rPr>
+          <w:b w:val="0"/>
+        </w:rPr>
+        <w:t xml:space="preserve"> for the complete record. In Discord, another pick avoids the previous destination when alternatives exist; web picks may repeat.</w:t>
+      </w:r>
+    </w:p>
+    <w:p>
+      <w:r>
+        <w:rPr>
+          <w:b w:val="0"/>
+        </w:rPr>
+      </w:r>
+      <w:r>
+        <w:rPr>
+          <w:b/>
+        </w:rPr>
+        <w:t>Featured Housing</w:t>
+      </w:r>
+      <w:r>
+        <w:rPr>
+          <w:b w:val="0"/>
+        </w:rPr>
+        <w:t xml:space="preserve"> displays richer house cards and curated tours. House selections rotate weekly. Favorites and recorded visit interest modestly influence selection while variety and randomness remain; popularity does not determine every result. Previous-cycle destinations are avoided when enough alternatives exist. Each featured category is capped at four entries.</w:t>
+      </w:r>
+    </w:p>
+    <w:p>
+      <w:r>
+        <w:rPr>
+          <w:b w:val="0"/>
+        </w:rPr>
+        <w:t>HearthBound records app actions, not actual movement inside ESO. Marking Visited is a member's saved state, not a measured in-game visit.</w:t>
+      </w:r>
+    </w:p>
+    <w:p>
+      <w:r>
+        <w:br w:type="page"/>
+      </w:r>
+    </w:p>
+    <w:p>
+      <w:pPr>
+        <w:pStyle w:val="Heading1"/>
+      </w:pPr>
+      <w:r>
+        <w:t>Access and server administration</w:t>
+      </w:r>
+    </w:p>
+    <w:p>
+      <w:pPr>
+        <w:pStyle w:val="Heading2"/>
+      </w:pPr>
+      <w:r>
+        <w:t>Understand your HearthBound access</w:t>
       </w:r>
     </w:p>
     <w:tbl>
@@ -426,263 +1376,283 @@
         <w:tblW w:type="auto" w:w="0"/>
         <w:tblLayout w:type="fixed"/>
         <w:tblLook w:firstColumn="1" w:firstRow="1" w:lastColumn="0" w:lastRow="0" w:noHBand="0" w:noVBand="1" w:val="04A0"/>
+        <w:tblBorders>
+          <w:top w:val="single" w:sz="4" w:color="D9D9D9"/>
+          <w:left w:val="single" w:sz="4" w:color="D9D9D9"/>
+          <w:bottom w:val="single" w:sz="4" w:color="D9D9D9"/>
+          <w:right w:val="single" w:sz="4" w:color="D9D9D9"/>
+          <w:insideH w:val="single" w:sz="4" w:color="D9D9D9"/>
+          <w:insideV w:val="single" w:sz="4" w:color="D9D9D9"/>
+        </w:tblBorders>
       </w:tblPr>
       <w:tblGrid>
-        <w:gridCol w:w="1656"/>
-        <w:gridCol w:w="8424"/>
+        <w:gridCol w:w="1944"/>
+        <w:gridCol w:w="7992"/>
       </w:tblGrid>
       <w:tr>
+        <w:trPr>
+          <w:cantSplit/>
+          <w:tblHeader/>
+        </w:trPr>
         <w:tc>
           <w:tcPr>
-            <w:tcW w:type="dxa" w:w="1656"/>
+            <w:tcW w:type="dxa" w:w="1944"/>
             <w:vAlign w:val="center"/>
-            <w:tcBorders>
-              <w:top w:val="single" w:sz="4" w:color="D9D9D9"/>
-              <w:left w:val="single" w:sz="4" w:color="D9D9D9"/>
-              <w:bottom w:val="single" w:sz="4" w:color="D9D9D9"/>
-              <w:right w:val="single" w:sz="4" w:color="D9D9D9"/>
-            </w:tcBorders>
-            <w:shd w:fill="E7ECF0"/>
+            <w:shd w:fill="17324D"/>
             <w:tcMar>
-              <w:top w:w="90" w:type="dxa"/>
-              <w:left w:w="90" w:type="dxa"/>
-              <w:bottom w:w="90" w:type="dxa"/>
-              <w:right w:w="90" w:type="dxa"/>
+              <w:top w:w="100" w:type="dxa"/>
+              <w:left w:w="100" w:type="dxa"/>
+              <w:bottom w:w="100" w:type="dxa"/>
+              <w:right w:w="100" w:type="dxa"/>
             </w:tcMar>
           </w:tcPr>
           <w:p>
             <w:pPr>
-              <w:spacing w:after="60"/>
+              <w:spacing w:after="40" w:before="40"/>
             </w:pPr>
             <w:r>
               <w:rPr>
                 <w:b/>
-                <w:sz w:val="19"/>
+                <w:color w:val="FFFFFF"/>
               </w:rPr>
-              <w:t>Visibility</w:t>
+              <w:t>Role</w:t>
             </w:r>
           </w:p>
         </w:tc>
         <w:tc>
           <w:tcPr>
-            <w:tcW w:type="dxa" w:w="8424"/>
+            <w:tcW w:type="dxa" w:w="7992"/>
             <w:vAlign w:val="center"/>
-            <w:tcBorders>
-              <w:top w:val="single" w:sz="4" w:color="D9D9D9"/>
-              <w:left w:val="single" w:sz="4" w:color="D9D9D9"/>
-              <w:bottom w:val="single" w:sz="4" w:color="D9D9D9"/>
-              <w:right w:val="single" w:sz="4" w:color="D9D9D9"/>
-            </w:tcBorders>
-            <w:shd w:fill="E7ECF0"/>
+            <w:shd w:fill="17324D"/>
             <w:tcMar>
-              <w:top w:w="90" w:type="dxa"/>
-              <w:left w:w="90" w:type="dxa"/>
-              <w:bottom w:w="90" w:type="dxa"/>
-              <w:right w:w="90" w:type="dxa"/>
+              <w:top w:w="100" w:type="dxa"/>
+              <w:left w:w="100" w:type="dxa"/>
+              <w:bottom w:w="100" w:type="dxa"/>
+              <w:right w:w="100" w:type="dxa"/>
             </w:tcMar>
           </w:tcPr>
           <w:p>
             <w:pPr>
-              <w:spacing w:after="60"/>
+              <w:spacing w:after="40" w:before="40"/>
             </w:pPr>
             <w:r>
               <w:rPr>
                 <w:b/>
-                <w:sz w:val="19"/>
+                <w:color w:val="FFFFFF"/>
               </w:rPr>
-              <w:t>Who normally sees it</w:t>
+              <w:t>Scope and authority</w:t>
             </w:r>
           </w:p>
         </w:tc>
       </w:tr>
       <w:tr>
+        <w:trPr>
+          <w:cantSplit/>
+        </w:trPr>
         <w:tc>
           <w:tcPr>
-            <w:tcW w:type="dxa" w:w="1656"/>
+            <w:tcW w:type="dxa" w:w="1944"/>
             <w:vAlign w:val="center"/>
-            <w:tcBorders>
-              <w:top w:val="single" w:sz="4" w:color="D9D9D9"/>
-              <w:left w:val="single" w:sz="4" w:color="D9D9D9"/>
-              <w:bottom w:val="single" w:sz="4" w:color="D9D9D9"/>
-              <w:right w:val="single" w:sz="4" w:color="D9D9D9"/>
-            </w:tcBorders>
-            <w:shd w:fill="FFFFFF"/>
+            <w:shd w:fill="F2F5FA"/>
             <w:tcMar>
-              <w:top w:w="90" w:type="dxa"/>
-              <w:left w:w="90" w:type="dxa"/>
-              <w:bottom w:w="90" w:type="dxa"/>
-              <w:right w:w="90" w:type="dxa"/>
+              <w:top w:w="100" w:type="dxa"/>
+              <w:left w:w="100" w:type="dxa"/>
+              <w:bottom w:w="100" w:type="dxa"/>
+              <w:right w:w="100" w:type="dxa"/>
             </w:tcMar>
           </w:tcPr>
           <w:p>
             <w:pPr>
-              <w:spacing w:after="60"/>
+              <w:spacing w:after="40" w:before="40"/>
             </w:pPr>
             <w:r>
               <w:rPr>
                 <w:b w:val="0"/>
-                <w:sz w:val="19"/>
               </w:rPr>
-              <w:t>Private</w:t>
+              <w:t>Member</w:t>
             </w:r>
           </w:p>
         </w:tc>
         <w:tc>
           <w:tcPr>
-            <w:tcW w:type="dxa" w:w="8424"/>
+            <w:tcW w:type="dxa" w:w="7992"/>
             <w:vAlign w:val="center"/>
-            <w:tcBorders>
-              <w:top w:val="single" w:sz="4" w:color="D9D9D9"/>
-              <w:left w:val="single" w:sz="4" w:color="D9D9D9"/>
-              <w:bottom w:val="single" w:sz="4" w:color="D9D9D9"/>
-              <w:right w:val="single" w:sz="4" w:color="D9D9D9"/>
-            </w:tcBorders>
-            <w:shd w:fill="FFFFFF"/>
+            <w:shd w:fill="F2F5FA"/>
             <w:tcMar>
-              <w:top w:w="90" w:type="dxa"/>
-              <w:left w:w="90" w:type="dxa"/>
-              <w:bottom w:w="90" w:type="dxa"/>
-              <w:right w:w="90" w:type="dxa"/>
+              <w:top w:w="100" w:type="dxa"/>
+              <w:left w:w="100" w:type="dxa"/>
+              <w:bottom w:w="100" w:type="dxa"/>
+              <w:right w:w="100" w:type="dxa"/>
             </w:tcMar>
           </w:tcPr>
           <w:p>
             <w:pPr>
-              <w:spacing w:after="60"/>
+              <w:spacing w:after="40" w:before="40"/>
             </w:pPr>
             <w:r>
               <w:rPr>
                 <w:b w:val="0"/>
-                <w:sz w:val="19"/>
               </w:rPr>
-              <w:t>The creator only, unless they explicitly issue a Share Pass.</w:t>
+              <w:t>Browse accessible records and manage their own houses, tours and saved places.</w:t>
             </w:r>
           </w:p>
         </w:tc>
       </w:tr>
       <w:tr>
+        <w:trPr>
+          <w:cantSplit/>
+        </w:trPr>
         <w:tc>
           <w:tcPr>
-            <w:tcW w:type="dxa" w:w="1656"/>
+            <w:tcW w:type="dxa" w:w="1944"/>
             <w:vAlign w:val="center"/>
-            <w:tcBorders>
-              <w:top w:val="single" w:sz="4" w:color="D9D9D9"/>
-              <w:left w:val="single" w:sz="4" w:color="D9D9D9"/>
-              <w:bottom w:val="single" w:sz="4" w:color="D9D9D9"/>
-              <w:right w:val="single" w:sz="4" w:color="D9D9D9"/>
-            </w:tcBorders>
-            <w:shd w:fill="F7F8FA"/>
+            <w:shd w:fill="FFFFFF"/>
             <w:tcMar>
-              <w:top w:w="90" w:type="dxa"/>
-              <w:left w:w="90" w:type="dxa"/>
-              <w:bottom w:w="90" w:type="dxa"/>
-              <w:right w:w="90" w:type="dxa"/>
+              <w:top w:w="100" w:type="dxa"/>
+              <w:left w:w="100" w:type="dxa"/>
+              <w:bottom w:w="100" w:type="dxa"/>
+              <w:right w:w="100" w:type="dxa"/>
             </w:tcMar>
           </w:tcPr>
           <w:p>
             <w:pPr>
-              <w:spacing w:after="60"/>
+              <w:spacing w:after="40" w:before="40"/>
             </w:pPr>
             <w:r>
               <w:rPr>
                 <w:b w:val="0"/>
-                <w:sz w:val="19"/>
               </w:rPr>
-              <w:t>Server</w:t>
+              <w:t>Server Administrator</w:t>
             </w:r>
           </w:p>
         </w:tc>
         <w:tc>
           <w:tcPr>
-            <w:tcW w:type="dxa" w:w="8424"/>
+            <w:tcW w:type="dxa" w:w="7992"/>
             <w:vAlign w:val="center"/>
-            <w:tcBorders>
-              <w:top w:val="single" w:sz="4" w:color="D9D9D9"/>
-              <w:left w:val="single" w:sz="4" w:color="D9D9D9"/>
-              <w:bottom w:val="single" w:sz="4" w:color="D9D9D9"/>
-              <w:right w:val="single" w:sz="4" w:color="D9D9D9"/>
-            </w:tcBorders>
-            <w:shd w:fill="F7F8FA"/>
+            <w:shd w:fill="FFFFFF"/>
             <w:tcMar>
-              <w:top w:w="90" w:type="dxa"/>
-              <w:left w:w="90" w:type="dxa"/>
-              <w:bottom w:w="90" w:type="dxa"/>
-              <w:right w:w="90" w:type="dxa"/>
+              <w:top w:w="100" w:type="dxa"/>
+              <w:left w:w="100" w:type="dxa"/>
+              <w:bottom w:w="100" w:type="dxa"/>
+              <w:right w:w="100" w:type="dxa"/>
             </w:tcMar>
           </w:tcPr>
           <w:p>
             <w:pPr>
-              <w:spacing w:after="60"/>
+              <w:spacing w:after="40" w:before="40"/>
             </w:pPr>
             <w:r>
               <w:rPr>
                 <w:b w:val="0"/>
-                <w:sz w:val="19"/>
               </w:rPr>
-              <w:t>Members of its source Discord server in the matching ESO environment.</w:t>
+              <w:t>Manage eligible Server houses and tours, settings, requests and shared review work for that server.</w:t>
             </w:r>
           </w:p>
         </w:tc>
       </w:tr>
       <w:tr>
+        <w:trPr>
+          <w:cantSplit/>
+        </w:trPr>
         <w:tc>
           <w:tcPr>
-            <w:tcW w:type="dxa" w:w="1656"/>
+            <w:tcW w:type="dxa" w:w="1944"/>
             <w:vAlign w:val="center"/>
-            <w:tcBorders>
-              <w:top w:val="single" w:sz="4" w:color="D9D9D9"/>
-              <w:left w:val="single" w:sz="4" w:color="D9D9D9"/>
-              <w:bottom w:val="single" w:sz="4" w:color="D9D9D9"/>
-              <w:right w:val="single" w:sz="4" w:color="D9D9D9"/>
-            </w:tcBorders>
-            <w:shd w:fill="FFFFFF"/>
+            <w:shd w:fill="F2F5FA"/>
             <w:tcMar>
-              <w:top w:w="90" w:type="dxa"/>
-              <w:left w:w="90" w:type="dxa"/>
-              <w:bottom w:w="90" w:type="dxa"/>
-              <w:right w:w="90" w:type="dxa"/>
+              <w:top w:w="100" w:type="dxa"/>
+              <w:left w:w="100" w:type="dxa"/>
+              <w:bottom w:w="100" w:type="dxa"/>
+              <w:right w:w="100" w:type="dxa"/>
             </w:tcMar>
           </w:tcPr>
           <w:p>
             <w:pPr>
-              <w:spacing w:after="60"/>
+              <w:spacing w:after="40" w:before="40"/>
             </w:pPr>
             <w:r>
               <w:rPr>
                 <w:b w:val="0"/>
-                <w:sz w:val="19"/>
               </w:rPr>
-              <w:t>Global</w:t>
+              <w:t>Global Administrator</w:t>
             </w:r>
           </w:p>
         </w:tc>
         <w:tc>
           <w:tcPr>
-            <w:tcW w:type="dxa" w:w="8424"/>
+            <w:tcW w:type="dxa" w:w="7992"/>
             <w:vAlign w:val="center"/>
-            <w:tcBorders>
-              <w:top w:val="single" w:sz="4" w:color="D9D9D9"/>
-              <w:left w:val="single" w:sz="4" w:color="D9D9D9"/>
-              <w:bottom w:val="single" w:sz="4" w:color="D9D9D9"/>
-              <w:right w:val="single" w:sz="4" w:color="D9D9D9"/>
-            </w:tcBorders>
-            <w:shd w:fill="FFFFFF"/>
+            <w:shd w:fill="F2F5FA"/>
             <w:tcMar>
-              <w:top w:w="90" w:type="dxa"/>
-              <w:left w:w="90" w:type="dxa"/>
-              <w:bottom w:w="90" w:type="dxa"/>
-              <w:right w:w="90" w:type="dxa"/>
+              <w:top w:w="100" w:type="dxa"/>
+              <w:left w:w="100" w:type="dxa"/>
+              <w:bottom w:w="100" w:type="dxa"/>
+              <w:right w:w="100" w:type="dxa"/>
             </w:tcMar>
           </w:tcPr>
           <w:p>
             <w:pPr>
-              <w:spacing w:after="60"/>
+              <w:spacing w:after="40" w:before="40"/>
             </w:pPr>
             <w:r>
               <w:rPr>
                 <w:b w:val="0"/>
-                <w:sz w:val="19"/>
               </w:rPr>
-              <w:t>Members using the matching ESO environment across servers.</w:t>
+              <w:t>Manage Global houses and Global or Server tours in the approved ESO environment. This alone does not grant Server-house editing or Server-request approval.</w:t>
+            </w:r>
+          </w:p>
+        </w:tc>
+      </w:tr>
+      <w:tr>
+        <w:trPr>
+          <w:cantSplit/>
+        </w:trPr>
+        <w:tc>
+          <w:tcPr>
+            <w:tcW w:type="dxa" w:w="1944"/>
+            <w:vAlign w:val="center"/>
+            <w:shd w:fill="FFFFFF"/>
+            <w:tcMar>
+              <w:top w:w="100" w:type="dxa"/>
+              <w:left w:w="100" w:type="dxa"/>
+              <w:bottom w:w="100" w:type="dxa"/>
+              <w:right w:w="100" w:type="dxa"/>
+            </w:tcMar>
+          </w:tcPr>
+          <w:p>
+            <w:pPr>
+              <w:spacing w:after="40" w:before="40"/>
+            </w:pPr>
+            <w:r>
+              <w:rPr>
+                <w:b w:val="0"/>
+              </w:rPr>
+              <w:t>Bot Owner</w:t>
+            </w:r>
+          </w:p>
+        </w:tc>
+        <w:tc>
+          <w:tcPr>
+            <w:tcW w:type="dxa" w:w="7992"/>
+            <w:vAlign w:val="center"/>
+            <w:shd w:fill="FFFFFF"/>
+            <w:tcMar>
+              <w:top w:w="100" w:type="dxa"/>
+              <w:left w:w="100" w:type="dxa"/>
+              <w:bottom w:w="100" w:type="dxa"/>
+              <w:right w:w="100" w:type="dxa"/>
+            </w:tcMar>
+          </w:tcPr>
+          <w:p>
+            <w:pPr>
+              <w:spacing w:after="40" w:before="40"/>
+            </w:pPr>
+            <w:r>
+              <w:rPr>
+                <w:b w:val="0"/>
+              </w:rPr>
+              <w:t>All configured HearthBound role capabilities, Global grant management and official catalog tools. Other creators' Private content remains protected.</w:t>
             </w:r>
           </w:p>
         </w:tc>
@@ -695,12 +1665,10 @@
     </w:p>
     <w:p>
       <w:r>
-        <w:t>Choose Register New House, select an official catalog house, enter the ESO owner and choose visibility. Shared submissions follow the server registration policy: they may become active immediately, require review or require an eligible role. Private registrations remain active and personal.</w:t>
-      </w:r>
-    </w:p>
-    <w:p>
-      <w:r>
-        <w:t>If the official house cannot be found, HearthBound shows a clear no-match message. Retry the name or ID. For a newly released house missing from the catalog, ask a configured bot owner to add its official definition; ordinary registration cannot create that definition.</w:t>
+        <w:rPr>
+          <w:b w:val="0"/>
+        </w:rPr>
+        <w:t>Discord's native Administrator permission alone is not HearthBound administration. Configured roles and individual grants can both provide Server access. Removing one individual grant does not remove access supplied by a role.</w:t>
       </w:r>
     </w:p>
     <w:p>
@@ -708,17 +1676,23 @@
         <w:pStyle w:val="Heading2"/>
       </w:pPr>
       <w:r>
-        <w:t>Add the registration to a tour</w:t>
+        <w:t>Set up a newly connected server</w:t>
       </w:r>
     </w:p>
     <w:p>
       <w:r>
-        <w:t>After an active registration is saved, use Create tour with this house or Add to your tour on the web. Discord offers Add to a Tour with an eligible existing tour or Create New Tour. Canceling this follow-up leaves the house saved. Pending submissions must be approved before tour addition.</w:t>
+        <w:rPr>
+          <w:b w:val="0"/>
+        </w:rPr>
+        <w:t>Choose the server's ESO environment on first use. If no Server staff role or individual administrator grant exists, an eligible Discord server owner, member with Manage Server permission, or configured bot owner can explicitly complete first-administrator setup. Empty settings never grant general editing automatically.</w:t>
       </w:r>
     </w:p>
     <w:p>
       <w:r>
-        <w:t>Open a house you manage to edit its official catalog selection, ESO owner, nickname, description and tags. My Address Book includes favorites, visit state, recent views, saved searches and personal tour progress on the web. Deletion and visibility changes require a separate impact preview and explicit confirmation.</w:t>
+        <w:rPr>
+          <w:b w:val="0"/>
+        </w:rPr>
+        <w:t>An existing HearthBound Server administrator then configures staff, trusted-submitter and Shared-tour roles and the registration policy. The web role settings use numeric Discord role IDs. Discord role pickers support name search; stored IDs survive role renames. Environment changes require an impact preview and confirmation.</w:t>
       </w:r>
     </w:p>
     <w:p>
@@ -726,17 +1700,51 @@
         <w:pStyle w:val="Heading2"/>
       </w:pPr>
       <w:r>
-        <w:t>Discover something new</w:t>
+        <w:t>Request and review access</w:t>
       </w:r>
     </w:p>
     <w:p>
       <w:r>
-        <w:t>Random House chooses an accessible registered house in the current ESO environment, including your own Private registrations. It excludes other creators’ Private records and non-player catalog homes. Another Random House avoids the previous destination when alternatives exist.</w:t>
+        <w:rPr>
+          <w:b w:val="0"/>
+        </w:rPr>
+        <w:t xml:space="preserve">Use </w:t>
+      </w:r>
+      <w:r>
+        <w:rPr>
+          <w:b/>
+        </w:rPr>
+        <w:t>Support &amp; Access</w:t>
+      </w:r>
+      <w:r>
+        <w:rPr>
+          <w:b w:val="0"/>
+        </w:rPr>
+        <w:t xml:space="preserve"> for Server or Global access requests, feedback and guide downloads. Current HearthBound Server administrators review Server requests for their server. Bot owners manage environment-specific Global requests and grants. Members cannot approve their own requests. Configured approval-only identities retain only their designated approval capability.</w:t>
+      </w:r>
+    </w:p>
+    <w:p>
+      <w:pPr>
+        <w:pStyle w:val="Heading2"/>
+      </w:pPr>
+      <w:r>
+        <w:t>Find the administration tools</w:t>
       </w:r>
     </w:p>
     <w:p>
       <w:r>
-        <w:t>Featured Housing opens curated houses and tours. Eligible featured houses rotate on persisted seven-day cycles. Opening details or comments retains navigation back to the originating list. HearthBound links do not override an ESO owner’s in-game access settings.</w:t>
+        <w:rPr>
+          <w:b w:val="0"/>
+        </w:rPr>
+        <w:t>The web Administration tabs lead through Overview, Pending review, Problem reports, Maintenance, Audit log and Backup &amp; export, with Access &amp; settings alongside. Count cards open the matching work queue. Approve/Reject and report-review controls stay together on their record row; wide tables scroll internally on small screens.</w:t>
+      </w:r>
+    </w:p>
+    <w:p>
+      <w:r>
+        <w:rPr>
+          <w:b w:val="0"/>
+        </w:rPr>
+        <w:t>Audit logs and reports support numbered pages and direct jumps; audit filters persist. Pending review uses Previous/Next because its queue does not expose a total. Exports exclude Private records. A portable JSON export is not a full database backup.</w:t>
       </w:r>
     </w:p>
     <w:p>
@@ -749,7 +1757,7 @@
         <w:pStyle w:val="Heading1"/>
       </w:pPr>
       <w:r>
-        <w:t>Tours and sharing</w:t>
+        <w:t>Catalog and community information</w:t>
       </w:r>
     </w:p>
     <w:p>
@@ -757,294 +1765,63 @@
         <w:pStyle w:val="Heading2"/>
       </w:pPr>
       <w:r>
-        <w:t>Create and arrange a route</w:t>
+        <w:t>Maintain official house definitions</w:t>
       </w:r>
     </w:p>
     <w:p>
       <w:r>
-        <w:t>Housing Tours lists routes alphabetically. Create a tour with a name, description and visibility, then select accessible houses. Arrange the draft by dragging stops or using Move up and Move down. Save tour commits the displayed order; Cancel discards the draft.</w:t>
+        <w:rPr>
+          <w:b w:val="0"/>
+        </w:rPr>
+        <w:t xml:space="preserve">Only configured bot owners use </w:t>
+      </w:r>
+      <w:r>
+        <w:rPr>
+          <w:b/>
+        </w:rPr>
+        <w:t>House Catalog</w:t>
+      </w:r>
+      <w:r>
+        <w:rPr>
+          <w:b w:val="0"/>
+        </w:rPr>
+        <w:t xml:space="preserve"> or the Discord Administration catalog tools. Enter the actual positive in-game house ID and official name. Ordinary registration saves a player's build against that definition; it does not add a new definition.</w:t>
       </w:r>
     </w:p>
     <w:p>
       <w:r>
-        <w:t>The web picker loads all accessible active houses. Name or owner, tag and visibility filters apply immediately; More filters offers zone, style, type and classification. Filtering preserves selected stops and their order. Enter inside the filters does not save the draft. A stale save is rejected; reopen the tour before reapplying edits.</w:t>
+        <w:rPr>
+          <w:b w:val="0"/>
+        </w:rPr>
+        <w:t xml:space="preserve">Search an existing house and choose </w:t>
       </w:r>
-    </w:p>
-    <w:tbl>
-      <w:tblPr>
-        <w:tblW w:type="auto" w:w="0"/>
-        <w:tblLayout w:type="fixed"/>
-        <w:tblLook w:firstColumn="1" w:firstRow="1" w:lastColumn="0" w:lastRow="0" w:noHBand="0" w:noVBand="1" w:val="04A0"/>
-      </w:tblPr>
-      <w:tblGrid>
-        <w:gridCol w:w="1872"/>
-        <w:gridCol w:w="8208"/>
-      </w:tblGrid>
-      <w:tr>
-        <w:tc>
-          <w:tcPr>
-            <w:tcW w:type="dxa" w:w="1872"/>
-            <w:vAlign w:val="center"/>
-            <w:tcBorders>
-              <w:top w:val="single" w:sz="4" w:color="D9D9D9"/>
-              <w:left w:val="single" w:sz="4" w:color="D9D9D9"/>
-              <w:bottom w:val="single" w:sz="4" w:color="D9D9D9"/>
-              <w:right w:val="single" w:sz="4" w:color="D9D9D9"/>
-            </w:tcBorders>
-            <w:shd w:fill="E7ECF0"/>
-            <w:tcMar>
-              <w:top w:w="90" w:type="dxa"/>
-              <w:left w:w="90" w:type="dxa"/>
-              <w:bottom w:w="90" w:type="dxa"/>
-              <w:right w:w="90" w:type="dxa"/>
-            </w:tcMar>
-          </w:tcPr>
-          <w:p>
-            <w:pPr>
-              <w:spacing w:after="60"/>
-            </w:pPr>
-            <w:r>
-              <w:rPr>
-                <w:b/>
-                <w:sz w:val="19"/>
-              </w:rPr>
-              <w:t>Tour visibility</w:t>
-            </w:r>
-          </w:p>
-        </w:tc>
-        <w:tc>
-          <w:tcPr>
-            <w:tcW w:type="dxa" w:w="8208"/>
-            <w:vAlign w:val="center"/>
-            <w:tcBorders>
-              <w:top w:val="single" w:sz="4" w:color="D9D9D9"/>
-              <w:left w:val="single" w:sz="4" w:color="D9D9D9"/>
-              <w:bottom w:val="single" w:sz="4" w:color="D9D9D9"/>
-              <w:right w:val="single" w:sz="4" w:color="D9D9D9"/>
-            </w:tcBorders>
-            <w:shd w:fill="E7ECF0"/>
-            <w:tcMar>
-              <w:top w:w="90" w:type="dxa"/>
-              <w:left w:w="90" w:type="dxa"/>
-              <w:bottom w:w="90" w:type="dxa"/>
-              <w:right w:w="90" w:type="dxa"/>
-            </w:tcMar>
-          </w:tcPr>
-          <w:p>
-            <w:pPr>
-              <w:spacing w:after="60"/>
-            </w:pPr>
-            <w:r>
-              <w:rPr>
-                <w:b/>
-                <w:sz w:val="19"/>
-              </w:rPr>
-              <w:t>Eligible stops</w:t>
-            </w:r>
-          </w:p>
-        </w:tc>
-      </w:tr>
-      <w:tr>
-        <w:tc>
-          <w:tcPr>
-            <w:tcW w:type="dxa" w:w="1872"/>
-            <w:vAlign w:val="center"/>
-            <w:tcBorders>
-              <w:top w:val="single" w:sz="4" w:color="D9D9D9"/>
-              <w:left w:val="single" w:sz="4" w:color="D9D9D9"/>
-              <w:bottom w:val="single" w:sz="4" w:color="D9D9D9"/>
-              <w:right w:val="single" w:sz="4" w:color="D9D9D9"/>
-            </w:tcBorders>
-            <w:shd w:fill="FFFFFF"/>
-            <w:tcMar>
-              <w:top w:w="90" w:type="dxa"/>
-              <w:left w:w="90" w:type="dxa"/>
-              <w:bottom w:w="90" w:type="dxa"/>
-              <w:right w:w="90" w:type="dxa"/>
-            </w:tcMar>
-          </w:tcPr>
-          <w:p>
-            <w:pPr>
-              <w:spacing w:after="60"/>
-            </w:pPr>
-            <w:r>
-              <w:rPr>
-                <w:b w:val="0"/>
-                <w:sz w:val="19"/>
-              </w:rPr>
-              <w:t>Global</w:t>
-            </w:r>
-          </w:p>
-        </w:tc>
-        <w:tc>
-          <w:tcPr>
-            <w:tcW w:type="dxa" w:w="8208"/>
-            <w:vAlign w:val="center"/>
-            <w:tcBorders>
-              <w:top w:val="single" w:sz="4" w:color="D9D9D9"/>
-              <w:left w:val="single" w:sz="4" w:color="D9D9D9"/>
-              <w:bottom w:val="single" w:sz="4" w:color="D9D9D9"/>
-              <w:right w:val="single" w:sz="4" w:color="D9D9D9"/>
-            </w:tcBorders>
-            <w:shd w:fill="FFFFFF"/>
-            <w:tcMar>
-              <w:top w:w="90" w:type="dxa"/>
-              <w:left w:w="90" w:type="dxa"/>
-              <w:bottom w:w="90" w:type="dxa"/>
-              <w:right w:w="90" w:type="dxa"/>
-            </w:tcMar>
-          </w:tcPr>
-          <w:p>
-            <w:pPr>
-              <w:spacing w:after="60"/>
-            </w:pPr>
-            <w:r>
-              <w:rPr>
-                <w:b w:val="0"/>
-                <w:sz w:val="19"/>
-              </w:rPr>
-              <w:t>Global houses in the same ESO environment.</w:t>
-            </w:r>
-          </w:p>
-        </w:tc>
-      </w:tr>
-      <w:tr>
-        <w:tc>
-          <w:tcPr>
-            <w:tcW w:type="dxa" w:w="1872"/>
-            <w:vAlign w:val="center"/>
-            <w:tcBorders>
-              <w:top w:val="single" w:sz="4" w:color="D9D9D9"/>
-              <w:left w:val="single" w:sz="4" w:color="D9D9D9"/>
-              <w:bottom w:val="single" w:sz="4" w:color="D9D9D9"/>
-              <w:right w:val="single" w:sz="4" w:color="D9D9D9"/>
-            </w:tcBorders>
-            <w:shd w:fill="F7F8FA"/>
-            <w:tcMar>
-              <w:top w:w="90" w:type="dxa"/>
-              <w:left w:w="90" w:type="dxa"/>
-              <w:bottom w:w="90" w:type="dxa"/>
-              <w:right w:w="90" w:type="dxa"/>
-            </w:tcMar>
-          </w:tcPr>
-          <w:p>
-            <w:pPr>
-              <w:spacing w:after="60"/>
-            </w:pPr>
-            <w:r>
-              <w:rPr>
-                <w:b w:val="0"/>
-                <w:sz w:val="19"/>
-              </w:rPr>
-              <w:t>Server</w:t>
-            </w:r>
-          </w:p>
-        </w:tc>
-        <w:tc>
-          <w:tcPr>
-            <w:tcW w:type="dxa" w:w="8208"/>
-            <w:vAlign w:val="center"/>
-            <w:tcBorders>
-              <w:top w:val="single" w:sz="4" w:color="D9D9D9"/>
-              <w:left w:val="single" w:sz="4" w:color="D9D9D9"/>
-              <w:bottom w:val="single" w:sz="4" w:color="D9D9D9"/>
-              <w:right w:val="single" w:sz="4" w:color="D9D9D9"/>
-            </w:tcBorders>
-            <w:shd w:fill="F7F8FA"/>
-            <w:tcMar>
-              <w:top w:w="90" w:type="dxa"/>
-              <w:left w:w="90" w:type="dxa"/>
-              <w:bottom w:w="90" w:type="dxa"/>
-              <w:right w:w="90" w:type="dxa"/>
-            </w:tcMar>
-          </w:tcPr>
-          <w:p>
-            <w:pPr>
-              <w:spacing w:after="60"/>
-            </w:pPr>
-            <w:r>
-              <w:rPr>
-                <w:b w:val="0"/>
-                <w:sz w:val="19"/>
-              </w:rPr>
-              <w:t>Global houses and houses from the tour’s source server.</w:t>
-            </w:r>
-          </w:p>
-        </w:tc>
-      </w:tr>
-      <w:tr>
-        <w:tc>
-          <w:tcPr>
-            <w:tcW w:type="dxa" w:w="1872"/>
-            <w:vAlign w:val="center"/>
-            <w:tcBorders>
-              <w:top w:val="single" w:sz="4" w:color="D9D9D9"/>
-              <w:left w:val="single" w:sz="4" w:color="D9D9D9"/>
-              <w:bottom w:val="single" w:sz="4" w:color="D9D9D9"/>
-              <w:right w:val="single" w:sz="4" w:color="D9D9D9"/>
-            </w:tcBorders>
-            <w:shd w:fill="FFFFFF"/>
-            <w:tcMar>
-              <w:top w:w="90" w:type="dxa"/>
-              <w:left w:w="90" w:type="dxa"/>
-              <w:bottom w:w="90" w:type="dxa"/>
-              <w:right w:w="90" w:type="dxa"/>
-            </w:tcMar>
-          </w:tcPr>
-          <w:p>
-            <w:pPr>
-              <w:spacing w:after="60"/>
-            </w:pPr>
-            <w:r>
-              <w:rPr>
-                <w:b w:val="0"/>
-                <w:sz w:val="19"/>
-              </w:rPr>
-              <w:t>Private</w:t>
-            </w:r>
-          </w:p>
-        </w:tc>
-        <w:tc>
-          <w:tcPr>
-            <w:tcW w:type="dxa" w:w="8208"/>
-            <w:vAlign w:val="center"/>
-            <w:tcBorders>
-              <w:top w:val="single" w:sz="4" w:color="D9D9D9"/>
-              <w:left w:val="single" w:sz="4" w:color="D9D9D9"/>
-              <w:bottom w:val="single" w:sz="4" w:color="D9D9D9"/>
-              <w:right w:val="single" w:sz="4" w:color="D9D9D9"/>
-            </w:tcBorders>
-            <w:shd w:fill="FFFFFF"/>
-            <w:tcMar>
-              <w:top w:w="90" w:type="dxa"/>
-              <w:left w:w="90" w:type="dxa"/>
-              <w:bottom w:w="90" w:type="dxa"/>
-              <w:right w:w="90" w:type="dxa"/>
-            </w:tcMar>
-          </w:tcPr>
-          <w:p>
-            <w:pPr>
-              <w:spacing w:after="60"/>
-            </w:pPr>
-            <w:r>
-              <w:rPr>
-                <w:b w:val="0"/>
-                <w:sz w:val="19"/>
-              </w:rPr>
-              <w:t>Accessible shared houses plus the creator’s own Private houses.</w:t>
-            </w:r>
-          </w:p>
-        </w:tc>
-      </w:tr>
-    </w:tbl>
-    <w:p>
-      <w:pPr>
-        <w:spacing w:after="0"/>
-      </w:pPr>
+      <w:r>
+        <w:rPr>
+          <w:b/>
+        </w:rPr>
+        <w:t>Edit official house</w:t>
+      </w:r>
+      <w:r>
+        <w:rPr>
+          <w:b w:val="0"/>
+        </w:rPr>
+        <w:t xml:space="preserve"> to update metadata. Review changed fields and explicitly confirm. The in-game ID remains fixed. Registrations and tour stops stay linked, and saved owner edits are protected from startup seed replacement. Leave unknown catalog values blank rather than guessing.</w:t>
+      </w:r>
     </w:p>
     <w:p>
       <w:r>
-        <w:t>Discord saved-search results retain multiple selection. Previously selected houses keep their positions and new selections append in the order Discord supplies. Discord does not supply reliable click history within one submission. Check the numbered preview, adjust with Move Up or Move Down, then Confirm Order.</w:t>
+        <w:rPr>
+          <w:b w:val="0"/>
+        </w:rPr>
+        <w:t>The web catalog groups capacity, acquisition, price and source information. Classification profiles supply shared furnishing, collectible and population defaults; individual houses can retain exceptions. Applying defaults to one draft does not silently edit every house. Changing a shared profile previews its affected records before confirmation.</w:t>
+      </w:r>
+    </w:p>
+    <w:p>
+      <w:r>
+        <w:rPr>
+          <w:b w:val="0"/>
+        </w:rPr>
+        <w:t>Reusable styles, zones, subzones, house types, purchase types and availability values offer autocomplete suggestions while permitting new text. Shared values supports adding suggestions, previewing a rename and removing unused values. Discord covers core catalog fields; use the web for full metadata and shared-value management.</w:t>
       </w:r>
     </w:p>
     <w:p>
@@ -1052,17 +1829,23 @@
         <w:pStyle w:val="Heading2"/>
       </w:pPr>
       <w:r>
-        <w:t>Follow a tour</w:t>
+        <w:t>Read statistics correctly</w:t>
       </w:r>
     </w:p>
     <w:p>
       <w:r>
-        <w:t>Start or resume a self-paced web tour. Complete the current stop to advance, or explicitly Restart a completed route. Progress is reconciled when stops change. Shared leader-controlled tours remain available in Discord, subject to the configured Shared-tour roles.</w:t>
+        <w:rPr>
+          <w:b w:val="0"/>
+        </w:rPr>
+        <w:t>Statistics distinguishes the official house type, the ESO account owner and the Discord submitter. Rankings can show frequently registered house types, owners with many registered houses, different registering members and appearances in tours. Numbers and ranking entries link to appropriately scoped searches where supported.</w:t>
       </w:r>
     </w:p>
     <w:p>
       <w:r>
-        <w:t>Global administrators can edit eligible Server tours in their approved environment, but inaccessible underlying house details stay protected. Server administrators manage Server tours for their own server. Another creator’s Private tour stays private.</w:t>
+        <w:rPr>
+          <w:b w:val="0"/>
+        </w:rPr>
+        <w:t>Community rankings exclude Private records. Personal counts describe your own Private data; administrators do not gain other members' Private totals or records. These figures describe HearthBound registrations and saved interactions, not visits measured inside the game.</w:t>
       </w:r>
     </w:p>
     <w:p>
@@ -1070,17 +1853,55 @@
         <w:pStyle w:val="Heading2"/>
       </w:pPr>
       <w:r>
-        <w:t>Share through Discord</w:t>
+        <w:t>Follow activity and send feedback</w:t>
       </w:r>
     </w:p>
     <w:p>
       <w:r>
-        <w:t>A Share Pass provides revocable access to a house or tour within one ESO environment. When posting a pass, choose a channel and, when offered, an optional accessible thread, then confirm the destination before posting. Existing pass limits and revocation rules continue to apply.</w:t>
+        <w:rPr>
+          <w:b w:val="0"/>
+        </w:rPr>
+        <w:t xml:space="preserve">Recent Activity lists recorded Discord and web usage newest first, with the originating server or Personal session, member, action and time. Server, action and person filters combine. </w:t>
+      </w:r>
+      <w:r>
+        <w:rPr>
+          <w:b/>
+        </w:rPr>
+        <w:t>People using HearthBound</w:t>
+      </w:r>
+      <w:r>
+        <w:rPr>
+          <w:b w:val="0"/>
+        </w:rPr>
+        <w:t xml:space="preserve"> counts distinct recorded accounts during the retained period, not online Discord presence.</w:t>
       </w:r>
     </w:p>
     <w:p>
       <w:r>
-        <w:t>Tour information shows the nickname or stop title first, followed by the official house and ESO owner. Changing a server’s environment revokes affected passes and closes pass-derived sessions. A closed pass cannot continue to reveal a Private route through old session controls.</w:t>
+        <w:rPr>
+          <w:b w:val="0"/>
+        </w:rPr>
+        <w:t>Private actions use generic descriptions without Private destinations or search text. Linked content is checked again when opened. Activity begins when recording is deployed and uses a 90-day window; earlier usage is not reconstructed.</w:t>
+      </w:r>
+    </w:p>
+    <w:p>
+      <w:r>
+        <w:rPr>
+          <w:b w:val="0"/>
+        </w:rPr>
+        <w:t xml:space="preserve">Use </w:t>
+      </w:r>
+      <w:r>
+        <w:rPr>
+          <w:b/>
+        </w:rPr>
+        <w:t>Send feedback</w:t>
+      </w:r>
+      <w:r>
+        <w:rPr>
+          <w:b w:val="0"/>
+        </w:rPr>
+        <w:t xml:space="preserve"> in Support &amp; Access. Bot owners review the feedback inbox, change status and maintain internal notes. The inbox is for review, not another entry point for sending feedback. Internal notes are owner-only.</w:t>
       </w:r>
     </w:p>
     <w:p>
@@ -1093,12 +1914,7 @@
         <w:pStyle w:val="Heading1"/>
       </w:pPr>
       <w:r>
-        <w:t>Web administration</w:t>
-      </w:r>
-    </w:p>
-    <w:p>
-      <w:r>
-        <w:t>The portal serves ordinary members and administrators. Authorized staff see additional operational tools. Forms retain their original server and environment; reopen a form if another tab changes context. Protected requests recheck current permissions and validate writes server-side.</w:t>
+        <w:t>Deployment and troubleshooting</w:t>
       </w:r>
     </w:p>
     <w:p>
@@ -1106,12 +1922,43 @@
         <w:pStyle w:val="Heading2"/>
       </w:pPr>
       <w:r>
-        <w:t>Reviews and reports</w:t>
+        <w:t>Keep production data and login settings</w:t>
       </w:r>
     </w:p>
     <w:p>
       <w:r>
-        <w:t>Pending Review lists eligible shared registrations in pages of 25. Approve or Reject keeps your queue page. Private registrations do not enter this shared queue. Problem Reports supports Mark reviewing, Resolve and Dismiss. Stale or previously reviewed records are rejected.</w:t>
+        <w:rPr>
+          <w:b w:val="0"/>
+        </w:rPr>
+        <w:t>Use the existing Linux installation and configured MariaDB or SQLite backend. Preserve .env, the service account and database settings. DATABASE_PATH is the SQLite setting; DB_TYPE=mariadb uses the configured MariaDB connection instead. Do not copy an old Windows development database over production.</w:t>
+      </w:r>
+    </w:p>
+    <w:p>
+      <w:r>
+        <w:rPr>
+          <w:b w:val="0"/>
+        </w:rPr>
+        <w:t xml:space="preserve">WEB_SESSION_SECRET is HearthBound's own secret. Generate one with </w:t>
+      </w:r>
+      <w:r>
+        <w:rPr>
+          <w:b/>
+        </w:rPr>
+        <w:t>openssl rand -hex 32</w:t>
+      </w:r>
+      <w:r>
+        <w:rPr>
+          <w:b w:val="0"/>
+        </w:rPr>
+        <w:t>, keep it stable and restart after changing the actual environment source. Changing it signs everyone out. New sessions last 30 days by default; WEB_SESSION_DAYS accepts 1 to 365. Browser cookie clearing still requires another login, and permissions remain checked on protected requests.</w:t>
+      </w:r>
+    </w:p>
+    <w:p>
+      <w:r>
+        <w:rPr>
+          <w:b w:val="0"/>
+        </w:rPr>
+        <w:t>BOT_OWNER_IDS accepts numeric Discord user IDs separated by commas or whitespace. Owner configuration is independent of Discord roles. Keep credentials out of Git.</w:t>
       </w:r>
     </w:p>
     <w:p>
@@ -1119,22 +1966,205 @@
         <w:pStyle w:val="Heading2"/>
       </w:pPr>
       <w:r>
-        <w:t>Access and settings</w:t>
+        <w:t>Deploy the gallery release on Debian</w:t>
       </w:r>
     </w:p>
     <w:p>
       <w:r>
-        <w:t>Configure registration policy and Server administrator, trusted submitter and Shared-tour roles. The web form accepts numeric Discord role IDs, up to 25 per category. Discord’s role picker also supports name search; stored IDs retain access after role renames.</w:t>
+        <w:rPr>
+          <w:b w:val="0"/>
+        </w:rPr>
+        <w:t>Back up the configured production database and existing image directory first. From the actual installation folder, review local changes before pulling merged code. Keep the service's User, WorkingDirectory, ExecStart and EnvironmentFile consistent with that installation.</w:t>
+      </w:r>
+    </w:p>
+    <w:p>
+      <w:pPr>
+        <w:keepNext/>
+        <w:spacing w:after="0" w:line="240" w:lineRule="auto"/>
+        <w:ind w:left="173"/>
+      </w:pPr>
+      <w:r>
+        <w:rPr>
+          <w:rFonts w:ascii="Consolas" w:hAnsi="Consolas"/>
+          <w:sz w:val="19"/>
+        </w:rPr>
+        <w:t>cd ~/AddressBook</w:t>
+      </w:r>
+    </w:p>
+    <w:p>
+      <w:pPr>
+        <w:keepNext/>
+        <w:spacing w:after="0" w:line="240" w:lineRule="auto"/>
+        <w:ind w:left="173"/>
+      </w:pPr>
+      <w:r>
+        <w:rPr>
+          <w:rFonts w:ascii="Consolas" w:hAnsi="Consolas"/>
+          <w:sz w:val="19"/>
+        </w:rPr>
+        <w:t>git status --short</w:t>
+      </w:r>
+    </w:p>
+    <w:p>
+      <w:pPr>
+        <w:keepNext/>
+        <w:spacing w:after="0" w:line="240" w:lineRule="auto"/>
+        <w:ind w:left="173"/>
+      </w:pPr>
+      <w:r>
+        <w:rPr>
+          <w:rFonts w:ascii="Consolas" w:hAnsi="Consolas"/>
+          <w:sz w:val="19"/>
+        </w:rPr>
+        <w:t>sudo systemctl stop hearthbound</w:t>
+      </w:r>
+    </w:p>
+    <w:p>
+      <w:pPr>
+        <w:keepNext/>
+        <w:spacing w:after="0" w:line="240" w:lineRule="auto"/>
+        <w:ind w:left="173"/>
+      </w:pPr>
+      <w:r>
+        <w:rPr>
+          <w:rFonts w:ascii="Consolas" w:hAnsi="Consolas"/>
+          <w:sz w:val="19"/>
+        </w:rPr>
+        <w:t>git pull --ff-only origin master</w:t>
+      </w:r>
+    </w:p>
+    <w:p>
+      <w:pPr>
+        <w:keepNext w:val="0"/>
+        <w:spacing w:after="160" w:line="240" w:lineRule="auto"/>
+        <w:ind w:left="173"/>
+      </w:pPr>
+      <w:r>
+        <w:rPr>
+          <w:rFonts w:ascii="Consolas" w:hAnsi="Consolas"/>
+          <w:sz w:val="19"/>
+        </w:rPr>
+        <w:t>npm ci</w:t>
       </w:r>
     </w:p>
     <w:p>
       <w:r>
-        <w:t>Members request Server or Global moderator access through Help in Discord or Help &amp; Access on the web. Current HearthBound Server administrators approve Server requests for their server and can revoke individual grants. Users cannot approve their own request. Removing a grant does not remove an independent Discord role.</w:t>
+        <w:rPr>
+          <w:b w:val="0"/>
+        </w:rPr>
+        <w:t xml:space="preserve">For persistent image storage, add </w:t>
+      </w:r>
+      <w:r>
+        <w:rPr>
+          <w:b/>
+        </w:rPr>
+        <w:t>StateDirectory=hearthbound</w:t>
+      </w:r>
+      <w:r>
+        <w:rPr>
+          <w:b w:val="0"/>
+        </w:rPr>
+        <w:t xml:space="preserve"> under [Service] using </w:t>
+      </w:r>
+      <w:r>
+        <w:rPr>
+          <w:b/>
+        </w:rPr>
+        <w:t>sudo systemctl edit hearthbound</w:t>
+      </w:r>
+      <w:r>
+        <w:rPr>
+          <w:b w:val="0"/>
+        </w:rPr>
+        <w:t xml:space="preserve">, and set </w:t>
+      </w:r>
+      <w:r>
+        <w:rPr>
+          <w:b/>
+        </w:rPr>
+        <w:t>HOUSE_IMAGE_DIR=/var/lib/hearthbound/house-images</w:t>
+      </w:r>
+      <w:r>
+        <w:rPr>
+          <w:b w:val="0"/>
+        </w:rPr>
+        <w:t xml:space="preserve"> in the production environment. Separate bot/web processes must share the database and image directory. Nginx needs </w:t>
+      </w:r>
+      <w:r>
+        <w:rPr>
+          <w:b/>
+        </w:rPr>
+        <w:t>client_max_body_size 6m;</w:t>
+      </w:r>
+      <w:r>
+        <w:rPr>
+          <w:b w:val="0"/>
+        </w:rPr>
+        <w:t xml:space="preserve"> in its server block; validate its configuration before reloading.</w:t>
+      </w:r>
+    </w:p>
+    <w:p>
+      <w:pPr>
+        <w:keepNext/>
+        <w:spacing w:after="0" w:line="240" w:lineRule="auto"/>
+        <w:ind w:left="173"/>
+      </w:pPr>
+      <w:r>
+        <w:rPr>
+          <w:rFonts w:ascii="Consolas" w:hAnsi="Consolas"/>
+          <w:sz w:val="19"/>
+        </w:rPr>
+        <w:t>npm run deploy:commands</w:t>
+      </w:r>
+    </w:p>
+    <w:p>
+      <w:pPr>
+        <w:keepNext/>
+        <w:spacing w:after="0" w:line="240" w:lineRule="auto"/>
+        <w:ind w:left="173"/>
+      </w:pPr>
+      <w:r>
+        <w:rPr>
+          <w:rFonts w:ascii="Consolas" w:hAnsi="Consolas"/>
+          <w:sz w:val="19"/>
+        </w:rPr>
+        <w:t>sudo systemctl daemon-reload</w:t>
+      </w:r>
+    </w:p>
+    <w:p>
+      <w:pPr>
+        <w:keepNext/>
+        <w:spacing w:after="0" w:line="240" w:lineRule="auto"/>
+        <w:ind w:left="173"/>
+      </w:pPr>
+      <w:r>
+        <w:rPr>
+          <w:rFonts w:ascii="Consolas" w:hAnsi="Consolas"/>
+          <w:sz w:val="19"/>
+        </w:rPr>
+        <w:t>sudo systemctl restart hearthbound</w:t>
+      </w:r>
+    </w:p>
+    <w:p>
+      <w:pPr>
+        <w:keepNext w:val="0"/>
+        <w:spacing w:after="160" w:line="240" w:lineRule="auto"/>
+        <w:ind w:left="173"/>
+      </w:pPr>
+      <w:r>
+        <w:rPr>
+          <w:rFonts w:ascii="Consolas" w:hAnsi="Consolas"/>
+          <w:sz w:val="19"/>
+        </w:rPr>
+        <w:t>sudo journalctl -u hearthbound -n 40 --no-pager</w:t>
       </w:r>
     </w:p>
     <w:p>
       <w:r>
-        <w:t>Configured bot owners manage environment-specific Global requests and grants on the web. Existing designated approval-only IDs also have a dedicated Global approval page without becoming owners or Global administrators. Initial settings bootstrap access does not grant general editing or request approval.</w:t>
+        <w:rPr>
+          <w:b w:val="0"/>
+        </w:rPr>
+        <w:t>Command deployment adds the optional screenshot arguments to /hearth and /housing. Startup applies schema 15 to the configured database automatically. Back up both the database and image files; a database-only backup does not contain screenshots. A backend transfer copies image metadata, so copy image files separately. Keep normal operation at MIGRATE=false; the destructive confirmed backend-transfer mode is not a routine upgrade.</w:t>
       </w:r>
     </w:p>
     <w:p>
@@ -1142,512 +2172,87 @@
         <w:pStyle w:val="Heading2"/>
       </w:pPr>
       <w:r>
-        <w:t>Featured Housing settings</w:t>
-      </w:r>
-    </w:p>
-    <w:p>
-      <w:r>
-        <w:t>Add or reorder eligible saved house or tour records by ID and optional position from 1 to 5. Only eligible Server and Global content in the selected environment can be featured. Houses rotate weekly; manual changes do not restart the cycle. Tours remain curated. Back to Administration returns to the management area.</w:t>
-      </w:r>
-    </w:p>
-    <w:p>
-      <w:pPr>
-        <w:pStyle w:val="Heading2"/>
-      </w:pPr>
-      <w:r>
-        <w:t>Maintenance and export</w:t>
-      </w:r>
-    </w:p>
-    <w:p>
-      <w:r>
-        <w:t>Health reports connection status and bounded integrity metrics. Maintenance supports eligible catalog verification and exact-context duplicate merges, preserving compatible comments and stops. Administrative actions are audited.</w:t>
-      </w:r>
-    </w:p>
-    <w:p>
-      <w:r>
-        <w:t>Audit Log offers paginated history and filtered CSV export. Backup and Export produces an eligible guild/environment JSON snapshot. These administrative views and exports exclude Private records and unsafe historical metadata. A JSON export is not a full database backup. Full database backups contain Private data and need separate secure storage.</w:t>
-      </w:r>
-    </w:p>
-    <w:p>
-      <w:r>
-        <w:br w:type="page"/>
-      </w:r>
-    </w:p>
-    <w:p>
-      <w:pPr>
-        <w:pStyle w:val="Heading1"/>
-      </w:pPr>
-      <w:r>
-        <w:t>Owner tools and community usage</w:t>
-      </w:r>
-    </w:p>
-    <w:p>
-      <w:pPr>
-        <w:pStyle w:val="Heading2"/>
-      </w:pPr>
-      <w:r>
-        <w:t>Add an official house</w:t>
-      </w:r>
-    </w:p>
-    <w:p>
-      <w:r>
-        <w:t>Only Discord user IDs in BOT_OWNER_IDS can add or edit official ESO houses. Open House Catalog on the web, or Administration then Add Official House or Edit Official House in Discord. Server and Global administration alone do not grant this tool.</w:t>
-      </w:r>
-    </w:p>
-    <w:p>
-      <w:r>
-        <w:t>Enter the real positive in-game house ID and official name. The web form also exposes optional zone, classification, type, limits, acquisition, pricing and verification/source metadata. Unknown values should remain blank. Review the preview and explicitly confirm.</w:t>
-      </w:r>
-    </w:p>
-    <w:p>
-      <w:r>
-        <w:t>Adding a duplicate ID is rejected. Existing definitions can be edited with changed-field preview and explicit confirmation; their in-game IDs remain fixed. Edited definitions survive startup seeding and supported database transfers. Catalog deletion is not offered.</w:t>
-      </w:r>
-    </w:p>
-    <w:p>
-      <w:pPr>
-        <w:pStyle w:val="Heading2"/>
-      </w:pPr>
-      <w:r>
-        <w:t>Understand the statistics</w:t>
-      </w:r>
-    </w:p>
-    <w:p>
-      <w:r>
-        <w:t>Statistics uses the selected server and ESO environment. It separates your own Private count from Server and Global registrations and accessible tours. Rankings distinguish registration count, distinct registering Discord members, normalized ESO owners and distinct tour appearances.</w:t>
-      </w:r>
-    </w:p>
-    <w:p>
-      <w:r>
-        <w:t>Community rankings exclude Private records. Average shared-tour length and represented official house types are facts about saved data. They are not counts of visits inside ESO.</w:t>
-      </w:r>
-    </w:p>
-    <w:p>
-      <w:pPr>
-        <w:pStyle w:val="Heading2"/>
-      </w:pPr>
-      <w:r>
-        <w:t>Read recent activity</w:t>
-      </w:r>
-    </w:p>
-    <w:p>
-      <w:r>
-        <w:t>Recent Activity intentionally spans connected servers for signed-in members. Entries show the member, action, originating server or Personal session, source and timestamp, newest first. Filter by server or action, then use Older activity for earlier entries.</w:t>
-      </w:r>
-    </w:p>
-    <w:p>
-      <w:r>
-        <w:t>Private actions use generic descriptions. Private destination references and search text are not placed in the community feed, and linked content is checked again against current access. Meaningful starts, resumes, updates and progress are distinguished; duplicate deliveries are deduplicated. This usage feed is separate from the administrative audit log.</w:t>
-      </w:r>
-    </w:p>
-    <w:p>
-      <w:r>
-        <w:t>Recording begins after deployment; earlier usage is not reconstructed. The window is 90 days. Expired entries disappear from views immediately, while startup and hourly cleanup remove physical rows in batches of 1,000. Logging failure does not fail an otherwise successful user action.</w:t>
-      </w:r>
-    </w:p>
-    <w:p>
-      <w:r>
-        <w:br w:type="page"/>
-      </w:r>
-    </w:p>
-    <w:p>
-      <w:pPr>
-        <w:pStyle w:val="Heading1"/>
-      </w:pPr>
-      <w:r>
-        <w:t>Configuration and remembered login</w:t>
-      </w:r>
-    </w:p>
-    <w:p>
-      <w:r>
-        <w:t>Keep existing Discord and database credentials. Configure the deployed .env or the actual systemd environment source. A systemd-provided value takes precedence over .env. For a typical HTTPS deployment:</w:t>
+        <w:t>Diagnose and find the full reference</w:t>
       </w:r>
     </w:p>
     <w:p>
       <w:r>
         <w:rPr>
-          <w:rFonts w:ascii="Consolas" w:hAnsi="Consolas"/>
-          <w:sz w:val="18"/>
+          <w:b w:val="0"/>
         </w:rPr>
-        <w:t>ADMIN_INTERFACE=both</w:t>
-        <w:br/>
-        <w:t>WEB_ADMIN_ENABLED=true</w:t>
-        <w:br/>
-        <w:t>WEB_PORTAL_ENABLED=true</w:t>
-        <w:br/>
-        <w:t>WEB_PORTAL_URL=https://YOUR_PORTAL_HOST/app</w:t>
-        <w:br/>
-        <w:t>WEB_ADMIN_HOST=127.0.0.1</w:t>
-        <w:br/>
-        <w:t>WEB_ADMIN_PORT=8787</w:t>
-        <w:br/>
-        <w:t>WEB_SESSION_SECRET=YOUR_STABLE_RANDOM_SECRET</w:t>
-        <w:br/>
-        <w:t>WEB_SESSION_DAYS=30</w:t>
-        <w:br/>
-        <w:t>DISCORD_OAUTH_REDIRECT_URI=https://YOUR_PORTAL_HOST/auth/callback</w:t>
+        <w:t xml:space="preserve">For a web 502, check </w:t>
       </w:r>
-    </w:p>
-    <w:p>
       <w:r>
-        <w:t>Also configure DISCORD_OAUTH_CLIENT_ID and DISCORD_OAUTH_CLIENT_SECRET. Register the exact callback in the Discord Developer Portal and forward HTTPS through your reverse proxy to the loopback listener. The portal starts after Discord connects. WEB_PORTAL_URL provides the Discord Open Web Portal button when enabled.</w:t>
+        <w:rPr>
+          <w:b/>
+        </w:rPr>
+        <w:t>sudo systemctl status hearthbound --no-pager -l</w:t>
       </w:r>
-    </w:p>
-    <w:p>
-      <w:pPr>
-        <w:pStyle w:val="Heading2"/>
-      </w:pPr>
       <w:r>
-        <w:t>Remember sign in</w:t>
-      </w:r>
-    </w:p>
-    <w:p>
-      <w:r>
-        <w:t>New sessions last 30 days by default, including browser closes and service restarts. WEB_SESSION_DAYS accepts whole numbers from 1 to 365. Expiry is fixed from issuance or a new server selection; page views do not extend it indefinitely. Sign Out clears this browser’s cookie. Existing eight-hour sessions keep their old expiry, so sign out and back in once after upgrading.</w:t>
-      </w:r>
-    </w:p>
-    <w:p>
-      <w:r>
-        <w:t>Generate a secret with openssl rand -hex 32. WEB_SESSION_SECRET is independent of Discord and database credentials; keep it stable across restarts. Changing it signs everyone out. Restart after configuration changes. Membership and permissions are still checked on protected requests. Browsers that clear cookies require another login.</w:t>
-      </w:r>
-    </w:p>
-    <w:p>
-      <w:pPr>
-        <w:pStyle w:val="Heading2"/>
-      </w:pPr>
-      <w:r>
-        <w:t>Update the Debian service</w:t>
-      </w:r>
-    </w:p>
-    <w:p>
-      <w:r>
-        <w:t>Back up the live database and configuration, preserve tracked local changes, then update from the application account. Use the actual installation directory and service name:</w:t>
+        <w:rPr>
+          <w:b w:val="0"/>
+        </w:rPr>
+        <w:t xml:space="preserve"> and the journal above. Startup may still be initializing the web listener. For repeated logins, check cookies, a stable session secret, the public HTTPS URL and exact OAuth callback. For denied edits, check the selected server, environment, ownership, visibility and current role or grant.</w:t>
       </w:r>
     </w:p>
     <w:p>
       <w:r>
         <w:rPr>
-          <w:rFonts w:ascii="Consolas" w:hAnsi="Consolas"/>
-          <w:sz w:val="18"/>
+          <w:b w:val="0"/>
         </w:rPr>
-        <w:t>sudo systemctl stop hearthbound</w:t>
-        <w:br/>
-        <w:t>cd ~/AddressBook</w:t>
-        <w:br/>
-        <w:t>git status --short</w:t>
-        <w:br/>
-        <w:t>git pull --ff-only origin master</w:t>
-        <w:br/>
-        <w:t>npm ci</w:t>
-        <w:br/>
-        <w:t>sudo systemctl start hearthbound</w:t>
-        <w:br/>
-        <w:t>sudo systemctl status hearthbound --no-pager</w:t>
+        <w:t xml:space="preserve">Read </w:t>
       </w:r>
-    </w:p>
-    <w:p>
-      <w:r>
-        <w:t>The repository is now skperdue68/HearthBound; existing folder and database names may retain AddressBook. Preserve systemd User, WorkingDirectory, ExecStart, EnvironmentFile and database settings. The remembered-login update needs no database migration or slash-command redeployment.</w:t>
-      </w:r>
-    </w:p>
-    <w:p>
-      <w:r>
-        <w:br w:type="page"/>
-      </w:r>
-    </w:p>
-    <w:p>
-      <w:pPr>
-        <w:pStyle w:val="Heading1"/>
-      </w:pPr>
-      <w:r>
-        <w:t>Database operations and troubleshooting</w:t>
-      </w:r>
-    </w:p>
-    <w:p>
-      <w:pPr>
-        <w:pStyle w:val="Heading2"/>
-      </w:pPr>
-      <w:r>
-        <w:t>Upgrade the configured production database</w:t>
-      </w:r>
-    </w:p>
-    <w:p>
-      <w:r>
-        <w:t>SQLite and MariaDB are supported. Keep DB_TYPE and existing path or connection settings. Normal upgrades use MIGRATE=false. Pulling code alone does not change the database: application startup or npm run db:init applies versioned migrations to the configured backend.</w:t>
-      </w:r>
-    </w:p>
-    <w:p>
-      <w:r>
-        <w:t>Schema 12 adds usage records and owner catalog provenance while retaining existing housing, tours, access grants and progress. Back up before startup and follow docs/upgrade-v1.0.62.md for checks and recovery. Do not replace the Linux production database with an old Windows development copy. Schema 13 adds normalized classification profiles, reusable catalog values and per-house capacity exceptions. Existing registrations and tour links are retained.</w:t>
-      </w:r>
-    </w:p>
-    <w:p>
-      <w:r>
-        <w:t>MIGRATE=true with MIGRATE_CONFIRM=ERASE_TARGET_DATABASE is a separate destructive backend transfer. It validates the source, erases the destination, copies and verifies data, writes a completion marker and exits. It intentionally excludes transient active tour sessions and Share Pass session links. Use independently verified backups and restore MIGRATE=false before normal operation.</w:t>
-      </w:r>
-    </w:p>
-    <w:p>
-      <w:pPr>
-        <w:pStyle w:val="Heading2"/>
-      </w:pPr>
-      <w:r>
-        <w:t>Check service and login problems</w:t>
-      </w:r>
-    </w:p>
-    <w:p>
+      <w:hyperlink r:id="rId11">
+        <w:r>
+          <w:rPr>
+            <w:color w:val="245D91"/>
+            <w:u w:val="single"/>
+          </w:rPr>
+          <w:t>the gallery upgrade guide</w:t>
+        </w:r>
+      </w:hyperlink>
       <w:r>
         <w:rPr>
-          <w:rFonts w:ascii="Consolas" w:hAnsi="Consolas"/>
-          <w:sz w:val="18"/>
+          <w:b w:val="0"/>
         </w:rPr>
-        <w:t>sudo journalctl -u hearthbound -n 100 --no-pager</w:t>
-        <w:br/>
-        <w:t>systemctl show hearthbound -p WorkingDirectory -p EnvironmentFiles</w:t>
-        <w:br/>
-        <w:t>sudo systemctl restart hearthbound</w:t>
+        <w:t xml:space="preserve">, </w:t>
       </w:r>
-    </w:p>
-    <w:p>
+      <w:hyperlink r:id="rId12">
+        <w:r>
+          <w:rPr>
+            <w:color w:val="245D91"/>
+            <w:u w:val="single"/>
+          </w:rPr>
+          <w:t>member guide</w:t>
+        </w:r>
+      </w:hyperlink>
       <w:r>
-        <w:t>Use daemon-reload only after changing the systemd unit file. If startup fails after an upgrade, stop the service and follow the recovery guide with a matching database backup and code version; do not run older code against a newer schema blindly.</w:t>
+        <w:rPr>
+          <w:b w:val="0"/>
+        </w:rPr>
+        <w:t xml:space="preserve"> and </w:t>
       </w:r>
-    </w:p>
-    <w:p>
+      <w:hyperlink r:id="rId13">
+        <w:r>
+          <w:rPr>
+            <w:color w:val="245D91"/>
+            <w:u w:val="single"/>
+          </w:rPr>
+          <w:t>administration reference</w:t>
+        </w:r>
+      </w:hyperlink>
       <w:r>
-        <w:t>Repeated login prompts can indicate cleared cookies, an old session, a changing session secret or conflicting environment sources. Check the public HTTPS URL and exact OAuth callback. If editing is denied, check the selected server, ESO environment, current role or grant, ownership and visibility. Administrator access never overrides another creator’s Private records.</w:t>
-      </w:r>
-    </w:p>
-    <w:p>
-      <w:r>
-        <w:t>Members recover their own legacy unassigned Private records through My Address Book. Administrators recover only provably guild-linked shared tours through Discord or web recovery previews. Catalog conflict warnings require owner review rather than silently overwriting definitions.</w:t>
-      </w:r>
-    </w:p>
-    <w:p>
-      <w:pPr>
-        <w:pStyle w:val="Heading2"/>
-      </w:pPr>
-      <w:r>
-        <w:t>Reference material</w:t>
-      </w:r>
-    </w:p>
-    <w:p>
-      <w:r>
-        <w:t>README.md links to docs/member-guide.md, docs/administration.md, docs/HearthBound-current-state.md and docs/upgrade-v1.0.62.md. docs/historical-documentation.md identifies older AddressBook references and historical design notes. Use the current guides for deployment and the portal; retain older documents only as history.</w:t>
-      </w:r>
-    </w:p>
-    <w:p>
-      <w:r>
-        <w:br w:type="page"/>
-      </w:r>
-    </w:p>
-    <w:p>
-      <w:pPr>
-        <w:pStyle w:val="Heading1"/>
-      </w:pPr>
-      <w:r>
-        <w:t>Expanded web collections and tours</w:t>
-      </w:r>
-    </w:p>
-    <w:p>
-      <w:pPr>
-        <w:pStyle w:val="Heading2"/>
-      </w:pPr>
-      <w:r>
-        <w:t>Access based controls</w:t>
-      </w:r>
-    </w:p>
-    <w:p>
-      <w:r>
-        <w:t>Administration, settings, catalog tools and record actions appear only when your current HearthBound capabilities permit them. Direct URLs and submissions independently recheck membership, ownership, server and ESO environment. Other members’ Private records remain protected even from administrators and bot owners.</w:t>
-      </w:r>
-    </w:p>
-    <w:p>
-      <w:pPr>
-        <w:pStyle w:val="Heading2"/>
-      </w:pPr>
-      <w:r>
-        <w:t>House actions</w:t>
-      </w:r>
-    </w:p>
-    <w:p>
-      <w:r>
-        <w:t>Open a house to favorite it, set Want to Visit or Visited, read or add comments, report a problem and copy ESO access links. Official metadata is available below the house. Authorized editors can change visibility or delete the registration after reviewing the impact. The catalog definition and other registrations remain.</w:t>
-      </w:r>
-    </w:p>
-    <w:p>
-      <w:pPr>
-        <w:pStyle w:val="Heading2"/>
-      </w:pPr>
-      <w:r>
-        <w:t>Saved searches and ordered results</w:t>
-      </w:r>
-    </w:p>
-    <w:p>
-      <w:r>
-        <w:t>Advanced Search supports names, owners, tags, zones, types, styles and visibility. Save filters, run, rename or delete searches from My Address Book. Select multiple results to add to an eligible tour. Checkbox selection order is retained; review and drag stops or use Move up and Move down before saving.</w:t>
-      </w:r>
-    </w:p>
-    <w:p>
-      <w:pPr>
-        <w:pStyle w:val="Heading2"/>
-      </w:pPr>
-      <w:r>
-        <w:t>Independent web player</w:t>
-      </w:r>
-    </w:p>
-    <w:p>
-      <w:r>
-        <w:t>Start or resume a tour to see the current house, notes and jump links. Complete a stop and advance, return to the previous stop or restart deliberately. Progress is saved and reconciled with route changes. The web player does not create or control a live Discord session. Tour editors can update stop titles and notes or confirm tour deletion.</w:t>
-      </w:r>
-    </w:p>
-    <w:p>
-      <w:r>
-        <w:br w:type="page"/>
-      </w:r>
-    </w:p>
-    <w:p>
-      <w:pPr>
-        <w:pStyle w:val="Heading1"/>
-      </w:pPr>
-      <w:r>
-        <w:t>Web sharing and server operations</w:t>
-      </w:r>
-    </w:p>
-    <w:p>
-      <w:pPr>
-        <w:pStyle w:val="Heading2"/>
-      </w:pPr>
-      <w:r>
-        <w:t>Share Passes</w:t>
-      </w:r>
-    </w:p>
-    <w:p>
-      <w:r>
-        <w:t>Create a revocable web link from a house or tour, or choose a Discord channel and optional existing thread. Review and confirm before posting. Both your and the bot’s permissions are checked again before sending. Manage your own passes under My Address Book. Issuing a replacement link invalidates the old token, including old Discord cards.</w:t>
-      </w:r>
-    </w:p>
-    <w:p>
-      <w:pPr>
-        <w:pStyle w:val="Heading2"/>
-      </w:pPr>
-      <w:r>
-        <w:t>Private pass access</w:t>
-      </w:r>
-    </w:p>
-    <w:p>
-      <w:r>
-        <w:t>An explicit pass provides limited viewing without ordinary Private visibility or editing rights. A shared tour supports independent web navigation; copy it to My Address Book to save persistent personal progress. Copies belong to their creators and remain after pass revocation. Further pass access stops when the pass is revoked.</w:t>
-      </w:r>
-    </w:p>
-    <w:p>
-      <w:pPr>
-        <w:pStyle w:val="Heading2"/>
-      </w:pPr>
-      <w:r>
-        <w:t>Configuration and recovery</w:t>
-      </w:r>
-    </w:p>
-    <w:p>
-      <w:r>
-        <w:t>Authorized server settings include channel, timezone, registration roles and policies, Featured expiration and ordering, environment changes and legacy recovery. Environment and recovery actions show impact counts before confirmation. Private recovery applies only to the signed-in creator’s records. Owner-only catalog and Global approval controls retain their existing boundaries.</w:t>
-      </w:r>
-    </w:p>
-    <w:p>
-      <w:pPr>
-        <w:pStyle w:val="Heading2"/>
-      </w:pPr>
-      <w:r>
-        <w:t>Deploying this update</w:t>
-      </w:r>
-    </w:p>
-    <w:p>
-      <w:r>
-        <w:t>The catalog management update adds schema 13. Back up production, pull the merged code, run npm ci and restart hearthbound.service. Startup migrates the configured Linux database in place. Preserve .env, WEB_SESSION_SECRET and the existing database settings. Do not copy a Windows test database to production. Follow docs/upgrade-v1.0.63.md for verification and rollback.</w:t>
-      </w:r>
-    </w:p>
-    <w:p>
-      <w:r>
-        <w:br w:type="page"/>
-      </w:r>
-    </w:p>
-    <w:p>
-      <w:pPr>
-        <w:pStyle w:val="Heading1"/>
-      </w:pPr>
-      <w:r>
-        <w:t>Owner catalog management</w:t>
-      </w:r>
-    </w:p>
-    <w:p>
-      <w:pPr>
-        <w:pStyle w:val="Heading2"/>
-      </w:pPr>
-      <w:r>
-        <w:t>Editing an existing official house</w:t>
-      </w:r>
-    </w:p>
-    <w:p>
-      <w:r>
-        <w:t>Open House Catalog, search by official name or numeric ID, and choose Edit official house. Update the grouped metadata fields, preview the changed fields and explicitly confirm. The in-game ID is fixed. Registrations and tour stops remain linked; edited definitions are protected from startup seed replacement.</w:t>
-      </w:r>
-    </w:p>
-    <w:p>
-      <w:pPr>
-        <w:pStyle w:val="Heading2"/>
-      </w:pPr>
-      <w:r>
-        <w:t>Shared classification profiles</w:t>
-      </w:r>
-    </w:p>
-    <w:p>
-      <w:r>
-        <w:t>Classification profiles store furnishing, collectible and visitor defaults separately for Staple, Classic and Notable homes. Apply selected classification defaults changes only the current house draft; adjust individual fields for exceptions. Changing a shared profile previews the number of existing houses affected before confirmation, while preserving explicit house exceptions.</w:t>
-      </w:r>
-    </w:p>
-    <w:p>
-      <w:pPr>
-        <w:pStyle w:val="Heading2"/>
-      </w:pPr>
-      <w:r>
-        <w:t>Reusable metadata suggestions</w:t>
-      </w:r>
-    </w:p>
-    <w:p>
-      <w:r>
-        <w:t>Styles, zones, subzones, house types, purchase types and availability values live in a shared lookup table. Autocomplete suggests existing values and permits new text. New values become reusable after a house is saved. Shared values also supports adding suggestions, previewing a rename across houses and removing unused values.</w:t>
-      </w:r>
-    </w:p>
-    <w:p>
-      <w:pPr>
-        <w:pStyle w:val="Heading2"/>
-      </w:pPr>
-      <w:r>
-        <w:t>Database upgrade and safety</w:t>
-      </w:r>
-    </w:p>
-    <w:p>
-      <w:r>
-        <w:t>Migration 13 creates house_classifications, house_catalog_values and house_capacity_overrides. Existing flat house fields remain populated for Discord and search compatibility. Startup upgrades the configured backend automatically after a verified backup. Restore matching old code and database together if rollback is necessary.</w:t>
-      </w:r>
-    </w:p>
-    <w:p>
-      <w:pPr>
-        <w:pStyle w:val="Heading2"/>
-      </w:pPr>
-      <w:r>
-        <w:t>Discord and web access</w:t>
-      </w:r>
-    </w:p>
-    <w:p>
-      <w:r>
-        <w:t>Bot owners can use Administration then Edit Official House in Discord for core fields, with lookup, preview and confirmation. Use the web portal for full capacity, purchase and shared-value management. These tools do not expand access to another creator’s Private houses or tours.</w:t>
+        <w:rPr>
+          <w:b w:val="0"/>
+        </w:rPr>
+        <w:t xml:space="preserve"> for full configuration, backup and recovery details. Restore matching code, database and image backups together when rolling back a schema-changing upgrade.</w:t>
       </w:r>
     </w:p>
     <w:sectPr>
       <w:headerReference w:type="default" r:id="rId9"/>
       <w:footerReference w:type="default" r:id="rId10"/>
       <w:pgSz w:w="12240" w:h="15840"/>
-      <w:pgMar w:top="936" w:right="1080" w:bottom="936" w:left="1080" w:header="720" w:footer="720" w:gutter="0"/>
+      <w:pgMar w:top="1008" w:right="1152" w:bottom="1008" w:left="1152" w:header="432" w:footer="432" w:gutter="0"/>
       <w:cols w:space="720"/>
       <w:docGrid w:linePitch="360"/>
     </w:sectPr>
@@ -1660,12 +2265,14 @@
   <w:p>
     <w:pPr>
       <w:pStyle w:val="Footer"/>
+      <w:jc w:val="right"/>
     </w:pPr>
     <w:r>
       <w:rPr>
+        <w:color w:val="65788D"/>
         <w:sz w:val="16"/>
       </w:rPr>
-      <w:t xml:space="preserve">HearthBound  •  24 October 2026                                         </w:t>
+      <w:t xml:space="preserve">HearthBound   |   </w:t>
     </w:r>
     <w:fldSimple w:instr="PAGE"/>
   </w:p>
@@ -1680,9 +2287,10 @@
     </w:pPr>
     <w:r>
       <w:rPr>
+        <w:color w:val="65788D"/>
         <w:sz w:val="16"/>
       </w:rPr>
-      <w:t>HEARTHBOUND  /  USER AND ADMINISTRATOR GUIDE</w:t>
+      <w:t>HEARTHBOUND   /   USER AND ADMINISTRATOR GUIDE</w:t>
     </w:r>
   </w:p>
 </w:hdr>
@@ -1887,6 +2495,34 @@
   </w:num>
   <w:num w:numId="9">
     <w:abstractNumId w:val="0"/>
+  </w:num>
+  <w:abstractNum w:abstractNumId="9">
+    <w:lvl w:ilvl="0">
+      <w:start w:val="1"/>
+      <w:numFmt w:val="decimal"/>
+      <w:lvlText w:val="%1."/>
+      <w:suff w:val="tab"/>
+      <w:pPr>
+        <w:ind w:left="360" w:hanging="360"/>
+      </w:pPr>
+    </w:lvl>
+  </w:abstractNum>
+  <w:num w:numId="10">
+    <w:abstractNumId w:val="9"/>
+  </w:num>
+  <w:abstractNum w:abstractNumId="10">
+    <w:lvl w:ilvl="0">
+      <w:start w:val="1"/>
+      <w:numFmt w:val="decimal"/>
+      <w:lvlText w:val="%1."/>
+      <w:suff w:val="tab"/>
+      <w:pPr>
+        <w:ind w:left="360" w:hanging="360"/>
+      </w:pPr>
+    </w:lvl>
+  </w:abstractNum>
+  <w:num w:numId="11">
+    <w:abstractNumId w:val="10"/>
   </w:num>
 </w:numbering>
 </file>
@@ -2052,12 +2688,12 @@
     <w:qFormat/>
     <w:rsid w:val="00FC693F"/>
     <w:pPr>
-      <w:spacing w:after="140" w:line="254" w:lineRule="auto"/>
+      <w:spacing w:line="259" w:lineRule="auto" w:after="120"/>
     </w:pPr>
     <w:rPr>
-      <w:rFonts w:ascii="Arial" w:hAnsi="Arial"/>
-      <w:color w:val="000000"/>
-      <w:sz w:val="21"/>
+      <w:rFonts w:ascii="Calibri" w:hAnsi="Calibri"/>
+      <w:color w:val="172638"/>
+      <w:sz w:val="22"/>
     </w:rPr>
   </w:style>
   <w:style w:type="paragraph" w:styleId="Header">
@@ -2115,16 +2751,17 @@
     <w:pPr>
       <w:keepNext/>
       <w:keepLines/>
-      <w:spacing w:before="220" w:after="120"/>
+      <w:spacing w:before="200" w:after="100"/>
       <w:outlineLvl w:val="0"/>
     </w:pPr>
     <w:rPr>
-      <w:rFonts w:asciiTheme="majorHAnsi" w:eastAsiaTheme="majorEastAsia" w:hAnsiTheme="majorHAnsi" w:cstheme="majorBidi" w:ascii="Arial" w:hAnsi="Arial"/>
+      <w:rFonts w:asciiTheme="majorHAnsi" w:eastAsiaTheme="majorEastAsia" w:hAnsiTheme="majorHAnsi" w:cstheme="majorBidi" w:ascii="Calibri" w:hAnsi="Calibri"/>
       <w:b/>
       <w:bCs/>
-      <w:color w:val="000000"/>
-      <w:sz w:val="34"/>
+      <w:color w:val="17324D"/>
+      <w:sz w:val="36"/>
       <w:szCs w:val="28"/>
+      <w:u w:val="none"/>
     </w:rPr>
   </w:style>
   <w:style w:type="paragraph" w:styleId="Heading2">
@@ -2139,16 +2776,17 @@
     <w:pPr>
       <w:keepNext/>
       <w:keepLines/>
-      <w:spacing w:before="220" w:after="120"/>
+      <w:spacing w:before="200" w:after="100"/>
       <w:outlineLvl w:val="1"/>
     </w:pPr>
     <w:rPr>
-      <w:rFonts w:asciiTheme="majorHAnsi" w:eastAsiaTheme="majorEastAsia" w:hAnsiTheme="majorHAnsi" w:cstheme="majorBidi" w:ascii="Arial" w:hAnsi="Arial"/>
+      <w:rFonts w:asciiTheme="majorHAnsi" w:eastAsiaTheme="majorEastAsia" w:hAnsiTheme="majorHAnsi" w:cstheme="majorBidi" w:ascii="Calibri" w:hAnsi="Calibri"/>
       <w:b/>
       <w:bCs/>
-      <w:color w:val="000000"/>
+      <w:color w:val="17324D"/>
       <w:sz w:val="24"/>
       <w:szCs w:val="26"/>
+      <w:u w:val="none"/>
     </w:rPr>
   </w:style>
   <w:style w:type="paragraph" w:styleId="Heading3">
@@ -2401,16 +3039,19 @@
     <w:qFormat/>
     <w:rsid w:val="00FC693F"/>
     <w:pPr>
-      <w:spacing w:after="120" w:line="240" w:lineRule="auto" w:before="220"/>
+      <w:keepNext/>
+      <w:spacing w:after="200" w:line="240" w:lineRule="auto" w:before="0"/>
       <w:contextualSpacing/>
     </w:pPr>
     <w:rPr>
-      <w:rFonts w:asciiTheme="majorHAnsi" w:eastAsiaTheme="majorEastAsia" w:hAnsiTheme="majorHAnsi" w:cstheme="majorBidi" w:ascii="Arial" w:hAnsi="Arial"/>
+      <w:rFonts w:asciiTheme="majorHAnsi" w:eastAsiaTheme="majorEastAsia" w:hAnsiTheme="majorHAnsi" w:cstheme="majorBidi" w:ascii="Calibri" w:hAnsi="Calibri"/>
+      <w:b w:val="0"/>
       <w:color w:val="000000"/>
       <w:spacing w:val="5"/>
       <w:kern w:val="28"/>
-      <w:sz w:val="50"/>
+      <w:sz w:val="52"/>
       <w:szCs w:val="52"/>
+      <w:u w:val="none"/>
     </w:rPr>
   </w:style>
   <w:style w:type="character" w:customStyle="1" w:styleId="TitleChar">
@@ -2440,13 +3081,12 @@
       <w:numPr>
         <w:ilvl w:val="1"/>
       </w:numPr>
-      <w:spacing w:before="220" w:after="120"/>
     </w:pPr>
     <w:rPr>
-      <w:rFonts w:asciiTheme="majorHAnsi" w:eastAsiaTheme="majorEastAsia" w:hAnsiTheme="majorHAnsi" w:cstheme="majorBidi" w:ascii="Arial" w:hAnsi="Arial"/>
+      <w:rFonts w:asciiTheme="majorHAnsi" w:eastAsiaTheme="majorEastAsia" w:hAnsiTheme="majorHAnsi" w:cstheme="majorBidi"/>
       <w:i/>
       <w:iCs/>
-      <w:color w:val="000000"/>
+      <w:color w:val="4F81BD" w:themeColor="accent1"/>
       <w:spacing w:val="15"/>
       <w:sz w:val="24"/>
       <w:szCs w:val="24"/>
@@ -2886,9 +3526,6 @@
     <w:qFormat/>
     <w:rsid w:val="00FC693F"/>
     <w:pPr>
-      <w:pBdr>
-        <w:bottom w:val="single" w:sz="4" w:space="4" w:color="4F81BD" w:themeColor="accent1"/>
-      </w:pBdr>
       <w:spacing w:before="200" w:after="280"/>
       <w:ind w:left="936" w:right="936"/>
     </w:pPr>

</xml_diff>

<commit_message>
Recover reviewed gallery and UI improvements onto master with local activity timestamps
</commit_message>
<xml_diff>
--- a/HearthBound_User_Admin_Guide.docx
+++ b/HearthBound_User_Admin_Guide.docx
@@ -11,34 +11,179 @@
       </w:r>
     </w:p>
     <w:p>
-      <w:pPr>
-        <w:pStyle w:val="Subtitle"/>
-      </w:pPr>
       <w:r>
-        <w:t>Discord housing and the member web portal</w:t>
+        <w:rPr>
+          <w:b w:val="0"/>
+        </w:rPr>
+        <w:t>Discord and web workflows</w:t>
       </w:r>
     </w:p>
     <w:p>
       <w:r>
-        <w:t>Use HearthBound to register ESO houses, discover community creations and build housing tours. This guide covers member workflows, administration, privacy and operation of the web portal. It includes the remembered Discord login update following version 1.0.62.</w:t>
+        <w:rPr>
+          <w:b w:val="0"/>
+        </w:rPr>
+        <w:t>Updated 28 October 2026 for the 1.0.70 feature set</w:t>
+      </w:r>
+    </w:p>
+    <w:p>
+      <w:r>
+        <w:rPr>
+          <w:b w:val="0"/>
+        </w:rPr>
+        <w:t>HearthBound helps ESO players register decorated homes, build housing tours and save places they want to explore. Discord and the web portal use the same records. This guide explains everyday tasks, access rules and the production upgrade steps for the screenshot gallery release.</w:t>
       </w:r>
     </w:p>
     <w:p>
       <w:pPr>
-        <w:pStyle w:val="Heading2"/>
+        <w:pStyle w:val="Heading1"/>
       </w:pPr>
       <w:r>
-        <w:t>Getting started</w:t>
+        <w:t>Start with your task</w:t>
+      </w:r>
+    </w:p>
+    <w:p>
+      <w:pPr>
+        <w:pStyle w:val="ListBullet"/>
+      </w:pPr>
+      <w:r>
+        <w:rPr>
+          <w:b w:val="0"/>
+        </w:rPr>
+      </w:r>
+      <w:r>
+        <w:rPr>
+          <w:b/>
+        </w:rPr>
+        <w:t>Register a home:</w:t>
+      </w:r>
+      <w:r>
+        <w:rPr>
+          <w:b w:val="0"/>
+        </w:rPr>
+        <w:t xml:space="preserve"> choose Register New House on the web or from the Discord main menu. Add an ESO owner, description and tags, then optionally add it to a tour.</w:t>
+      </w:r>
+    </w:p>
+    <w:p>
+      <w:pPr>
+        <w:pStyle w:val="ListBullet"/>
+      </w:pPr>
+      <w:r>
+        <w:rPr>
+          <w:b w:val="0"/>
+        </w:rPr>
+      </w:r>
+      <w:r>
+        <w:rPr>
+          <w:b/>
+        </w:rPr>
+        <w:t>Build a route:</w:t>
+      </w:r>
+      <w:r>
+        <w:rPr>
+          <w:b w:val="0"/>
+        </w:rPr>
+        <w:t xml:space="preserve"> open Housing Tours, create or edit a tour, select houses and arrange the stops. The web editor supports drag and drop and notes for each stop.</w:t>
+      </w:r>
+    </w:p>
+    <w:p>
+      <w:pPr>
+        <w:pStyle w:val="ListBullet"/>
+      </w:pPr>
+      <w:r>
+        <w:rPr>
+          <w:b w:val="0"/>
+        </w:rPr>
+      </w:r>
+      <w:r>
+        <w:rPr>
+          <w:b/>
+        </w:rPr>
+        <w:t>Explore:</w:t>
+      </w:r>
+      <w:r>
+        <w:rPr>
+          <w:b w:val="0"/>
+        </w:rPr>
+        <w:t xml:space="preserve"> browse houses or tours, open Random House, or look through Featured Housing. Follow a self-paced route at your own speed.</w:t>
+      </w:r>
+    </w:p>
+    <w:p>
+      <w:pPr>
+        <w:pStyle w:val="ListBullet"/>
+      </w:pPr>
+      <w:r>
+        <w:rPr>
+          <w:b w:val="0"/>
+        </w:rPr>
+      </w:r>
+      <w:r>
+        <w:rPr>
+          <w:b/>
+        </w:rPr>
+        <w:t>Keep a collection:</w:t>
+      </w:r>
+      <w:r>
+        <w:rPr>
+          <w:b w:val="0"/>
+        </w:rPr>
+        <w:t xml:space="preserve"> Favorite a house or mark it Want to Visit or Visited. Find these places in My Address Book.</w:t>
+      </w:r>
+    </w:p>
+    <w:p>
+      <w:pPr>
+        <w:pStyle w:val="Heading1"/>
+      </w:pPr>
+      <w:r>
+        <w:t>Sign in and choose your server</w:t>
       </w:r>
     </w:p>
     <w:p>
       <w:r>
-        <w:t>Run /hearth in Discord. The existing /housing command opens the same menu. Choose Open Web Portal from Home or Help when your deployment enables it, then sign in with Discord and select a server.</w:t>
+        <w:rPr>
+          <w:b w:val="0"/>
+        </w:rPr>
+        <w:t xml:space="preserve">Use </w:t>
+      </w:r>
+      <w:r>
+        <w:rPr>
+          <w:b/>
+        </w:rPr>
+        <w:t>/hearth</w:t>
+      </w:r>
+      <w:r>
+        <w:rPr>
+          <w:b w:val="0"/>
+        </w:rPr>
+        <w:t xml:space="preserve"> in Discord. </w:t>
+      </w:r>
+      <w:r>
+        <w:rPr>
+          <w:b/>
+        </w:rPr>
+        <w:t>/housing</w:t>
+      </w:r>
+      <w:r>
+        <w:rPr>
+          <w:b w:val="0"/>
+        </w:rPr>
+        <w:t xml:space="preserve"> opens the same menu and accepts the same optional screenshot arguments. Open Web Portal appears when your deployment has a public portal URL configured. On the website, continue into HearthBound and sign in with Discord.</w:t>
       </w:r>
     </w:p>
     <w:p>
       <w:r>
-        <w:t>Check the server and ESO environment in the portal header before working. Your Access lists each applicable role, including the server or environment it covers. Native Discord Administrator permission alone does not grant HearthBound administration.</w:t>
+        <w:rPr>
+          <w:b w:val="0"/>
+        </w:rPr>
+        <w:t>Choose a connected Discord server, then check its ESO environment in the header. The avatar menu includes account actions and the downloadable guide; on small screens, Menu opens the grouped navigation. Your Access shows all applicable HearthBound roles and their scope.</w:t>
+      </w:r>
+    </w:p>
+    <w:p>
+      <w:pPr>
+        <w:pStyle w:val="Heading1"/>
+      </w:pPr>
+      <w:r>
+        <w:t>Understand visibility</w:t>
       </w:r>
     </w:p>
     <w:tbl>
@@ -46,327 +191,230 @@
         <w:tblW w:type="auto" w:w="0"/>
         <w:tblLayout w:type="fixed"/>
         <w:tblLook w:firstColumn="1" w:firstRow="1" w:lastColumn="0" w:lastRow="0" w:noHBand="0" w:noVBand="1" w:val="04A0"/>
+        <w:tblBorders>
+          <w:top w:val="single" w:sz="4" w:color="D9D9D9"/>
+          <w:left w:val="single" w:sz="4" w:color="D9D9D9"/>
+          <w:bottom w:val="single" w:sz="4" w:color="D9D9D9"/>
+          <w:right w:val="single" w:sz="4" w:color="D9D9D9"/>
+          <w:insideH w:val="single" w:sz="4" w:color="D9D9D9"/>
+          <w:insideV w:val="single" w:sz="4" w:color="D9D9D9"/>
+        </w:tblBorders>
       </w:tblPr>
       <w:tblGrid>
-        <w:gridCol w:w="2232"/>
-        <w:gridCol w:w="7848"/>
+        <w:gridCol w:w="1944"/>
+        <w:gridCol w:w="7992"/>
       </w:tblGrid>
       <w:tr>
+        <w:trPr>
+          <w:cantSplit/>
+          <w:tblHeader/>
+        </w:trPr>
         <w:tc>
           <w:tcPr>
-            <w:tcW w:type="dxa" w:w="2232"/>
+            <w:tcW w:type="dxa" w:w="1944"/>
             <w:vAlign w:val="center"/>
-            <w:tcBorders>
-              <w:top w:val="single" w:sz="4" w:color="D9D9D9"/>
-              <w:left w:val="single" w:sz="4" w:color="D9D9D9"/>
-              <w:bottom w:val="single" w:sz="4" w:color="D9D9D9"/>
-              <w:right w:val="single" w:sz="4" w:color="D9D9D9"/>
-            </w:tcBorders>
-            <w:shd w:fill="E7ECF0"/>
+            <w:shd w:fill="17324D"/>
             <w:tcMar>
-              <w:top w:w="90" w:type="dxa"/>
-              <w:left w:w="90" w:type="dxa"/>
-              <w:bottom w:w="90" w:type="dxa"/>
-              <w:right w:w="90" w:type="dxa"/>
+              <w:top w:w="100" w:type="dxa"/>
+              <w:left w:w="100" w:type="dxa"/>
+              <w:bottom w:w="100" w:type="dxa"/>
+              <w:right w:w="100" w:type="dxa"/>
             </w:tcMar>
           </w:tcPr>
           <w:p>
             <w:pPr>
-              <w:spacing w:after="60"/>
+              <w:spacing w:after="40" w:before="40"/>
             </w:pPr>
             <w:r>
               <w:rPr>
                 <w:b/>
-                <w:sz w:val="19"/>
+                <w:color w:val="FFFFFF"/>
               </w:rPr>
-              <w:t>Access</w:t>
+              <w:t>Visibility</w:t>
             </w:r>
           </w:p>
         </w:tc>
         <w:tc>
           <w:tcPr>
-            <w:tcW w:type="dxa" w:w="7848"/>
+            <w:tcW w:type="dxa" w:w="7992"/>
             <w:vAlign w:val="center"/>
-            <w:tcBorders>
-              <w:top w:val="single" w:sz="4" w:color="D9D9D9"/>
-              <w:left w:val="single" w:sz="4" w:color="D9D9D9"/>
-              <w:bottom w:val="single" w:sz="4" w:color="D9D9D9"/>
-              <w:right w:val="single" w:sz="4" w:color="D9D9D9"/>
-            </w:tcBorders>
-            <w:shd w:fill="E7ECF0"/>
+            <w:shd w:fill="17324D"/>
             <w:tcMar>
-              <w:top w:w="90" w:type="dxa"/>
-              <w:left w:w="90" w:type="dxa"/>
-              <w:bottom w:w="90" w:type="dxa"/>
-              <w:right w:w="90" w:type="dxa"/>
+              <w:top w:w="100" w:type="dxa"/>
+              <w:left w:w="100" w:type="dxa"/>
+              <w:bottom w:w="100" w:type="dxa"/>
+              <w:right w:w="100" w:type="dxa"/>
             </w:tcMar>
           </w:tcPr>
           <w:p>
             <w:pPr>
-              <w:spacing w:after="60"/>
+              <w:spacing w:after="40" w:before="40"/>
             </w:pPr>
             <w:r>
               <w:rPr>
                 <w:b/>
-                <w:sz w:val="19"/>
+                <w:color w:val="FFFFFF"/>
               </w:rPr>
-              <w:t>Capabilities</w:t>
+              <w:t>Who can use the record</w:t>
             </w:r>
           </w:p>
         </w:tc>
       </w:tr>
       <w:tr>
+        <w:trPr>
+          <w:cantSplit/>
+        </w:trPr>
         <w:tc>
           <w:tcPr>
-            <w:tcW w:type="dxa" w:w="2232"/>
+            <w:tcW w:type="dxa" w:w="1944"/>
             <w:vAlign w:val="center"/>
-            <w:tcBorders>
-              <w:top w:val="single" w:sz="4" w:color="D9D9D9"/>
-              <w:left w:val="single" w:sz="4" w:color="D9D9D9"/>
-              <w:bottom w:val="single" w:sz="4" w:color="D9D9D9"/>
-              <w:right w:val="single" w:sz="4" w:color="D9D9D9"/>
-            </w:tcBorders>
-            <w:shd w:fill="FFFFFF"/>
+            <w:shd w:fill="F2F5FA"/>
             <w:tcMar>
-              <w:top w:w="90" w:type="dxa"/>
-              <w:left w:w="90" w:type="dxa"/>
-              <w:bottom w:w="90" w:type="dxa"/>
-              <w:right w:w="90" w:type="dxa"/>
+              <w:top w:w="100" w:type="dxa"/>
+              <w:left w:w="100" w:type="dxa"/>
+              <w:bottom w:w="100" w:type="dxa"/>
+              <w:right w:w="100" w:type="dxa"/>
             </w:tcMar>
           </w:tcPr>
           <w:p>
             <w:pPr>
-              <w:spacing w:after="60"/>
+              <w:spacing w:after="40" w:before="40"/>
             </w:pPr>
             <w:r>
               <w:rPr>
                 <w:b w:val="0"/>
-                <w:sz w:val="19"/>
               </w:rPr>
-              <w:t>Member</w:t>
+              <w:t>Private</w:t>
             </w:r>
           </w:p>
         </w:tc>
         <w:tc>
           <w:tcPr>
-            <w:tcW w:type="dxa" w:w="7848"/>
+            <w:tcW w:type="dxa" w:w="7992"/>
             <w:vAlign w:val="center"/>
-            <w:tcBorders>
-              <w:top w:val="single" w:sz="4" w:color="D9D9D9"/>
-              <w:left w:val="single" w:sz="4" w:color="D9D9D9"/>
-              <w:bottom w:val="single" w:sz="4" w:color="D9D9D9"/>
-              <w:right w:val="single" w:sz="4" w:color="D9D9D9"/>
-            </w:tcBorders>
-            <w:shd w:fill="FFFFFF"/>
+            <w:shd w:fill="F2F5FA"/>
             <w:tcMar>
-              <w:top w:w="90" w:type="dxa"/>
-              <w:left w:w="90" w:type="dxa"/>
-              <w:bottom w:w="90" w:type="dxa"/>
-              <w:right w:w="90" w:type="dxa"/>
+              <w:top w:w="100" w:type="dxa"/>
+              <w:left w:w="100" w:type="dxa"/>
+              <w:bottom w:w="100" w:type="dxa"/>
+              <w:right w:w="100" w:type="dxa"/>
             </w:tcMar>
           </w:tcPr>
           <w:p>
             <w:pPr>
-              <w:spacing w:after="60"/>
+              <w:spacing w:after="40" w:before="40"/>
             </w:pPr>
             <w:r>
               <w:rPr>
                 <w:b w:val="0"/>
-                <w:sz w:val="19"/>
               </w:rPr>
-              <w:t>Browse accessible content and manage your own houses and tours.</w:t>
+              <w:t>Its creator. Administrators and bot owners cannot browse another creator's Private houses or tours.</w:t>
             </w:r>
           </w:p>
         </w:tc>
       </w:tr>
       <w:tr>
+        <w:trPr>
+          <w:cantSplit/>
+        </w:trPr>
         <w:tc>
           <w:tcPr>
-            <w:tcW w:type="dxa" w:w="2232"/>
+            <w:tcW w:type="dxa" w:w="1944"/>
             <w:vAlign w:val="center"/>
-            <w:tcBorders>
-              <w:top w:val="single" w:sz="4" w:color="D9D9D9"/>
-              <w:left w:val="single" w:sz="4" w:color="D9D9D9"/>
-              <w:bottom w:val="single" w:sz="4" w:color="D9D9D9"/>
-              <w:right w:val="single" w:sz="4" w:color="D9D9D9"/>
-            </w:tcBorders>
-            <w:shd w:fill="F7F8FA"/>
+            <w:shd w:fill="FFFFFF"/>
             <w:tcMar>
-              <w:top w:w="90" w:type="dxa"/>
-              <w:left w:w="90" w:type="dxa"/>
-              <w:bottom w:w="90" w:type="dxa"/>
-              <w:right w:w="90" w:type="dxa"/>
+              <w:top w:w="100" w:type="dxa"/>
+              <w:left w:w="100" w:type="dxa"/>
+              <w:bottom w:w="100" w:type="dxa"/>
+              <w:right w:w="100" w:type="dxa"/>
             </w:tcMar>
           </w:tcPr>
           <w:p>
             <w:pPr>
-              <w:spacing w:after="60"/>
+              <w:spacing w:after="40" w:before="40"/>
             </w:pPr>
             <w:r>
               <w:rPr>
                 <w:b w:val="0"/>
-                <w:sz w:val="19"/>
               </w:rPr>
-              <w:t>Server Administrator</w:t>
+              <w:t>Server</w:t>
             </w:r>
           </w:p>
         </w:tc>
         <w:tc>
           <w:tcPr>
-            <w:tcW w:type="dxa" w:w="7848"/>
+            <w:tcW w:type="dxa" w:w="7992"/>
             <w:vAlign w:val="center"/>
-            <w:tcBorders>
-              <w:top w:val="single" w:sz="4" w:color="D9D9D9"/>
-              <w:left w:val="single" w:sz="4" w:color="D9D9D9"/>
-              <w:bottom w:val="single" w:sz="4" w:color="D9D9D9"/>
-              <w:right w:val="single" w:sz="4" w:color="D9D9D9"/>
-            </w:tcBorders>
-            <w:shd w:fill="F7F8FA"/>
+            <w:shd w:fill="FFFFFF"/>
             <w:tcMar>
-              <w:top w:w="90" w:type="dxa"/>
-              <w:left w:w="90" w:type="dxa"/>
-              <w:bottom w:w="90" w:type="dxa"/>
-              <w:right w:w="90" w:type="dxa"/>
+              <w:top w:w="100" w:type="dxa"/>
+              <w:left w:w="100" w:type="dxa"/>
+              <w:bottom w:w="100" w:type="dxa"/>
+              <w:right w:w="100" w:type="dxa"/>
             </w:tcMar>
           </w:tcPr>
           <w:p>
             <w:pPr>
-              <w:spacing w:after="60"/>
+              <w:spacing w:after="40" w:before="40"/>
             </w:pPr>
             <w:r>
               <w:rPr>
                 <w:b w:val="0"/>
-                <w:sz w:val="19"/>
               </w:rPr>
-              <w:t>Manage Server houses and tours for that server and review eligible submissions and requests.</w:t>
+              <w:t>Eligible members of that Discord server, in its configured ESO environment.</w:t>
             </w:r>
           </w:p>
         </w:tc>
       </w:tr>
       <w:tr>
+        <w:trPr>
+          <w:cantSplit/>
+        </w:trPr>
         <w:tc>
           <w:tcPr>
-            <w:tcW w:type="dxa" w:w="2232"/>
+            <w:tcW w:type="dxa" w:w="1944"/>
             <w:vAlign w:val="center"/>
-            <w:tcBorders>
-              <w:top w:val="single" w:sz="4" w:color="D9D9D9"/>
-              <w:left w:val="single" w:sz="4" w:color="D9D9D9"/>
-              <w:bottom w:val="single" w:sz="4" w:color="D9D9D9"/>
-              <w:right w:val="single" w:sz="4" w:color="D9D9D9"/>
-            </w:tcBorders>
-            <w:shd w:fill="FFFFFF"/>
+            <w:shd w:fill="F2F5FA"/>
             <w:tcMar>
-              <w:top w:w="90" w:type="dxa"/>
-              <w:left w:w="90" w:type="dxa"/>
-              <w:bottom w:w="90" w:type="dxa"/>
-              <w:right w:w="90" w:type="dxa"/>
+              <w:top w:w="100" w:type="dxa"/>
+              <w:left w:w="100" w:type="dxa"/>
+              <w:bottom w:w="100" w:type="dxa"/>
+              <w:right w:w="100" w:type="dxa"/>
             </w:tcMar>
           </w:tcPr>
           <w:p>
             <w:pPr>
-              <w:spacing w:after="60"/>
+              <w:spacing w:after="40" w:before="40"/>
             </w:pPr>
             <w:r>
               <w:rPr>
                 <w:b w:val="0"/>
-                <w:sz w:val="19"/>
               </w:rPr>
-              <w:t>Global Administrator</w:t>
+              <w:t>Global</w:t>
             </w:r>
           </w:p>
         </w:tc>
         <w:tc>
           <w:tcPr>
-            <w:tcW w:type="dxa" w:w="7848"/>
+            <w:tcW w:type="dxa" w:w="7992"/>
             <w:vAlign w:val="center"/>
-            <w:tcBorders>
-              <w:top w:val="single" w:sz="4" w:color="D9D9D9"/>
-              <w:left w:val="single" w:sz="4" w:color="D9D9D9"/>
-              <w:bottom w:val="single" w:sz="4" w:color="D9D9D9"/>
-              <w:right w:val="single" w:sz="4" w:color="D9D9D9"/>
-            </w:tcBorders>
-            <w:shd w:fill="FFFFFF"/>
+            <w:shd w:fill="F2F5FA"/>
             <w:tcMar>
-              <w:top w:w="90" w:type="dxa"/>
-              <w:left w:w="90" w:type="dxa"/>
-              <w:bottom w:w="90" w:type="dxa"/>
-              <w:right w:w="90" w:type="dxa"/>
+              <w:top w:w="100" w:type="dxa"/>
+              <w:left w:w="100" w:type="dxa"/>
+              <w:bottom w:w="100" w:type="dxa"/>
+              <w:right w:w="100" w:type="dxa"/>
             </w:tcMar>
           </w:tcPr>
           <w:p>
             <w:pPr>
-              <w:spacing w:after="60"/>
+              <w:spacing w:after="40" w:before="40"/>
             </w:pPr>
             <w:r>
               <w:rPr>
                 <w:b w:val="0"/>
-                <w:sz w:val="19"/>
               </w:rPr>
-              <w:t>Manage Global houses and Global or Server tours in the approved ESO environment. Server-house editing is a separate permission.</w:t>
-            </w:r>
-          </w:p>
-        </w:tc>
-      </w:tr>
-      <w:tr>
-        <w:tc>
-          <w:tcPr>
-            <w:tcW w:type="dxa" w:w="2232"/>
-            <w:vAlign w:val="center"/>
-            <w:tcBorders>
-              <w:top w:val="single" w:sz="4" w:color="D9D9D9"/>
-              <w:left w:val="single" w:sz="4" w:color="D9D9D9"/>
-              <w:bottom w:val="single" w:sz="4" w:color="D9D9D9"/>
-              <w:right w:val="single" w:sz="4" w:color="D9D9D9"/>
-            </w:tcBorders>
-            <w:shd w:fill="F7F8FA"/>
-            <w:tcMar>
-              <w:top w:w="90" w:type="dxa"/>
-              <w:left w:w="90" w:type="dxa"/>
-              <w:bottom w:w="90" w:type="dxa"/>
-              <w:right w:w="90" w:type="dxa"/>
-            </w:tcMar>
-          </w:tcPr>
-          <w:p>
-            <w:pPr>
-              <w:spacing w:after="60"/>
-            </w:pPr>
-            <w:r>
-              <w:rPr>
-                <w:b w:val="0"/>
-                <w:sz w:val="19"/>
-              </w:rPr>
-              <w:t>Bot Owner</w:t>
-            </w:r>
-          </w:p>
-        </w:tc>
-        <w:tc>
-          <w:tcPr>
-            <w:tcW w:type="dxa" w:w="7848"/>
-            <w:vAlign w:val="center"/>
-            <w:tcBorders>
-              <w:top w:val="single" w:sz="4" w:color="D9D9D9"/>
-              <w:left w:val="single" w:sz="4" w:color="D9D9D9"/>
-              <w:bottom w:val="single" w:sz="4" w:color="D9D9D9"/>
-              <w:right w:val="single" w:sz="4" w:color="D9D9D9"/>
-            </w:tcBorders>
-            <w:shd w:fill="F7F8FA"/>
-            <w:tcMar>
-              <w:top w:w="90" w:type="dxa"/>
-              <w:left w:w="90" w:type="dxa"/>
-              <w:bottom w:w="90" w:type="dxa"/>
-              <w:right w:w="90" w:type="dxa"/>
-            </w:tcMar>
-          </w:tcPr>
-          <w:p>
-            <w:pPr>
-              <w:spacing w:after="60"/>
-            </w:pPr>
-            <w:r>
-              <w:rPr>
-                <w:b w:val="0"/>
-                <w:sz w:val="19"/>
-              </w:rPr>
-              <w:t>All configured role capabilities, Global grant management and official house catalog additions.</w:t>
+              <w:t>Eligible members of connected servers using that ESO environment.</w:t>
             </w:r>
           </w:p>
         </w:tc>
@@ -379,20 +427,10 @@
     </w:p>
     <w:p>
       <w:r>
-        <w:t>Private houses and tours remain creator-only, including against administrators and bot owners. A revocable Share Pass can provide limited viewing without administrative editing rights. Editing a tour does not automatically grant access to its houses.</w:t>
-      </w:r>
-    </w:p>
-    <w:p>
-      <w:pPr>
-        <w:pStyle w:val="Heading2"/>
-      </w:pPr>
-      <w:r>
-        <w:t>Using this guide</w:t>
-      </w:r>
-    </w:p>
-    <w:p>
-      <w:r>
-        <w:t>The following pages cover houses and discovery; tours and sharing; web administration; owner tools and community usage; configuration and remembered login; and database operations and troubleshooting. The repository Markdown guides provide the detailed reference.</w:t>
+        <w:rPr>
+          <w:b w:val="0"/>
+        </w:rPr>
+        <w:t>New houses and tours default to Server where registration policy permits. Visibility is separate from ESO environment. A Share Pass can grant limited, revocable viewing without granting editing rights. HearthBound links do not override the ESO house owner's in-game access settings.</w:t>
       </w:r>
     </w:p>
     <w:p>
@@ -405,7 +443,7 @@
         <w:pStyle w:val="Heading1"/>
       </w:pPr>
       <w:r>
-        <w:t>Houses and discovery</w:t>
+        <w:t>Register and manage houses</w:t>
       </w:r>
     </w:p>
     <w:p>
@@ -413,12 +451,924 @@
         <w:pStyle w:val="Heading2"/>
       </w:pPr>
       <w:r>
-        <w:t>Find and register a house</w:t>
+        <w:t>Register from a housing link or script</w:t>
+      </w:r>
+    </w:p>
+    <w:p>
+      <w:pPr>
+        <w:numPr>
+          <w:ilvl w:val="0"/>
+          <w:numId w:val="10"/>
+        </w:numPr>
+      </w:pPr>
+      <w:r>
+        <w:rPr>
+          <w:b w:val="0"/>
+        </w:rPr>
+        <w:t xml:space="preserve">Choose </w:t>
+      </w:r>
+      <w:r>
+        <w:rPr>
+          <w:b/>
+        </w:rPr>
+        <w:t>Register New House</w:t>
+      </w:r>
+      <w:r>
+        <w:rPr>
+          <w:b w:val="0"/>
+        </w:rPr>
+        <w:t xml:space="preserve">. You can paste an ESO Housing Link or a JumpToSpecificHouse script and select </w:t>
+      </w:r>
+      <w:r>
+        <w:rPr>
+          <w:b/>
+        </w:rPr>
+        <w:t>Submit</w:t>
+      </w:r>
+      <w:r>
+        <w:rPr>
+          <w:b w:val="0"/>
+        </w:rPr>
+        <w:t>, or find an official house by name or ID.</w:t>
+      </w:r>
+    </w:p>
+    <w:p>
+      <w:pPr>
+        <w:numPr>
+          <w:ilvl w:val="0"/>
+          <w:numId w:val="10"/>
+        </w:numPr>
+      </w:pPr>
+      <w:r>
+        <w:rPr>
+          <w:b w:val="0"/>
+        </w:rPr>
+        <w:t xml:space="preserve">Confirm the official house and </w:t>
+      </w:r>
+      <w:r>
+        <w:rPr>
+          <w:b/>
+        </w:rPr>
+        <w:t>ESO account owner</w:t>
+      </w:r>
+      <w:r>
+        <w:rPr>
+          <w:b w:val="0"/>
+        </w:rPr>
+        <w:t>. This is the account used by the visit command, not necessarily the Discord member submitting the record.</w:t>
+      </w:r>
+    </w:p>
+    <w:p>
+      <w:pPr>
+        <w:numPr>
+          <w:ilvl w:val="0"/>
+          <w:numId w:val="10"/>
+        </w:numPr>
+      </w:pPr>
+      <w:r>
+        <w:rPr>
+          <w:b w:val="0"/>
+        </w:rPr>
+        <w:t>Add a nickname, description and tags. Describe what visitors should look for; tags such as garden, halloween, puzzle or roleplay help others find the build. Blank lines in descriptions remain visible on the web.</w:t>
+      </w:r>
+    </w:p>
+    <w:p>
+      <w:pPr>
+        <w:numPr>
+          <w:ilvl w:val="0"/>
+          <w:numId w:val="10"/>
+        </w:numPr>
+      </w:pPr>
+      <w:r>
+        <w:rPr>
+          <w:b w:val="0"/>
+        </w:rPr>
+        <w:t>Review visibility and register. Shared submissions may require approval or a configured role. If an accessible registration already exists at the same or a broader visibility level, HearthBound identifies the duplicate instead of creating another.</w:t>
+      </w:r>
+    </w:p>
+    <w:p>
+      <w:pPr>
+        <w:numPr>
+          <w:ilvl w:val="0"/>
+          <w:numId w:val="10"/>
+        </w:numPr>
+      </w:pPr>
+      <w:r>
+        <w:rPr>
+          <w:b w:val="0"/>
+        </w:rPr>
+        <w:t xml:space="preserve">After an active registration is saved, choose </w:t>
+      </w:r>
+      <w:r>
+        <w:rPr>
+          <w:b/>
+        </w:rPr>
+        <w:t>Add to tour</w:t>
+      </w:r>
+      <w:r>
+        <w:rPr>
+          <w:b w:val="0"/>
+        </w:rPr>
+        <w:t xml:space="preserve"> or create a new tour with it. Canceling this optional step keeps the house registered. Pending houses must be approved first.</w:t>
       </w:r>
     </w:p>
     <w:p>
       <w:r>
-        <w:t>Search Houses finds accessible official names, ESO owners, nicknames and zones. Open a result for details and copy-ready jump, preview and housing links. Visibility, server, environment and record status are checked when opening saved results.</w:t>
+        <w:rPr>
+          <w:b w:val="0"/>
+        </w:rPr>
+        <w:t>If the official house is missing, check its name or ID. A bot owner can add a newly released official definition; registering a player build does not create an official catalog entry.</w:t>
+      </w:r>
+    </w:p>
+    <w:p>
+      <w:pPr>
+        <w:pStyle w:val="Heading2"/>
+      </w:pPr>
+      <w:r>
+        <w:t>View a house</w:t>
+      </w:r>
+    </w:p>
+    <w:p>
+      <w:r>
+        <w:rPr>
+          <w:b w:val="0"/>
+        </w:rPr>
+        <w:t>A house page identifies its nickname, official name, ESO owner and zone. Visit commands and official catalog details are available without opening a separate house screen. Descriptions, tags, screenshots and accessible tour memberships add context. Only tours you can access appear in its membership list.</w:t>
+      </w:r>
+    </w:p>
+    <w:p>
+      <w:r>
+        <w:rPr>
+          <w:b w:val="0"/>
+        </w:rPr>
+        <w:t xml:space="preserve">Use </w:t>
+      </w:r>
+      <w:r>
+        <w:rPr>
+          <w:b/>
+        </w:rPr>
+        <w:t>Add to tour</w:t>
+      </w:r>
+      <w:r>
+        <w:rPr>
+          <w:b w:val="0"/>
+        </w:rPr>
+        <w:t xml:space="preserve"> to choose an eligible existing route and add optional tour-specific notes. These notes belong to that route; they do not change the house description. Global tours accept Global houses. Server tours accept their source server's houses and Global houses. Private tours may also include their creator's Private houses.</w:t>
+      </w:r>
+    </w:p>
+    <w:p>
+      <w:pPr>
+        <w:pStyle w:val="Heading2"/>
+      </w:pPr>
+      <w:r>
+        <w:t>Manage a registration</w:t>
+      </w:r>
+    </w:p>
+    <w:p>
+      <w:r>
+        <w:rPr>
+          <w:b w:val="0"/>
+        </w:rPr>
+        <w:t xml:space="preserve">Authorized editors use </w:t>
+      </w:r>
+      <w:r>
+        <w:rPr>
+          <w:b/>
+        </w:rPr>
+        <w:t>Manage house</w:t>
+      </w:r>
+      <w:r>
+        <w:rPr>
+          <w:b w:val="0"/>
+        </w:rPr>
+        <w:t xml:space="preserve"> for metadata, visibility and deletion. Visibility changes show their effect on incompatible tour stops before confirmation. Delete is a separate red action with an impact preview. It removes this registration, not the official catalog definition or other registrations of the same ESO destination.</w:t>
+      </w:r>
+    </w:p>
+    <w:p>
+      <w:r>
+        <w:rPr>
+          <w:b w:val="0"/>
+        </w:rPr>
+        <w:t>Eligible administrators can copy a shared registration between servers or reassign its Discord submitter to a member of the relevant server. If the original submitter is not in the destination server, the person copying becomes the submitter. The ESO account owner remains a separate field. These administrative tools do not reassign another creator's Private content.</w:t>
+      </w:r>
+    </w:p>
+    <w:p>
+      <w:r>
+        <w:rPr>
+          <w:b w:val="0"/>
+        </w:rPr>
+        <w:t>If an edit fails, the web form retains entered fields and explains the problem. Check the selected server, environment and current access before retrying.</w:t>
+      </w:r>
+    </w:p>
+    <w:p>
+      <w:r>
+        <w:br w:type="page"/>
+      </w:r>
+    </w:p>
+    <w:p>
+      <w:pPr>
+        <w:pStyle w:val="Heading1"/>
+      </w:pPr>
+      <w:r>
+        <w:t>Save discoveries and add screenshots</w:t>
+      </w:r>
+    </w:p>
+    <w:p>
+      <w:pPr>
+        <w:pStyle w:val="Heading2"/>
+      </w:pPr>
+      <w:r>
+        <w:t>Use My Address Book</w:t>
+      </w:r>
+    </w:p>
+    <w:p>
+      <w:r>
+        <w:rPr>
+          <w:b w:val="0"/>
+        </w:rPr>
+      </w:r>
+      <w:r>
+        <w:rPr>
+          <w:b/>
+        </w:rPr>
+        <w:t>All saved</w:t>
+      </w:r>
+      <w:r>
+        <w:rPr>
+          <w:b w:val="0"/>
+        </w:rPr>
+        <w:t xml:space="preserve"> combines your submitted homes with places you intentionally saved. Favorites, Want to Visit and Visited provide focused collections. Submitted records, recent views, pending submissions, saved searches and tour progress have their own destinations.</w:t>
+      </w:r>
+    </w:p>
+    <w:p>
+      <w:r>
+        <w:rPr>
+          <w:b w:val="0"/>
+        </w:rPr>
+        <w:t>Favorite and visit state are independent. Use Unfavorite to remove a favorite. Change the visit selector to Visited after a visit, or choose Not marked to clear it. On the web, visit changes save automatically and report success or failure. Discord house and tour-stop cards expose reversible marks and Add Comment directly.</w:t>
+      </w:r>
+    </w:p>
+    <w:p>
+      <w:pPr>
+        <w:pStyle w:val="Heading2"/>
+      </w:pPr>
+      <w:r>
+        <w:t>Search and keep filters</w:t>
+      </w:r>
+    </w:p>
+    <w:p>
+      <w:r>
+        <w:rPr>
+          <w:b w:val="0"/>
+        </w:rPr>
+        <w:t>Search Houses supports quick text and visibility filters, with cards or a compact list. Advanced Search adds tags, zone, style, classification and multiple values. Save useful criteria under a name rather than bookmarking a fixed set of record IDs; each run checks current access again.</w:t>
+      </w:r>
+    </w:p>
+    <w:p>
+      <w:r>
+        <w:rPr>
+          <w:b w:val="0"/>
+        </w:rPr>
+        <w:t>Numbered pages and Jump to page preserve filters. A stale page link returns to an available page. Saved Search Run, Rename, Delete and Cancel retain the originating list page, including a results-to-house round trip. Deleting its final item returns to an earlier page if necessary.</w:t>
+      </w:r>
+    </w:p>
+    <w:p>
+      <w:pPr>
+        <w:pStyle w:val="Heading2"/>
+      </w:pPr>
+      <w:r>
+        <w:t>Leave a comment</w:t>
+      </w:r>
+    </w:p>
+    <w:p>
+      <w:r>
+        <w:rPr>
+          <w:b w:val="0"/>
+        </w:rPr>
+        <w:t>Share a detail you enjoyed, an observation or a thank-you. The author and date appear above each comment. Discord's newest-first reader has two comments per page, navigation and a direct page jump. Add Comment from a house or tour-stop card returns to that same card; adding from the reader returns to its newest page.</w:t>
+      </w:r>
+    </w:p>
+    <w:p>
+      <w:r>
+        <w:rPr>
+          <w:b w:val="0"/>
+        </w:rPr>
+        <w:t>Comments belong to an ESO destination in one environment. Matching registrations of that owner and official house share their comment history. Current house or Share Pass access is checked before reading or submitting.</w:t>
+      </w:r>
+    </w:p>
+    <w:p>
+      <w:pPr>
+        <w:pStyle w:val="Heading2"/>
+      </w:pPr>
+      <w:r>
+        <w:t>Use the house gallery</w:t>
+      </w:r>
+    </w:p>
+    <w:p>
+      <w:r>
+        <w:rPr>
+          <w:b w:val="0"/>
+        </w:rPr>
+        <w:t xml:space="preserve">A registration can hold </w:t>
+      </w:r>
+      <w:r>
+        <w:rPr>
+          <w:b/>
+        </w:rPr>
+        <w:t>up to eight still PNG, JPEG or WebP screenshots</w:t>
+      </w:r>
+      <w:r>
+        <w:rPr>
+          <w:b w:val="0"/>
+        </w:rPr>
+        <w:t xml:space="preserve">, up to </w:t>
+      </w:r>
+      <w:r>
+        <w:rPr>
+          <w:b/>
+        </w:rPr>
+        <w:t>5 MB each</w:t>
+      </w:r>
+      <w:r>
+        <w:rPr>
+          <w:b w:val="0"/>
+        </w:rPr>
+        <w:t>. Editors upload an image with an optional caption, choose a cover, edit captions or remove images. With no image, the house stays readable as a text card; no fake screenshot is substituted.</w:t>
+      </w:r>
+    </w:p>
+    <w:p>
+      <w:r>
+        <w:rPr>
+          <w:b w:val="0"/>
+        </w:rPr>
+        <w:t xml:space="preserve">On the web, find </w:t>
+      </w:r>
+      <w:r>
+        <w:rPr>
+          <w:b/>
+        </w:rPr>
+        <w:t>House screenshots</w:t>
+      </w:r>
+      <w:r>
+        <w:rPr>
+          <w:b w:val="0"/>
+        </w:rPr>
+        <w:t xml:space="preserve"> on the house page. Drag a file onto the upload area or choose one, review the preview and upload. Progress and errors appear in the form. Click an image to enlarge it; use Previous or Next, arrow keys, or Escape to close.</w:t>
+      </w:r>
+    </w:p>
+    <w:p>
+      <w:r>
+        <w:rPr>
+          <w:b w:val="0"/>
+        </w:rPr>
+        <w:t xml:space="preserve">In Discord, choose </w:t>
+      </w:r>
+      <w:r>
+        <w:rPr>
+          <w:b/>
+        </w:rPr>
+        <w:t>Screenshots</w:t>
+      </w:r>
+      <w:r>
+        <w:rPr>
+          <w:b w:val="0"/>
+        </w:rPr>
+        <w:t xml:space="preserve"> to browse. To upload, use /hearth or /housing with the </w:t>
+      </w:r>
+      <w:r>
+        <w:rPr>
+          <w:b/>
+        </w:rPr>
+        <w:t>house</w:t>
+      </w:r>
+      <w:r>
+        <w:rPr>
+          <w:b w:val="0"/>
+        </w:rPr>
+        <w:t xml:space="preserve"> option, attach a </w:t>
+      </w:r>
+      <w:r>
+        <w:rPr>
+          <w:b/>
+        </w:rPr>
+        <w:t>screenshot</w:t>
+      </w:r>
+      <w:r>
+        <w:rPr>
+          <w:b w:val="0"/>
+        </w:rPr>
+        <w:t xml:space="preserve"> and optionally enter a </w:t>
+      </w:r>
+      <w:r>
+        <w:rPr>
+          <w:b/>
+        </w:rPr>
+        <w:t>caption</w:t>
+      </w:r>
+      <w:r>
+        <w:rPr>
+          <w:b w:val="0"/>
+        </w:rPr>
+        <w:t>. Search the house option by nickname, official name or ESO owner. Existing edit permissions control uploads and gallery changes. Private image URLs remain creator-only. Copying a registration does not copy its gallery automatically.</w:t>
+      </w:r>
+    </w:p>
+    <w:p>
+      <w:r>
+        <w:br w:type="page"/>
+      </w:r>
+    </w:p>
+    <w:p>
+      <w:pPr>
+        <w:pStyle w:val="Heading1"/>
+      </w:pPr>
+      <w:r>
+        <w:t>Build and edit a housing tour</w:t>
+      </w:r>
+    </w:p>
+    <w:p>
+      <w:pPr>
+        <w:pStyle w:val="Heading2"/>
+      </w:pPr>
+      <w:r>
+        <w:t>Arrange the route on the web</w:t>
+      </w:r>
+    </w:p>
+    <w:p>
+      <w:pPr>
+        <w:numPr>
+          <w:ilvl w:val="0"/>
+          <w:numId w:val="11"/>
+        </w:numPr>
+      </w:pPr>
+      <w:r>
+        <w:rPr>
+          <w:b w:val="0"/>
+        </w:rPr>
+        <w:t xml:space="preserve">Open </w:t>
+      </w:r>
+      <w:r>
+        <w:rPr>
+          <w:b/>
+        </w:rPr>
+        <w:t>Housing Tours</w:t>
+      </w:r>
+      <w:r>
+        <w:rPr>
+          <w:b w:val="0"/>
+        </w:rPr>
+        <w:t xml:space="preserve"> and choose </w:t>
+      </w:r>
+      <w:r>
+        <w:rPr>
+          <w:b/>
+        </w:rPr>
+        <w:t>Create tour</w:t>
+      </w:r>
+      <w:r>
+        <w:rPr>
+          <w:b w:val="0"/>
+        </w:rPr>
+        <w:t xml:space="preserve">, or open a route you may edit and choose </w:t>
+      </w:r>
+      <w:r>
+        <w:rPr>
+          <w:b/>
+        </w:rPr>
+        <w:t>Add houses</w:t>
+      </w:r>
+      <w:r>
+        <w:rPr>
+          <w:b w:val="0"/>
+        </w:rPr>
+        <w:t xml:space="preserve"> or </w:t>
+      </w:r>
+      <w:r>
+        <w:rPr>
+          <w:b/>
+        </w:rPr>
+        <w:t>Edit tour</w:t>
+      </w:r>
+      <w:r>
+        <w:rPr>
+          <w:b w:val="0"/>
+        </w:rPr>
+        <w:t>. Tour lists are alphabetical.</w:t>
+      </w:r>
+    </w:p>
+    <w:p>
+      <w:pPr>
+        <w:numPr>
+          <w:ilvl w:val="0"/>
+          <w:numId w:val="11"/>
+        </w:numPr>
+      </w:pPr>
+      <w:r>
+        <w:rPr>
+          <w:b w:val="0"/>
+        </w:rPr>
+        <w:t>Enter a name, description and visibility. Explain the route's theme and what visitors can expect.</w:t>
+      </w:r>
+    </w:p>
+    <w:p>
+      <w:pPr>
+        <w:numPr>
+          <w:ilvl w:val="0"/>
+          <w:numId w:val="11"/>
+        </w:numPr>
+      </w:pPr>
+      <w:r>
+        <w:rPr>
+          <w:b w:val="0"/>
+        </w:rPr>
+        <w:t xml:space="preserve">In </w:t>
+      </w:r>
+      <w:r>
+        <w:rPr>
+          <w:b/>
+        </w:rPr>
+        <w:t>Find and add houses</w:t>
+      </w:r>
+      <w:r>
+        <w:rPr>
+          <w:b w:val="0"/>
+        </w:rPr>
+        <w:t>, filter by house or ESO owner, tags and visibility. More filters offers zone, style, house type and classification. Filters apply while typing; Enter in a filter does not submit the tour.</w:t>
+      </w:r>
+    </w:p>
+    <w:p>
+      <w:pPr>
+        <w:numPr>
+          <w:ilvl w:val="0"/>
+          <w:numId w:val="11"/>
+        </w:numPr>
+      </w:pPr>
+      <w:r>
+        <w:rPr>
+          <w:b w:val="0"/>
+        </w:rPr>
+        <w:t>Check houses to add them to the draft. Filtering preserves selected stops. Preview house opens another tab so the draft remains available.</w:t>
+      </w:r>
+    </w:p>
+    <w:p>
+      <w:pPr>
+        <w:numPr>
+          <w:ilvl w:val="0"/>
+          <w:numId w:val="11"/>
+        </w:numPr>
+      </w:pPr>
+      <w:r>
+        <w:rPr>
+          <w:b w:val="0"/>
+        </w:rPr>
+        <w:t xml:space="preserve">Enter </w:t>
+      </w:r>
+      <w:r>
+        <w:rPr>
+          <w:b/>
+        </w:rPr>
+        <w:t>Tour-specific notes</w:t>
+      </w:r>
+      <w:r>
+        <w:rPr>
+          <w:b w:val="0"/>
+        </w:rPr>
+        <w:t xml:space="preserve"> beside a stop. Point out a room, puzzle, viewpoint or feature relevant to this route. Drag stops or use the up/down buttons, then choose </w:t>
+      </w:r>
+      <w:r>
+        <w:rPr>
+          <w:b/>
+        </w:rPr>
+        <w:t>Save tour</w:t>
+      </w:r>
+      <w:r>
+        <w:rPr>
+          <w:b w:val="0"/>
+        </w:rPr>
+        <w:t>.</w:t>
+      </w:r>
+    </w:p>
+    <w:p>
+      <w:r>
+        <w:rPr>
+          <w:b w:val="0"/>
+        </w:rPr>
+        <w:t>A save supports at most 250 stops. Selection order becomes stop order. Removing a stop from the draft does not delete its house registration. Changes remain a draft until saved; leaving an edited route triggers a browser warning.</w:t>
+      </w:r>
+    </w:p>
+    <w:p>
+      <w:pPr>
+        <w:pStyle w:val="Heading2"/>
+      </w:pPr>
+      <w:r>
+        <w:t>Build from Discord</w:t>
+      </w:r>
+    </w:p>
+    <w:p>
+      <w:r>
+        <w:rPr>
+          <w:b w:val="0"/>
+        </w:rPr>
+        <w:t xml:space="preserve">Create a tour or open one you can manage, then choose </w:t>
+      </w:r>
+      <w:r>
+        <w:rPr>
+          <w:b/>
+        </w:rPr>
+        <w:t>Add House</w:t>
+      </w:r>
+      <w:r>
+        <w:rPr>
+          <w:b w:val="0"/>
+        </w:rPr>
+        <w:t>. The filter modal groups house or owner text, tags, visibility, zone and style or classification. The picker omits destinations already on the route and duplicate registration choices.</w:t>
+      </w:r>
+    </w:p>
+    <w:p>
+      <w:r>
+        <w:rPr>
+          <w:b w:val="0"/>
+        </w:rPr>
+        <w:t xml:space="preserve">Selecting a house adds it immediately. The confirmation offers </w:t>
+      </w:r>
+      <w:r>
+        <w:rPr>
+          <w:b/>
+        </w:rPr>
+        <w:t>Add Tour Notes</w:t>
+      </w:r>
+      <w:r>
+        <w:rPr>
+          <w:b w:val="0"/>
+        </w:rPr>
+        <w:t xml:space="preserve">, </w:t>
+      </w:r>
+      <w:r>
+        <w:rPr>
+          <w:b/>
+        </w:rPr>
+        <w:t>Add Another House</w:t>
+      </w:r>
+      <w:r>
+        <w:rPr>
+          <w:b w:val="0"/>
+        </w:rPr>
+        <w:t xml:space="preserve"> and </w:t>
+      </w:r>
+      <w:r>
+        <w:rPr>
+          <w:b/>
+        </w:rPr>
+        <w:t>View Tour</w:t>
+      </w:r>
+      <w:r>
+        <w:rPr>
+          <w:b w:val="0"/>
+        </w:rPr>
+        <w:t>. Add Another House retains the filter; saving notes returns to the same confirmation. Manage Stops provides ordering and stop-note editing.</w:t>
+      </w:r>
+    </w:p>
+    <w:p>
+      <w:r>
+        <w:rPr>
+          <w:b w:val="0"/>
+        </w:rPr>
+        <w:t>When adding several saved-search results, review their numbered order before confirming. Discord does not provide reliable click history within one multiselect submission; use the ordering controls whenever the displayed sequence needs adjustment.</w:t>
+      </w:r>
+    </w:p>
+    <w:p>
+      <w:pPr>
+        <w:pStyle w:val="Heading2"/>
+      </w:pPr>
+      <w:r>
+        <w:t>Recover after a failed save</w:t>
+      </w:r>
+    </w:p>
+    <w:p>
+      <w:r>
+        <w:rPr>
+          <w:b w:val="0"/>
+        </w:rPr>
+        <w:t>Validation errors keep the web editor open with the submitted name, description, visibility, stop order and notes. An inaccessible selected house becomes a generic removable placeholder rather than exposing its details. The recovered draft remains marked unsaved.</w:t>
+      </w:r>
+    </w:p>
+    <w:p>
+      <w:r>
+        <w:rPr>
+          <w:b w:val="0"/>
+        </w:rPr>
+        <w:t xml:space="preserve">If another person changed the tour, the old version cannot overwrite the new one. </w:t>
+      </w:r>
+      <w:r>
+        <w:rPr>
+          <w:b/>
+        </w:rPr>
+        <w:t>Open latest editor</w:t>
+      </w:r>
+      <w:r>
+        <w:rPr>
+          <w:b w:val="0"/>
+        </w:rPr>
+        <w:t xml:space="preserve"> opens a fresh editor in another tab. Compare and reapply your intended changes there; the stale editor's Save button remains disabled. Existing saved data is not replaced by an automatic merge.</w:t>
+      </w:r>
+    </w:p>
+    <w:p>
+      <w:r>
+        <w:br w:type="page"/>
+      </w:r>
+    </w:p>
+    <w:p>
+      <w:pPr>
+        <w:pStyle w:val="Heading1"/>
+      </w:pPr>
+      <w:r>
+        <w:t>Follow tours and share creations</w:t>
+      </w:r>
+    </w:p>
+    <w:p>
+      <w:pPr>
+        <w:pStyle w:val="Heading2"/>
+      </w:pPr>
+      <w:r>
+        <w:t>Follow a self paced route</w:t>
+      </w:r>
+    </w:p>
+    <w:p>
+      <w:r>
+        <w:rPr>
+          <w:b w:val="0"/>
+        </w:rPr>
+        <w:t xml:space="preserve">Open a tour and choose </w:t>
+      </w:r>
+      <w:r>
+        <w:rPr>
+          <w:b/>
+        </w:rPr>
+        <w:t>Open self-paced tour</w:t>
+      </w:r>
+      <w:r>
+        <w:rPr>
+          <w:b w:val="0"/>
+        </w:rPr>
+        <w:t xml:space="preserve"> on the web. Start or resume your own progress, view the current house and its visit commands, and complete stops at your own pace. Screenshots appear when the registration has them. Previous/Next controls and progress history help you return later; Restart begins a completed route again.</w:t>
+      </w:r>
+    </w:p>
+    <w:p>
+      <w:r>
+        <w:rPr>
+          <w:b w:val="0"/>
+        </w:rPr>
+        <w:t>Discord also supports Self Paced tours. The current stop includes house facts, visit commands and route-specific notes. Personal marks and direct comments do not advance your route. Expanded details and the originating progress-list page remain available when returning from comments or the tour list.</w:t>
+      </w:r>
+    </w:p>
+    <w:p>
+      <w:pPr>
+        <w:pStyle w:val="Heading2"/>
+      </w:pPr>
+      <w:r>
+        <w:t>Run a shared Discord tour</w:t>
+      </w:r>
+    </w:p>
+    <w:p>
+      <w:r>
+        <w:rPr>
+          <w:b w:val="0"/>
+        </w:rPr>
+        <w:t>A Shared session posts the current stop in a channel. Only its initiating leader can navigate or end it. Shared-tour permissions and source-server restrictions still apply. The web self-paced player is independent of a leader-controlled Discord session.</w:t>
+      </w:r>
+    </w:p>
+    <w:p>
+      <w:pPr>
+        <w:pStyle w:val="Heading2"/>
+      </w:pPr>
+      <w:r>
+        <w:t>Share a house or tour</w:t>
+      </w:r>
+    </w:p>
+    <w:p>
+      <w:r>
+        <w:rPr>
+          <w:b w:val="0"/>
+        </w:rPr>
+        <w:t xml:space="preserve">Use </w:t>
+      </w:r>
+      <w:r>
+        <w:rPr>
+          <w:b/>
+        </w:rPr>
+        <w:t>Share house</w:t>
+      </w:r>
+      <w:r>
+        <w:rPr>
+          <w:b w:val="0"/>
+        </w:rPr>
+        <w:t xml:space="preserve"> or </w:t>
+      </w:r>
+      <w:r>
+        <w:rPr>
+          <w:b/>
+        </w:rPr>
+        <w:t>Share tour</w:t>
+      </w:r>
+      <w:r>
+        <w:rPr>
+          <w:b w:val="0"/>
+        </w:rPr>
+        <w:t xml:space="preserve"> to create or post a Share Pass. Choose an accessible channel and, if offered, an optional thread, then confirm the destination. A pass is limited to its configured environment and can be revoked. Copy and editing actions appear only where the applicable access rules permit them.</w:t>
+      </w:r>
+    </w:p>
+    <w:p>
+      <w:r>
+        <w:rPr>
+          <w:b w:val="0"/>
+        </w:rPr>
+        <w:t>A Private Tour Pass gives each visitor an independent private run. Revocation closes pass-derived access and blocks stale viewing, navigation and comment submissions. A pass never grants general access to the creator's other Private records.</w:t>
+      </w:r>
+    </w:p>
+    <w:p>
+      <w:pPr>
+        <w:pStyle w:val="Heading2"/>
+      </w:pPr>
+      <w:r>
+        <w:t>Discover Random and Featured houses</w:t>
+      </w:r>
+    </w:p>
+    <w:p>
+      <w:r>
+        <w:rPr>
+          <w:b w:val="0"/>
+        </w:rPr>
+      </w:r>
+      <w:r>
+        <w:rPr>
+          <w:b/>
+        </w:rPr>
+        <w:t>Random House</w:t>
+      </w:r>
+      <w:r>
+        <w:rPr>
+          <w:b w:val="0"/>
+        </w:rPr>
+        <w:t xml:space="preserve"> gives an accessible registered destination with its official name, ESO owner, zone, classification, available tags and description, visit commands and recent comment context. Choose </w:t>
+      </w:r>
+      <w:r>
+        <w:rPr>
+          <w:b/>
+        </w:rPr>
+        <w:t>More details</w:t>
+      </w:r>
+      <w:r>
+        <w:rPr>
+          <w:b w:val="0"/>
+        </w:rPr>
+        <w:t xml:space="preserve"> for the complete record. In Discord, another pick avoids the previous destination when alternatives exist; web picks may repeat.</w:t>
+      </w:r>
+    </w:p>
+    <w:p>
+      <w:r>
+        <w:rPr>
+          <w:b w:val="0"/>
+        </w:rPr>
+      </w:r>
+      <w:r>
+        <w:rPr>
+          <w:b/>
+        </w:rPr>
+        <w:t>Featured Housing</w:t>
+      </w:r>
+      <w:r>
+        <w:rPr>
+          <w:b w:val="0"/>
+        </w:rPr>
+        <w:t xml:space="preserve"> displays richer house cards and curated tours. House selections rotate weekly. Favorites and recorded visit interest modestly influence selection while variety and randomness remain; popularity does not determine every result. Previous-cycle destinations are avoided when enough alternatives exist. Each featured category is capped at four entries.</w:t>
+      </w:r>
+    </w:p>
+    <w:p>
+      <w:r>
+        <w:rPr>
+          <w:b w:val="0"/>
+        </w:rPr>
+        <w:t>HearthBound records app actions, not actual movement inside ESO. Marking Visited is a member's saved state, not a measured in-game visit.</w:t>
+      </w:r>
+    </w:p>
+    <w:p>
+      <w:r>
+        <w:br w:type="page"/>
+      </w:r>
+    </w:p>
+    <w:p>
+      <w:pPr>
+        <w:pStyle w:val="Heading1"/>
+      </w:pPr>
+      <w:r>
+        <w:t>Access and server administration</w:t>
+      </w:r>
+    </w:p>
+    <w:p>
+      <w:pPr>
+        <w:pStyle w:val="Heading2"/>
+      </w:pPr>
+      <w:r>
+        <w:t>Understand your HearthBound access</w:t>
       </w:r>
     </w:p>
     <w:tbl>
@@ -426,263 +1376,283 @@
         <w:tblW w:type="auto" w:w="0"/>
         <w:tblLayout w:type="fixed"/>
         <w:tblLook w:firstColumn="1" w:firstRow="1" w:lastColumn="0" w:lastRow="0" w:noHBand="0" w:noVBand="1" w:val="04A0"/>
+        <w:tblBorders>
+          <w:top w:val="single" w:sz="4" w:color="D9D9D9"/>
+          <w:left w:val="single" w:sz="4" w:color="D9D9D9"/>
+          <w:bottom w:val="single" w:sz="4" w:color="D9D9D9"/>
+          <w:right w:val="single" w:sz="4" w:color="D9D9D9"/>
+          <w:insideH w:val="single" w:sz="4" w:color="D9D9D9"/>
+          <w:insideV w:val="single" w:sz="4" w:color="D9D9D9"/>
+        </w:tblBorders>
       </w:tblPr>
       <w:tblGrid>
-        <w:gridCol w:w="1656"/>
-        <w:gridCol w:w="8424"/>
+        <w:gridCol w:w="1944"/>
+        <w:gridCol w:w="7992"/>
       </w:tblGrid>
       <w:tr>
+        <w:trPr>
+          <w:cantSplit/>
+          <w:tblHeader/>
+        </w:trPr>
         <w:tc>
           <w:tcPr>
-            <w:tcW w:type="dxa" w:w="1656"/>
+            <w:tcW w:type="dxa" w:w="1944"/>
             <w:vAlign w:val="center"/>
-            <w:tcBorders>
-              <w:top w:val="single" w:sz="4" w:color="D9D9D9"/>
-              <w:left w:val="single" w:sz="4" w:color="D9D9D9"/>
-              <w:bottom w:val="single" w:sz="4" w:color="D9D9D9"/>
-              <w:right w:val="single" w:sz="4" w:color="D9D9D9"/>
-            </w:tcBorders>
-            <w:shd w:fill="E7ECF0"/>
+            <w:shd w:fill="17324D"/>
             <w:tcMar>
-              <w:top w:w="90" w:type="dxa"/>
-              <w:left w:w="90" w:type="dxa"/>
-              <w:bottom w:w="90" w:type="dxa"/>
-              <w:right w:w="90" w:type="dxa"/>
+              <w:top w:w="100" w:type="dxa"/>
+              <w:left w:w="100" w:type="dxa"/>
+              <w:bottom w:w="100" w:type="dxa"/>
+              <w:right w:w="100" w:type="dxa"/>
             </w:tcMar>
           </w:tcPr>
           <w:p>
             <w:pPr>
-              <w:spacing w:after="60"/>
+              <w:spacing w:after="40" w:before="40"/>
             </w:pPr>
             <w:r>
               <w:rPr>
                 <w:b/>
-                <w:sz w:val="19"/>
+                <w:color w:val="FFFFFF"/>
               </w:rPr>
-              <w:t>Visibility</w:t>
+              <w:t>Role</w:t>
             </w:r>
           </w:p>
         </w:tc>
         <w:tc>
           <w:tcPr>
-            <w:tcW w:type="dxa" w:w="8424"/>
+            <w:tcW w:type="dxa" w:w="7992"/>
             <w:vAlign w:val="center"/>
-            <w:tcBorders>
-              <w:top w:val="single" w:sz="4" w:color="D9D9D9"/>
-              <w:left w:val="single" w:sz="4" w:color="D9D9D9"/>
-              <w:bottom w:val="single" w:sz="4" w:color="D9D9D9"/>
-              <w:right w:val="single" w:sz="4" w:color="D9D9D9"/>
-            </w:tcBorders>
-            <w:shd w:fill="E7ECF0"/>
+            <w:shd w:fill="17324D"/>
             <w:tcMar>
-              <w:top w:w="90" w:type="dxa"/>
-              <w:left w:w="90" w:type="dxa"/>
-              <w:bottom w:w="90" w:type="dxa"/>
-              <w:right w:w="90" w:type="dxa"/>
+              <w:top w:w="100" w:type="dxa"/>
+              <w:left w:w="100" w:type="dxa"/>
+              <w:bottom w:w="100" w:type="dxa"/>
+              <w:right w:w="100" w:type="dxa"/>
             </w:tcMar>
           </w:tcPr>
           <w:p>
             <w:pPr>
-              <w:spacing w:after="60"/>
+              <w:spacing w:after="40" w:before="40"/>
             </w:pPr>
             <w:r>
               <w:rPr>
                 <w:b/>
-                <w:sz w:val="19"/>
+                <w:color w:val="FFFFFF"/>
               </w:rPr>
-              <w:t>Who normally sees it</w:t>
+              <w:t>Scope and authority</w:t>
             </w:r>
           </w:p>
         </w:tc>
       </w:tr>
       <w:tr>
+        <w:trPr>
+          <w:cantSplit/>
+        </w:trPr>
         <w:tc>
           <w:tcPr>
-            <w:tcW w:type="dxa" w:w="1656"/>
+            <w:tcW w:type="dxa" w:w="1944"/>
             <w:vAlign w:val="center"/>
-            <w:tcBorders>
-              <w:top w:val="single" w:sz="4" w:color="D9D9D9"/>
-              <w:left w:val="single" w:sz="4" w:color="D9D9D9"/>
-              <w:bottom w:val="single" w:sz="4" w:color="D9D9D9"/>
-              <w:right w:val="single" w:sz="4" w:color="D9D9D9"/>
-            </w:tcBorders>
-            <w:shd w:fill="FFFFFF"/>
+            <w:shd w:fill="F2F5FA"/>
             <w:tcMar>
-              <w:top w:w="90" w:type="dxa"/>
-              <w:left w:w="90" w:type="dxa"/>
-              <w:bottom w:w="90" w:type="dxa"/>
-              <w:right w:w="90" w:type="dxa"/>
+              <w:top w:w="100" w:type="dxa"/>
+              <w:left w:w="100" w:type="dxa"/>
+              <w:bottom w:w="100" w:type="dxa"/>
+              <w:right w:w="100" w:type="dxa"/>
             </w:tcMar>
           </w:tcPr>
           <w:p>
             <w:pPr>
-              <w:spacing w:after="60"/>
+              <w:spacing w:after="40" w:before="40"/>
             </w:pPr>
             <w:r>
               <w:rPr>
                 <w:b w:val="0"/>
-                <w:sz w:val="19"/>
               </w:rPr>
-              <w:t>Private</w:t>
+              <w:t>Member</w:t>
             </w:r>
           </w:p>
         </w:tc>
         <w:tc>
           <w:tcPr>
-            <w:tcW w:type="dxa" w:w="8424"/>
+            <w:tcW w:type="dxa" w:w="7992"/>
             <w:vAlign w:val="center"/>
-            <w:tcBorders>
-              <w:top w:val="single" w:sz="4" w:color="D9D9D9"/>
-              <w:left w:val="single" w:sz="4" w:color="D9D9D9"/>
-              <w:bottom w:val="single" w:sz="4" w:color="D9D9D9"/>
-              <w:right w:val="single" w:sz="4" w:color="D9D9D9"/>
-            </w:tcBorders>
-            <w:shd w:fill="FFFFFF"/>
+            <w:shd w:fill="F2F5FA"/>
             <w:tcMar>
-              <w:top w:w="90" w:type="dxa"/>
-              <w:left w:w="90" w:type="dxa"/>
-              <w:bottom w:w="90" w:type="dxa"/>
-              <w:right w:w="90" w:type="dxa"/>
+              <w:top w:w="100" w:type="dxa"/>
+              <w:left w:w="100" w:type="dxa"/>
+              <w:bottom w:w="100" w:type="dxa"/>
+              <w:right w:w="100" w:type="dxa"/>
             </w:tcMar>
           </w:tcPr>
           <w:p>
             <w:pPr>
-              <w:spacing w:after="60"/>
+              <w:spacing w:after="40" w:before="40"/>
             </w:pPr>
             <w:r>
               <w:rPr>
                 <w:b w:val="0"/>
-                <w:sz w:val="19"/>
               </w:rPr>
-              <w:t>The creator only, unless they explicitly issue a Share Pass.</w:t>
+              <w:t>Browse accessible records and manage their own houses, tours and saved places.</w:t>
             </w:r>
           </w:p>
         </w:tc>
       </w:tr>
       <w:tr>
+        <w:trPr>
+          <w:cantSplit/>
+        </w:trPr>
         <w:tc>
           <w:tcPr>
-            <w:tcW w:type="dxa" w:w="1656"/>
+            <w:tcW w:type="dxa" w:w="1944"/>
             <w:vAlign w:val="center"/>
-            <w:tcBorders>
-              <w:top w:val="single" w:sz="4" w:color="D9D9D9"/>
-              <w:left w:val="single" w:sz="4" w:color="D9D9D9"/>
-              <w:bottom w:val="single" w:sz="4" w:color="D9D9D9"/>
-              <w:right w:val="single" w:sz="4" w:color="D9D9D9"/>
-            </w:tcBorders>
-            <w:shd w:fill="F7F8FA"/>
+            <w:shd w:fill="FFFFFF"/>
             <w:tcMar>
-              <w:top w:w="90" w:type="dxa"/>
-              <w:left w:w="90" w:type="dxa"/>
-              <w:bottom w:w="90" w:type="dxa"/>
-              <w:right w:w="90" w:type="dxa"/>
+              <w:top w:w="100" w:type="dxa"/>
+              <w:left w:w="100" w:type="dxa"/>
+              <w:bottom w:w="100" w:type="dxa"/>
+              <w:right w:w="100" w:type="dxa"/>
             </w:tcMar>
           </w:tcPr>
           <w:p>
             <w:pPr>
-              <w:spacing w:after="60"/>
+              <w:spacing w:after="40" w:before="40"/>
             </w:pPr>
             <w:r>
               <w:rPr>
                 <w:b w:val="0"/>
-                <w:sz w:val="19"/>
               </w:rPr>
-              <w:t>Server</w:t>
+              <w:t>Server Administrator</w:t>
             </w:r>
           </w:p>
         </w:tc>
         <w:tc>
           <w:tcPr>
-            <w:tcW w:type="dxa" w:w="8424"/>
+            <w:tcW w:type="dxa" w:w="7992"/>
             <w:vAlign w:val="center"/>
-            <w:tcBorders>
-              <w:top w:val="single" w:sz="4" w:color="D9D9D9"/>
-              <w:left w:val="single" w:sz="4" w:color="D9D9D9"/>
-              <w:bottom w:val="single" w:sz="4" w:color="D9D9D9"/>
-              <w:right w:val="single" w:sz="4" w:color="D9D9D9"/>
-            </w:tcBorders>
-            <w:shd w:fill="F7F8FA"/>
+            <w:shd w:fill="FFFFFF"/>
             <w:tcMar>
-              <w:top w:w="90" w:type="dxa"/>
-              <w:left w:w="90" w:type="dxa"/>
-              <w:bottom w:w="90" w:type="dxa"/>
-              <w:right w:w="90" w:type="dxa"/>
+              <w:top w:w="100" w:type="dxa"/>
+              <w:left w:w="100" w:type="dxa"/>
+              <w:bottom w:w="100" w:type="dxa"/>
+              <w:right w:w="100" w:type="dxa"/>
             </w:tcMar>
           </w:tcPr>
           <w:p>
             <w:pPr>
-              <w:spacing w:after="60"/>
+              <w:spacing w:after="40" w:before="40"/>
             </w:pPr>
             <w:r>
               <w:rPr>
                 <w:b w:val="0"/>
-                <w:sz w:val="19"/>
               </w:rPr>
-              <w:t>Members of its source Discord server in the matching ESO environment.</w:t>
+              <w:t>Manage eligible Server houses and tours, settings, requests and shared review work for that server.</w:t>
             </w:r>
           </w:p>
         </w:tc>
       </w:tr>
       <w:tr>
+        <w:trPr>
+          <w:cantSplit/>
+        </w:trPr>
         <w:tc>
           <w:tcPr>
-            <w:tcW w:type="dxa" w:w="1656"/>
+            <w:tcW w:type="dxa" w:w="1944"/>
             <w:vAlign w:val="center"/>
-            <w:tcBorders>
-              <w:top w:val="single" w:sz="4" w:color="D9D9D9"/>
-              <w:left w:val="single" w:sz="4" w:color="D9D9D9"/>
-              <w:bottom w:val="single" w:sz="4" w:color="D9D9D9"/>
-              <w:right w:val="single" w:sz="4" w:color="D9D9D9"/>
-            </w:tcBorders>
-            <w:shd w:fill="FFFFFF"/>
+            <w:shd w:fill="F2F5FA"/>
             <w:tcMar>
-              <w:top w:w="90" w:type="dxa"/>
-              <w:left w:w="90" w:type="dxa"/>
-              <w:bottom w:w="90" w:type="dxa"/>
-              <w:right w:w="90" w:type="dxa"/>
+              <w:top w:w="100" w:type="dxa"/>
+              <w:left w:w="100" w:type="dxa"/>
+              <w:bottom w:w="100" w:type="dxa"/>
+              <w:right w:w="100" w:type="dxa"/>
             </w:tcMar>
           </w:tcPr>
           <w:p>
             <w:pPr>
-              <w:spacing w:after="60"/>
+              <w:spacing w:after="40" w:before="40"/>
             </w:pPr>
             <w:r>
               <w:rPr>
                 <w:b w:val="0"/>
-                <w:sz w:val="19"/>
               </w:rPr>
-              <w:t>Global</w:t>
+              <w:t>Global Administrator</w:t>
             </w:r>
           </w:p>
         </w:tc>
         <w:tc>
           <w:tcPr>
-            <w:tcW w:type="dxa" w:w="8424"/>
+            <w:tcW w:type="dxa" w:w="7992"/>
             <w:vAlign w:val="center"/>
-            <w:tcBorders>
-              <w:top w:val="single" w:sz="4" w:color="D9D9D9"/>
-              <w:left w:val="single" w:sz="4" w:color="D9D9D9"/>
-              <w:bottom w:val="single" w:sz="4" w:color="D9D9D9"/>
-              <w:right w:val="single" w:sz="4" w:color="D9D9D9"/>
-            </w:tcBorders>
-            <w:shd w:fill="FFFFFF"/>
+            <w:shd w:fill="F2F5FA"/>
             <w:tcMar>
-              <w:top w:w="90" w:type="dxa"/>
-              <w:left w:w="90" w:type="dxa"/>
-              <w:bottom w:w="90" w:type="dxa"/>
-              <w:right w:w="90" w:type="dxa"/>
+              <w:top w:w="100" w:type="dxa"/>
+              <w:left w:w="100" w:type="dxa"/>
+              <w:bottom w:w="100" w:type="dxa"/>
+              <w:right w:w="100" w:type="dxa"/>
             </w:tcMar>
           </w:tcPr>
           <w:p>
             <w:pPr>
-              <w:spacing w:after="60"/>
+              <w:spacing w:after="40" w:before="40"/>
             </w:pPr>
             <w:r>
               <w:rPr>
                 <w:b w:val="0"/>
-                <w:sz w:val="19"/>
               </w:rPr>
-              <w:t>Members using the matching ESO environment across servers.</w:t>
+              <w:t>Manage Global houses and Global or Server tours in the approved ESO environment. This alone does not grant Server-house editing or Server-request approval.</w:t>
+            </w:r>
+          </w:p>
+        </w:tc>
+      </w:tr>
+      <w:tr>
+        <w:trPr>
+          <w:cantSplit/>
+        </w:trPr>
+        <w:tc>
+          <w:tcPr>
+            <w:tcW w:type="dxa" w:w="1944"/>
+            <w:vAlign w:val="center"/>
+            <w:shd w:fill="FFFFFF"/>
+            <w:tcMar>
+              <w:top w:w="100" w:type="dxa"/>
+              <w:left w:w="100" w:type="dxa"/>
+              <w:bottom w:w="100" w:type="dxa"/>
+              <w:right w:w="100" w:type="dxa"/>
+            </w:tcMar>
+          </w:tcPr>
+          <w:p>
+            <w:pPr>
+              <w:spacing w:after="40" w:before="40"/>
+            </w:pPr>
+            <w:r>
+              <w:rPr>
+                <w:b w:val="0"/>
+              </w:rPr>
+              <w:t>Bot Owner</w:t>
+            </w:r>
+          </w:p>
+        </w:tc>
+        <w:tc>
+          <w:tcPr>
+            <w:tcW w:type="dxa" w:w="7992"/>
+            <w:vAlign w:val="center"/>
+            <w:shd w:fill="FFFFFF"/>
+            <w:tcMar>
+              <w:top w:w="100" w:type="dxa"/>
+              <w:left w:w="100" w:type="dxa"/>
+              <w:bottom w:w="100" w:type="dxa"/>
+              <w:right w:w="100" w:type="dxa"/>
+            </w:tcMar>
+          </w:tcPr>
+          <w:p>
+            <w:pPr>
+              <w:spacing w:after="40" w:before="40"/>
+            </w:pPr>
+            <w:r>
+              <w:rPr>
+                <w:b w:val="0"/>
+              </w:rPr>
+              <w:t>All configured HearthBound role capabilities, Global grant management and official catalog tools. Other creators' Private content remains protected.</w:t>
             </w:r>
           </w:p>
         </w:tc>
@@ -695,12 +1665,10 @@
     </w:p>
     <w:p>
       <w:r>
-        <w:t>Choose Register New House, select an official catalog house, enter the ESO owner and choose visibility. Shared submissions follow the server registration policy: they may become active immediately, require review or require an eligible role. Private registrations remain active and personal.</w:t>
-      </w:r>
-    </w:p>
-    <w:p>
-      <w:r>
-        <w:t>If the official house cannot be found, HearthBound shows a clear no-match message. Retry the name or ID. For a newly released house missing from the catalog, ask a configured bot owner to add its official definition; ordinary registration cannot create that definition.</w:t>
+        <w:rPr>
+          <w:b w:val="0"/>
+        </w:rPr>
+        <w:t>Discord's native Administrator permission alone is not HearthBound administration. Configured roles and individual grants can both provide Server access. Removing one individual grant does not remove access supplied by a role.</w:t>
       </w:r>
     </w:p>
     <w:p>
@@ -708,17 +1676,23 @@
         <w:pStyle w:val="Heading2"/>
       </w:pPr>
       <w:r>
-        <w:t>Add the registration to a tour</w:t>
+        <w:t>Set up a newly connected server</w:t>
       </w:r>
     </w:p>
     <w:p>
       <w:r>
-        <w:t>After an active registration is saved, use Create tour with this house or Add to your tour on the web. Discord offers Add to a Tour with an eligible existing tour or Create New Tour. Canceling this follow-up leaves the house saved. Pending submissions must be approved before tour addition.</w:t>
+        <w:rPr>
+          <w:b w:val="0"/>
+        </w:rPr>
+        <w:t>Choose the server's ESO environment on first use. If no Server staff role or individual administrator grant exists, an eligible Discord server owner, member with Manage Server permission, or configured bot owner can explicitly complete first-administrator setup. Empty settings never grant general editing automatically.</w:t>
       </w:r>
     </w:p>
     <w:p>
       <w:r>
-        <w:t>Open a house you manage to edit its official catalog selection, ESO owner, nickname, description and tags. My Address Book includes favorites, visit state, recent views, saved searches and personal tour progress on the web. Deletion and visibility changes require a separate impact preview and explicit confirmation.</w:t>
+        <w:rPr>
+          <w:b w:val="0"/>
+        </w:rPr>
+        <w:t>An existing HearthBound Server administrator then configures staff, trusted-submitter and Shared-tour roles and the registration policy. The web role settings use numeric Discord role IDs. Discord role pickers support name search; stored IDs survive role renames. Environment changes require an impact preview and confirmation.</w:t>
       </w:r>
     </w:p>
     <w:p>
@@ -726,17 +1700,51 @@
         <w:pStyle w:val="Heading2"/>
       </w:pPr>
       <w:r>
-        <w:t>Discover something new</w:t>
+        <w:t>Request and review access</w:t>
       </w:r>
     </w:p>
     <w:p>
       <w:r>
-        <w:t>Random House chooses an accessible registered house in the current ESO environment, including your own Private registrations. It excludes other creators’ Private records and non-player catalog homes. Another Random House avoids the previous destination when alternatives exist.</w:t>
+        <w:rPr>
+          <w:b w:val="0"/>
+        </w:rPr>
+        <w:t xml:space="preserve">Use </w:t>
+      </w:r>
+      <w:r>
+        <w:rPr>
+          <w:b/>
+        </w:rPr>
+        <w:t>Support &amp; Access</w:t>
+      </w:r>
+      <w:r>
+        <w:rPr>
+          <w:b w:val="0"/>
+        </w:rPr>
+        <w:t xml:space="preserve"> for Server or Global access requests, feedback and guide downloads. Current HearthBound Server administrators review Server requests for their server. Bot owners manage environment-specific Global requests and grants. Members cannot approve their own requests. Configured approval-only identities retain only their designated approval capability.</w:t>
+      </w:r>
+    </w:p>
+    <w:p>
+      <w:pPr>
+        <w:pStyle w:val="Heading2"/>
+      </w:pPr>
+      <w:r>
+        <w:t>Find the administration tools</w:t>
       </w:r>
     </w:p>
     <w:p>
       <w:r>
-        <w:t>Featured Housing opens curated houses and tours. Eligible featured houses rotate on persisted seven-day cycles. Opening details or comments retains navigation back to the originating list. HearthBound links do not override an ESO owner’s in-game access settings.</w:t>
+        <w:rPr>
+          <w:b w:val="0"/>
+        </w:rPr>
+        <w:t>The web Administration tabs lead through Overview, Pending review, Problem reports, Maintenance, Audit log and Backup &amp; export, with Access &amp; settings alongside. Count cards open the matching work queue. Approve/Reject and report-review controls stay together on their record row; wide tables scroll internally on small screens.</w:t>
+      </w:r>
+    </w:p>
+    <w:p>
+      <w:r>
+        <w:rPr>
+          <w:b w:val="0"/>
+        </w:rPr>
+        <w:t>Audit logs and reports support numbered pages and direct jumps; audit filters persist. Pending review uses Previous/Next because its queue does not expose a total. Exports exclude Private records. A portable JSON export is not a full database backup.</w:t>
       </w:r>
     </w:p>
     <w:p>
@@ -749,7 +1757,7 @@
         <w:pStyle w:val="Heading1"/>
       </w:pPr>
       <w:r>
-        <w:t>Tours and sharing</w:t>
+        <w:t>Catalog and community information</w:t>
       </w:r>
     </w:p>
     <w:p>
@@ -757,294 +1765,63 @@
         <w:pStyle w:val="Heading2"/>
       </w:pPr>
       <w:r>
-        <w:t>Create and arrange a route</w:t>
+        <w:t>Maintain official house definitions</w:t>
       </w:r>
     </w:p>
     <w:p>
       <w:r>
-        <w:t>Housing Tours lists routes alphabetically. Create a tour with a name, description and visibility, then select accessible houses. Arrange the draft by dragging stops or using Move up and Move down. Save tour commits the displayed order; Cancel discards the draft.</w:t>
+        <w:rPr>
+          <w:b w:val="0"/>
+        </w:rPr>
+        <w:t xml:space="preserve">Only configured bot owners use </w:t>
+      </w:r>
+      <w:r>
+        <w:rPr>
+          <w:b/>
+        </w:rPr>
+        <w:t>House Catalog</w:t>
+      </w:r>
+      <w:r>
+        <w:rPr>
+          <w:b w:val="0"/>
+        </w:rPr>
+        <w:t xml:space="preserve"> or the Discord Administration catalog tools. Enter the actual positive in-game house ID and official name. Ordinary registration saves a player's build against that definition; it does not add a new definition.</w:t>
       </w:r>
     </w:p>
     <w:p>
       <w:r>
-        <w:t>The web picker loads all accessible active houses. Name or owner, tag and visibility filters apply immediately; More filters offers zone, style, type and classification. Filtering preserves selected stops and their order. Enter inside the filters does not save the draft. A stale save is rejected; reopen the tour before reapplying edits.</w:t>
+        <w:rPr>
+          <w:b w:val="0"/>
+        </w:rPr>
+        <w:t xml:space="preserve">Search an existing house and choose </w:t>
       </w:r>
-    </w:p>
-    <w:tbl>
-      <w:tblPr>
-        <w:tblW w:type="auto" w:w="0"/>
-        <w:tblLayout w:type="fixed"/>
-        <w:tblLook w:firstColumn="1" w:firstRow="1" w:lastColumn="0" w:lastRow="0" w:noHBand="0" w:noVBand="1" w:val="04A0"/>
-      </w:tblPr>
-      <w:tblGrid>
-        <w:gridCol w:w="1872"/>
-        <w:gridCol w:w="8208"/>
-      </w:tblGrid>
-      <w:tr>
-        <w:tc>
-          <w:tcPr>
-            <w:tcW w:type="dxa" w:w="1872"/>
-            <w:vAlign w:val="center"/>
-            <w:tcBorders>
-              <w:top w:val="single" w:sz="4" w:color="D9D9D9"/>
-              <w:left w:val="single" w:sz="4" w:color="D9D9D9"/>
-              <w:bottom w:val="single" w:sz="4" w:color="D9D9D9"/>
-              <w:right w:val="single" w:sz="4" w:color="D9D9D9"/>
-            </w:tcBorders>
-            <w:shd w:fill="E7ECF0"/>
-            <w:tcMar>
-              <w:top w:w="90" w:type="dxa"/>
-              <w:left w:w="90" w:type="dxa"/>
-              <w:bottom w:w="90" w:type="dxa"/>
-              <w:right w:w="90" w:type="dxa"/>
-            </w:tcMar>
-          </w:tcPr>
-          <w:p>
-            <w:pPr>
-              <w:spacing w:after="60"/>
-            </w:pPr>
-            <w:r>
-              <w:rPr>
-                <w:b/>
-                <w:sz w:val="19"/>
-              </w:rPr>
-              <w:t>Tour visibility</w:t>
-            </w:r>
-          </w:p>
-        </w:tc>
-        <w:tc>
-          <w:tcPr>
-            <w:tcW w:type="dxa" w:w="8208"/>
-            <w:vAlign w:val="center"/>
-            <w:tcBorders>
-              <w:top w:val="single" w:sz="4" w:color="D9D9D9"/>
-              <w:left w:val="single" w:sz="4" w:color="D9D9D9"/>
-              <w:bottom w:val="single" w:sz="4" w:color="D9D9D9"/>
-              <w:right w:val="single" w:sz="4" w:color="D9D9D9"/>
-            </w:tcBorders>
-            <w:shd w:fill="E7ECF0"/>
-            <w:tcMar>
-              <w:top w:w="90" w:type="dxa"/>
-              <w:left w:w="90" w:type="dxa"/>
-              <w:bottom w:w="90" w:type="dxa"/>
-              <w:right w:w="90" w:type="dxa"/>
-            </w:tcMar>
-          </w:tcPr>
-          <w:p>
-            <w:pPr>
-              <w:spacing w:after="60"/>
-            </w:pPr>
-            <w:r>
-              <w:rPr>
-                <w:b/>
-                <w:sz w:val="19"/>
-              </w:rPr>
-              <w:t>Eligible stops</w:t>
-            </w:r>
-          </w:p>
-        </w:tc>
-      </w:tr>
-      <w:tr>
-        <w:tc>
-          <w:tcPr>
-            <w:tcW w:type="dxa" w:w="1872"/>
-            <w:vAlign w:val="center"/>
-            <w:tcBorders>
-              <w:top w:val="single" w:sz="4" w:color="D9D9D9"/>
-              <w:left w:val="single" w:sz="4" w:color="D9D9D9"/>
-              <w:bottom w:val="single" w:sz="4" w:color="D9D9D9"/>
-              <w:right w:val="single" w:sz="4" w:color="D9D9D9"/>
-            </w:tcBorders>
-            <w:shd w:fill="FFFFFF"/>
-            <w:tcMar>
-              <w:top w:w="90" w:type="dxa"/>
-              <w:left w:w="90" w:type="dxa"/>
-              <w:bottom w:w="90" w:type="dxa"/>
-              <w:right w:w="90" w:type="dxa"/>
-            </w:tcMar>
-          </w:tcPr>
-          <w:p>
-            <w:pPr>
-              <w:spacing w:after="60"/>
-            </w:pPr>
-            <w:r>
-              <w:rPr>
-                <w:b w:val="0"/>
-                <w:sz w:val="19"/>
-              </w:rPr>
-              <w:t>Global</w:t>
-            </w:r>
-          </w:p>
-        </w:tc>
-        <w:tc>
-          <w:tcPr>
-            <w:tcW w:type="dxa" w:w="8208"/>
-            <w:vAlign w:val="center"/>
-            <w:tcBorders>
-              <w:top w:val="single" w:sz="4" w:color="D9D9D9"/>
-              <w:left w:val="single" w:sz="4" w:color="D9D9D9"/>
-              <w:bottom w:val="single" w:sz="4" w:color="D9D9D9"/>
-              <w:right w:val="single" w:sz="4" w:color="D9D9D9"/>
-            </w:tcBorders>
-            <w:shd w:fill="FFFFFF"/>
-            <w:tcMar>
-              <w:top w:w="90" w:type="dxa"/>
-              <w:left w:w="90" w:type="dxa"/>
-              <w:bottom w:w="90" w:type="dxa"/>
-              <w:right w:w="90" w:type="dxa"/>
-            </w:tcMar>
-          </w:tcPr>
-          <w:p>
-            <w:pPr>
-              <w:spacing w:after="60"/>
-            </w:pPr>
-            <w:r>
-              <w:rPr>
-                <w:b w:val="0"/>
-                <w:sz w:val="19"/>
-              </w:rPr>
-              <w:t>Global houses in the same ESO environment.</w:t>
-            </w:r>
-          </w:p>
-        </w:tc>
-      </w:tr>
-      <w:tr>
-        <w:tc>
-          <w:tcPr>
-            <w:tcW w:type="dxa" w:w="1872"/>
-            <w:vAlign w:val="center"/>
-            <w:tcBorders>
-              <w:top w:val="single" w:sz="4" w:color="D9D9D9"/>
-              <w:left w:val="single" w:sz="4" w:color="D9D9D9"/>
-              <w:bottom w:val="single" w:sz="4" w:color="D9D9D9"/>
-              <w:right w:val="single" w:sz="4" w:color="D9D9D9"/>
-            </w:tcBorders>
-            <w:shd w:fill="F7F8FA"/>
-            <w:tcMar>
-              <w:top w:w="90" w:type="dxa"/>
-              <w:left w:w="90" w:type="dxa"/>
-              <w:bottom w:w="90" w:type="dxa"/>
-              <w:right w:w="90" w:type="dxa"/>
-            </w:tcMar>
-          </w:tcPr>
-          <w:p>
-            <w:pPr>
-              <w:spacing w:after="60"/>
-            </w:pPr>
-            <w:r>
-              <w:rPr>
-                <w:b w:val="0"/>
-                <w:sz w:val="19"/>
-              </w:rPr>
-              <w:t>Server</w:t>
-            </w:r>
-          </w:p>
-        </w:tc>
-        <w:tc>
-          <w:tcPr>
-            <w:tcW w:type="dxa" w:w="8208"/>
-            <w:vAlign w:val="center"/>
-            <w:tcBorders>
-              <w:top w:val="single" w:sz="4" w:color="D9D9D9"/>
-              <w:left w:val="single" w:sz="4" w:color="D9D9D9"/>
-              <w:bottom w:val="single" w:sz="4" w:color="D9D9D9"/>
-              <w:right w:val="single" w:sz="4" w:color="D9D9D9"/>
-            </w:tcBorders>
-            <w:shd w:fill="F7F8FA"/>
-            <w:tcMar>
-              <w:top w:w="90" w:type="dxa"/>
-              <w:left w:w="90" w:type="dxa"/>
-              <w:bottom w:w="90" w:type="dxa"/>
-              <w:right w:w="90" w:type="dxa"/>
-            </w:tcMar>
-          </w:tcPr>
-          <w:p>
-            <w:pPr>
-              <w:spacing w:after="60"/>
-            </w:pPr>
-            <w:r>
-              <w:rPr>
-                <w:b w:val="0"/>
-                <w:sz w:val="19"/>
-              </w:rPr>
-              <w:t>Global houses and houses from the tour’s source server.</w:t>
-            </w:r>
-          </w:p>
-        </w:tc>
-      </w:tr>
-      <w:tr>
-        <w:tc>
-          <w:tcPr>
-            <w:tcW w:type="dxa" w:w="1872"/>
-            <w:vAlign w:val="center"/>
-            <w:tcBorders>
-              <w:top w:val="single" w:sz="4" w:color="D9D9D9"/>
-              <w:left w:val="single" w:sz="4" w:color="D9D9D9"/>
-              <w:bottom w:val="single" w:sz="4" w:color="D9D9D9"/>
-              <w:right w:val="single" w:sz="4" w:color="D9D9D9"/>
-            </w:tcBorders>
-            <w:shd w:fill="FFFFFF"/>
-            <w:tcMar>
-              <w:top w:w="90" w:type="dxa"/>
-              <w:left w:w="90" w:type="dxa"/>
-              <w:bottom w:w="90" w:type="dxa"/>
-              <w:right w:w="90" w:type="dxa"/>
-            </w:tcMar>
-          </w:tcPr>
-          <w:p>
-            <w:pPr>
-              <w:spacing w:after="60"/>
-            </w:pPr>
-            <w:r>
-              <w:rPr>
-                <w:b w:val="0"/>
-                <w:sz w:val="19"/>
-              </w:rPr>
-              <w:t>Private</w:t>
-            </w:r>
-          </w:p>
-        </w:tc>
-        <w:tc>
-          <w:tcPr>
-            <w:tcW w:type="dxa" w:w="8208"/>
-            <w:vAlign w:val="center"/>
-            <w:tcBorders>
-              <w:top w:val="single" w:sz="4" w:color="D9D9D9"/>
-              <w:left w:val="single" w:sz="4" w:color="D9D9D9"/>
-              <w:bottom w:val="single" w:sz="4" w:color="D9D9D9"/>
-              <w:right w:val="single" w:sz="4" w:color="D9D9D9"/>
-            </w:tcBorders>
-            <w:shd w:fill="FFFFFF"/>
-            <w:tcMar>
-              <w:top w:w="90" w:type="dxa"/>
-              <w:left w:w="90" w:type="dxa"/>
-              <w:bottom w:w="90" w:type="dxa"/>
-              <w:right w:w="90" w:type="dxa"/>
-            </w:tcMar>
-          </w:tcPr>
-          <w:p>
-            <w:pPr>
-              <w:spacing w:after="60"/>
-            </w:pPr>
-            <w:r>
-              <w:rPr>
-                <w:b w:val="0"/>
-                <w:sz w:val="19"/>
-              </w:rPr>
-              <w:t>Accessible shared houses plus the creator’s own Private houses.</w:t>
-            </w:r>
-          </w:p>
-        </w:tc>
-      </w:tr>
-    </w:tbl>
-    <w:p>
-      <w:pPr>
-        <w:spacing w:after="0"/>
-      </w:pPr>
+      <w:r>
+        <w:rPr>
+          <w:b/>
+        </w:rPr>
+        <w:t>Edit official house</w:t>
+      </w:r>
+      <w:r>
+        <w:rPr>
+          <w:b w:val="0"/>
+        </w:rPr>
+        <w:t xml:space="preserve"> to update metadata. Review changed fields and explicitly confirm. The in-game ID remains fixed. Registrations and tour stops stay linked, and saved owner edits are protected from startup seed replacement. Leave unknown catalog values blank rather than guessing.</w:t>
+      </w:r>
     </w:p>
     <w:p>
       <w:r>
-        <w:t>Discord saved-search results retain multiple selection. Previously selected houses keep their positions and new selections append in the order Discord supplies. Discord does not supply reliable click history within one submission. Check the numbered preview, adjust with Move Up or Move Down, then Confirm Order.</w:t>
+        <w:rPr>
+          <w:b w:val="0"/>
+        </w:rPr>
+        <w:t>The web catalog groups capacity, acquisition, price and source information. Classification profiles supply shared furnishing, collectible and population defaults; individual houses can retain exceptions. Applying defaults to one draft does not silently edit every house. Changing a shared profile previews its affected records before confirmation.</w:t>
+      </w:r>
+    </w:p>
+    <w:p>
+      <w:r>
+        <w:rPr>
+          <w:b w:val="0"/>
+        </w:rPr>
+        <w:t>Reusable styles, zones, subzones, house types, purchase types and availability values offer autocomplete suggestions while permitting new text. Shared values supports adding suggestions, previewing a rename and removing unused values. Discord covers core catalog fields; use the web for full metadata and shared-value management.</w:t>
       </w:r>
     </w:p>
     <w:p>
@@ -1052,17 +1829,23 @@
         <w:pStyle w:val="Heading2"/>
       </w:pPr>
       <w:r>
-        <w:t>Follow a tour</w:t>
+        <w:t>Read statistics correctly</w:t>
       </w:r>
     </w:p>
     <w:p>
       <w:r>
-        <w:t>Start or resume a self-paced web tour. Complete the current stop to advance, or explicitly Restart a completed route. Progress is reconciled when stops change. Shared leader-controlled tours remain available in Discord, subject to the configured Shared-tour roles.</w:t>
+        <w:rPr>
+          <w:b w:val="0"/>
+        </w:rPr>
+        <w:t>Statistics distinguishes the official house type, the ESO account owner and the Discord submitter. Rankings can show frequently registered house types, owners with many registered houses, different registering members and appearances in tours. Numbers and ranking entries link to appropriately scoped searches where supported.</w:t>
       </w:r>
     </w:p>
     <w:p>
       <w:r>
-        <w:t>Global administrators can edit eligible Server tours in their approved environment, but inaccessible underlying house details stay protected. Server administrators manage Server tours for their own server. Another creator’s Private tour stays private.</w:t>
+        <w:rPr>
+          <w:b w:val="0"/>
+        </w:rPr>
+        <w:t>Community rankings exclude Private records. Personal counts describe your own Private data; administrators do not gain other members' Private totals or records. These figures describe HearthBound registrations and saved interactions, not visits measured inside the game.</w:t>
       </w:r>
     </w:p>
     <w:p>
@@ -1070,17 +1853,55 @@
         <w:pStyle w:val="Heading2"/>
       </w:pPr>
       <w:r>
-        <w:t>Share through Discord</w:t>
+        <w:t>Follow activity and send feedback</w:t>
       </w:r>
     </w:p>
     <w:p>
       <w:r>
-        <w:t>A Share Pass provides revocable access to a house or tour within one ESO environment. When posting a pass, choose a channel and, when offered, an optional accessible thread, then confirm the destination before posting. Existing pass limits and revocation rules continue to apply.</w:t>
+        <w:rPr>
+          <w:b w:val="0"/>
+        </w:rPr>
+        <w:t xml:space="preserve">Recent Activity lists recorded Discord and web usage newest first, with the originating server or Personal session, member, action and time. Server, action and person filters combine. </w:t>
+      </w:r>
+      <w:r>
+        <w:rPr>
+          <w:b/>
+        </w:rPr>
+        <w:t>People using HearthBound</w:t>
+      </w:r>
+      <w:r>
+        <w:rPr>
+          <w:b w:val="0"/>
+        </w:rPr>
+        <w:t xml:space="preserve"> counts distinct recorded accounts during the retained period, not online Discord presence.</w:t>
       </w:r>
     </w:p>
     <w:p>
       <w:r>
-        <w:t>Tour information shows the nickname or stop title first, followed by the official house and ESO owner. Changing a server’s environment revokes affected passes and closes pass-derived sessions. A closed pass cannot continue to reveal a Private route through old session controls.</w:t>
+        <w:rPr>
+          <w:b w:val="0"/>
+        </w:rPr>
+        <w:t>Private actions use generic descriptions without Private destinations or search text. Linked content is checked again when opened. Activity begins when recording is deployed and uses a 90-day window; earlier usage is not reconstructed.</w:t>
+      </w:r>
+    </w:p>
+    <w:p>
+      <w:r>
+        <w:rPr>
+          <w:b w:val="0"/>
+        </w:rPr>
+        <w:t xml:space="preserve">Use </w:t>
+      </w:r>
+      <w:r>
+        <w:rPr>
+          <w:b/>
+        </w:rPr>
+        <w:t>Send feedback</w:t>
+      </w:r>
+      <w:r>
+        <w:rPr>
+          <w:b w:val="0"/>
+        </w:rPr>
+        <w:t xml:space="preserve"> in Support &amp; Access. Bot owners review the feedback inbox, change status and maintain internal notes. The inbox is for review, not another entry point for sending feedback. Internal notes are owner-only.</w:t>
       </w:r>
     </w:p>
     <w:p>
@@ -1093,12 +1914,7 @@
         <w:pStyle w:val="Heading1"/>
       </w:pPr>
       <w:r>
-        <w:t>Web administration</w:t>
-      </w:r>
-    </w:p>
-    <w:p>
-      <w:r>
-        <w:t>The portal serves ordinary members and administrators. Authorized staff see additional operational tools. Forms retain their original server and environment; reopen a form if another tab changes context. Protected requests recheck current permissions and validate writes server-side.</w:t>
+        <w:t>Deployment and troubleshooting</w:t>
       </w:r>
     </w:p>
     <w:p>
@@ -1106,12 +1922,43 @@
         <w:pStyle w:val="Heading2"/>
       </w:pPr>
       <w:r>
-        <w:t>Reviews and reports</w:t>
+        <w:t>Keep production data and login settings</w:t>
       </w:r>
     </w:p>
     <w:p>
       <w:r>
-        <w:t>Pending Review lists eligible shared registrations in pages of 25. Approve or Reject keeps your queue page. Private registrations do not enter this shared queue. Problem Reports supports Mark reviewing, Resolve and Dismiss. Stale or previously reviewed records are rejected.</w:t>
+        <w:rPr>
+          <w:b w:val="0"/>
+        </w:rPr>
+        <w:t>Use the existing Linux installation and configured MariaDB or SQLite backend. Preserve .env, the service account and database settings. DATABASE_PATH is the SQLite setting; DB_TYPE=mariadb uses the configured MariaDB connection instead. Do not copy an old Windows development database over production.</w:t>
+      </w:r>
+    </w:p>
+    <w:p>
+      <w:r>
+        <w:rPr>
+          <w:b w:val="0"/>
+        </w:rPr>
+        <w:t xml:space="preserve">WEB_SESSION_SECRET is HearthBound's own secret. Generate one with </w:t>
+      </w:r>
+      <w:r>
+        <w:rPr>
+          <w:b/>
+        </w:rPr>
+        <w:t>openssl rand -hex 32</w:t>
+      </w:r>
+      <w:r>
+        <w:rPr>
+          <w:b w:val="0"/>
+        </w:rPr>
+        <w:t>, keep it stable and restart after changing the actual environment source. Changing it signs everyone out. New sessions last 30 days by default; WEB_SESSION_DAYS accepts 1 to 365. Browser cookie clearing still requires another login, and permissions remain checked on protected requests.</w:t>
+      </w:r>
+    </w:p>
+    <w:p>
+      <w:r>
+        <w:rPr>
+          <w:b w:val="0"/>
+        </w:rPr>
+        <w:t>BOT_OWNER_IDS accepts numeric Discord user IDs separated by commas or whitespace. Owner configuration is independent of Discord roles. Keep credentials out of Git.</w:t>
       </w:r>
     </w:p>
     <w:p>
@@ -1119,22 +1966,205 @@
         <w:pStyle w:val="Heading2"/>
       </w:pPr>
       <w:r>
-        <w:t>Access and settings</w:t>
+        <w:t>Deploy the gallery release on Debian</w:t>
       </w:r>
     </w:p>
     <w:p>
       <w:r>
-        <w:t>Configure registration policy and Server administrator, trusted submitter and Shared-tour roles. The web form accepts numeric Discord role IDs, up to 25 per category. Discord’s role picker also supports name search; stored IDs retain access after role renames.</w:t>
+        <w:rPr>
+          <w:b w:val="0"/>
+        </w:rPr>
+        <w:t>Back up the configured production database and existing image directory first. From the actual installation folder, review local changes before pulling merged code. Keep the service's User, WorkingDirectory, ExecStart and EnvironmentFile consistent with that installation.</w:t>
+      </w:r>
+    </w:p>
+    <w:p>
+      <w:pPr>
+        <w:keepNext/>
+        <w:spacing w:after="0" w:line="240" w:lineRule="auto"/>
+        <w:ind w:left="173"/>
+      </w:pPr>
+      <w:r>
+        <w:rPr>
+          <w:rFonts w:ascii="Consolas" w:hAnsi="Consolas"/>
+          <w:sz w:val="19"/>
+        </w:rPr>
+        <w:t>cd ~/AddressBook</w:t>
+      </w:r>
+    </w:p>
+    <w:p>
+      <w:pPr>
+        <w:keepNext/>
+        <w:spacing w:after="0" w:line="240" w:lineRule="auto"/>
+        <w:ind w:left="173"/>
+      </w:pPr>
+      <w:r>
+        <w:rPr>
+          <w:rFonts w:ascii="Consolas" w:hAnsi="Consolas"/>
+          <w:sz w:val="19"/>
+        </w:rPr>
+        <w:t>git status --short</w:t>
+      </w:r>
+    </w:p>
+    <w:p>
+      <w:pPr>
+        <w:keepNext/>
+        <w:spacing w:after="0" w:line="240" w:lineRule="auto"/>
+        <w:ind w:left="173"/>
+      </w:pPr>
+      <w:r>
+        <w:rPr>
+          <w:rFonts w:ascii="Consolas" w:hAnsi="Consolas"/>
+          <w:sz w:val="19"/>
+        </w:rPr>
+        <w:t>sudo systemctl stop hearthbound</w:t>
+      </w:r>
+    </w:p>
+    <w:p>
+      <w:pPr>
+        <w:keepNext/>
+        <w:spacing w:after="0" w:line="240" w:lineRule="auto"/>
+        <w:ind w:left="173"/>
+      </w:pPr>
+      <w:r>
+        <w:rPr>
+          <w:rFonts w:ascii="Consolas" w:hAnsi="Consolas"/>
+          <w:sz w:val="19"/>
+        </w:rPr>
+        <w:t>git pull --ff-only origin master</w:t>
+      </w:r>
+    </w:p>
+    <w:p>
+      <w:pPr>
+        <w:keepNext w:val="0"/>
+        <w:spacing w:after="160" w:line="240" w:lineRule="auto"/>
+        <w:ind w:left="173"/>
+      </w:pPr>
+      <w:r>
+        <w:rPr>
+          <w:rFonts w:ascii="Consolas" w:hAnsi="Consolas"/>
+          <w:sz w:val="19"/>
+        </w:rPr>
+        <w:t>npm ci</w:t>
       </w:r>
     </w:p>
     <w:p>
       <w:r>
-        <w:t>Members request Server or Global moderator access through Help in Discord or Help &amp; Access on the web. Current HearthBound Server administrators approve Server requests for their server and can revoke individual grants. Users cannot approve their own request. Removing a grant does not remove an independent Discord role.</w:t>
+        <w:rPr>
+          <w:b w:val="0"/>
+        </w:rPr>
+        <w:t xml:space="preserve">For persistent image storage, add </w:t>
+      </w:r>
+      <w:r>
+        <w:rPr>
+          <w:b/>
+        </w:rPr>
+        <w:t>StateDirectory=hearthbound</w:t>
+      </w:r>
+      <w:r>
+        <w:rPr>
+          <w:b w:val="0"/>
+        </w:rPr>
+        <w:t xml:space="preserve"> under [Service] using </w:t>
+      </w:r>
+      <w:r>
+        <w:rPr>
+          <w:b/>
+        </w:rPr>
+        <w:t>sudo systemctl edit hearthbound</w:t>
+      </w:r>
+      <w:r>
+        <w:rPr>
+          <w:b w:val="0"/>
+        </w:rPr>
+        <w:t xml:space="preserve">, and set </w:t>
+      </w:r>
+      <w:r>
+        <w:rPr>
+          <w:b/>
+        </w:rPr>
+        <w:t>HOUSE_IMAGE_DIR=/var/lib/hearthbound/house-images</w:t>
+      </w:r>
+      <w:r>
+        <w:rPr>
+          <w:b w:val="0"/>
+        </w:rPr>
+        <w:t xml:space="preserve"> in the production environment. Separate bot/web processes must share the database and image directory. Nginx needs </w:t>
+      </w:r>
+      <w:r>
+        <w:rPr>
+          <w:b/>
+        </w:rPr>
+        <w:t>client_max_body_size 6m;</w:t>
+      </w:r>
+      <w:r>
+        <w:rPr>
+          <w:b w:val="0"/>
+        </w:rPr>
+        <w:t xml:space="preserve"> in its server block; validate its configuration before reloading.</w:t>
+      </w:r>
+    </w:p>
+    <w:p>
+      <w:pPr>
+        <w:keepNext/>
+        <w:spacing w:after="0" w:line="240" w:lineRule="auto"/>
+        <w:ind w:left="173"/>
+      </w:pPr>
+      <w:r>
+        <w:rPr>
+          <w:rFonts w:ascii="Consolas" w:hAnsi="Consolas"/>
+          <w:sz w:val="19"/>
+        </w:rPr>
+        <w:t>npm run deploy:commands</w:t>
+      </w:r>
+    </w:p>
+    <w:p>
+      <w:pPr>
+        <w:keepNext/>
+        <w:spacing w:after="0" w:line="240" w:lineRule="auto"/>
+        <w:ind w:left="173"/>
+      </w:pPr>
+      <w:r>
+        <w:rPr>
+          <w:rFonts w:ascii="Consolas" w:hAnsi="Consolas"/>
+          <w:sz w:val="19"/>
+        </w:rPr>
+        <w:t>sudo systemctl daemon-reload</w:t>
+      </w:r>
+    </w:p>
+    <w:p>
+      <w:pPr>
+        <w:keepNext/>
+        <w:spacing w:after="0" w:line="240" w:lineRule="auto"/>
+        <w:ind w:left="173"/>
+      </w:pPr>
+      <w:r>
+        <w:rPr>
+          <w:rFonts w:ascii="Consolas" w:hAnsi="Consolas"/>
+          <w:sz w:val="19"/>
+        </w:rPr>
+        <w:t>sudo systemctl restart hearthbound</w:t>
+      </w:r>
+    </w:p>
+    <w:p>
+      <w:pPr>
+        <w:keepNext w:val="0"/>
+        <w:spacing w:after="160" w:line="240" w:lineRule="auto"/>
+        <w:ind w:left="173"/>
+      </w:pPr>
+      <w:r>
+        <w:rPr>
+          <w:rFonts w:ascii="Consolas" w:hAnsi="Consolas"/>
+          <w:sz w:val="19"/>
+        </w:rPr>
+        <w:t>sudo journalctl -u hearthbound -n 40 --no-pager</w:t>
       </w:r>
     </w:p>
     <w:p>
       <w:r>
-        <w:t>Configured bot owners manage environment-specific Global requests and grants on the web. Existing designated approval-only IDs also have a dedicated Global approval page without becoming owners or Global administrators. Initial settings bootstrap access does not grant general editing or request approval.</w:t>
+        <w:rPr>
+          <w:b w:val="0"/>
+        </w:rPr>
+        <w:t>Command deployment adds the optional screenshot arguments to /hearth and /housing. Startup applies schema 15 to the configured database automatically. Back up both the database and image files; a database-only backup does not contain screenshots. A backend transfer copies image metadata, so copy image files separately. Keep normal operation at MIGRATE=false; the destructive confirmed backend-transfer mode is not a routine upgrade.</w:t>
       </w:r>
     </w:p>
     <w:p>
@@ -1142,512 +2172,87 @@
         <w:pStyle w:val="Heading2"/>
       </w:pPr>
       <w:r>
-        <w:t>Featured Housing settings</w:t>
-      </w:r>
-    </w:p>
-    <w:p>
-      <w:r>
-        <w:t>Add or reorder eligible saved house or tour records by ID and optional position from 1 to 5. Only eligible Server and Global content in the selected environment can be featured. Houses rotate weekly; manual changes do not restart the cycle. Tours remain curated. Back to Administration returns to the management area.</w:t>
-      </w:r>
-    </w:p>
-    <w:p>
-      <w:pPr>
-        <w:pStyle w:val="Heading2"/>
-      </w:pPr>
-      <w:r>
-        <w:t>Maintenance and export</w:t>
-      </w:r>
-    </w:p>
-    <w:p>
-      <w:r>
-        <w:t>Health reports connection status and bounded integrity metrics. Maintenance supports eligible catalog verification and exact-context duplicate merges, preserving compatible comments and stops. Administrative actions are audited.</w:t>
-      </w:r>
-    </w:p>
-    <w:p>
-      <w:r>
-        <w:t>Audit Log offers paginated history and filtered CSV export. Backup and Export produces an eligible guild/environment JSON snapshot. These administrative views and exports exclude Private records and unsafe historical metadata. A JSON export is not a full database backup. Full database backups contain Private data and need separate secure storage.</w:t>
-      </w:r>
-    </w:p>
-    <w:p>
-      <w:r>
-        <w:br w:type="page"/>
-      </w:r>
-    </w:p>
-    <w:p>
-      <w:pPr>
-        <w:pStyle w:val="Heading1"/>
-      </w:pPr>
-      <w:r>
-        <w:t>Owner tools and community usage</w:t>
-      </w:r>
-    </w:p>
-    <w:p>
-      <w:pPr>
-        <w:pStyle w:val="Heading2"/>
-      </w:pPr>
-      <w:r>
-        <w:t>Add an official house</w:t>
-      </w:r>
-    </w:p>
-    <w:p>
-      <w:r>
-        <w:t>Only Discord user IDs in BOT_OWNER_IDS can add or edit official ESO houses. Open House Catalog on the web, or Administration then Add Official House or Edit Official House in Discord. Server and Global administration alone do not grant this tool.</w:t>
-      </w:r>
-    </w:p>
-    <w:p>
-      <w:r>
-        <w:t>Enter the real positive in-game house ID and official name. The web form also exposes optional zone, classification, type, limits, acquisition, pricing and verification/source metadata. Unknown values should remain blank. Review the preview and explicitly confirm.</w:t>
-      </w:r>
-    </w:p>
-    <w:p>
-      <w:r>
-        <w:t>Adding a duplicate ID is rejected. Existing definitions can be edited with changed-field preview and explicit confirmation; their in-game IDs remain fixed. Edited definitions survive startup seeding and supported database transfers. Catalog deletion is not offered.</w:t>
-      </w:r>
-    </w:p>
-    <w:p>
-      <w:pPr>
-        <w:pStyle w:val="Heading2"/>
-      </w:pPr>
-      <w:r>
-        <w:t>Understand the statistics</w:t>
-      </w:r>
-    </w:p>
-    <w:p>
-      <w:r>
-        <w:t>Statistics uses the selected server and ESO environment. It separates your own Private count from Server and Global registrations and accessible tours. Rankings distinguish registration count, distinct registering Discord members, normalized ESO owners and distinct tour appearances.</w:t>
-      </w:r>
-    </w:p>
-    <w:p>
-      <w:r>
-        <w:t>Community rankings exclude Private records. Average shared-tour length and represented official house types are facts about saved data. They are not counts of visits inside ESO.</w:t>
-      </w:r>
-    </w:p>
-    <w:p>
-      <w:pPr>
-        <w:pStyle w:val="Heading2"/>
-      </w:pPr>
-      <w:r>
-        <w:t>Read recent activity</w:t>
-      </w:r>
-    </w:p>
-    <w:p>
-      <w:r>
-        <w:t>Recent Activity intentionally spans connected servers for signed-in members. Entries show the member, action, originating server or Personal session, source and timestamp, newest first. Filter by server or action, then use Older activity for earlier entries.</w:t>
-      </w:r>
-    </w:p>
-    <w:p>
-      <w:r>
-        <w:t>Private actions use generic descriptions. Private destination references and search text are not placed in the community feed, and linked content is checked again against current access. Meaningful starts, resumes, updates and progress are distinguished; duplicate deliveries are deduplicated. This usage feed is separate from the administrative audit log.</w:t>
-      </w:r>
-    </w:p>
-    <w:p>
-      <w:r>
-        <w:t>Recording begins after deployment; earlier usage is not reconstructed. The window is 90 days. Expired entries disappear from views immediately, while startup and hourly cleanup remove physical rows in batches of 1,000. Logging failure does not fail an otherwise successful user action.</w:t>
-      </w:r>
-    </w:p>
-    <w:p>
-      <w:r>
-        <w:br w:type="page"/>
-      </w:r>
-    </w:p>
-    <w:p>
-      <w:pPr>
-        <w:pStyle w:val="Heading1"/>
-      </w:pPr>
-      <w:r>
-        <w:t>Configuration and remembered login</w:t>
-      </w:r>
-    </w:p>
-    <w:p>
-      <w:r>
-        <w:t>Keep existing Discord and database credentials. Configure the deployed .env or the actual systemd environment source. A systemd-provided value takes precedence over .env. For a typical HTTPS deployment:</w:t>
+        <w:t>Diagnose and find the full reference</w:t>
       </w:r>
     </w:p>
     <w:p>
       <w:r>
         <w:rPr>
-          <w:rFonts w:ascii="Consolas" w:hAnsi="Consolas"/>
-          <w:sz w:val="18"/>
+          <w:b w:val="0"/>
         </w:rPr>
-        <w:t>ADMIN_INTERFACE=both</w:t>
-        <w:br/>
-        <w:t>WEB_ADMIN_ENABLED=true</w:t>
-        <w:br/>
-        <w:t>WEB_PORTAL_ENABLED=true</w:t>
-        <w:br/>
-        <w:t>WEB_PORTAL_URL=https://YOUR_PORTAL_HOST/app</w:t>
-        <w:br/>
-        <w:t>WEB_ADMIN_HOST=127.0.0.1</w:t>
-        <w:br/>
-        <w:t>WEB_ADMIN_PORT=8787</w:t>
-        <w:br/>
-        <w:t>WEB_SESSION_SECRET=YOUR_STABLE_RANDOM_SECRET</w:t>
-        <w:br/>
-        <w:t>WEB_SESSION_DAYS=30</w:t>
-        <w:br/>
-        <w:t>DISCORD_OAUTH_REDIRECT_URI=https://YOUR_PORTAL_HOST/auth/callback</w:t>
+        <w:t xml:space="preserve">For a web 502, check </w:t>
       </w:r>
-    </w:p>
-    <w:p>
       <w:r>
-        <w:t>Also configure DISCORD_OAUTH_CLIENT_ID and DISCORD_OAUTH_CLIENT_SECRET. Register the exact callback in the Discord Developer Portal and forward HTTPS through your reverse proxy to the loopback listener. The portal starts after Discord connects. WEB_PORTAL_URL provides the Discord Open Web Portal button when enabled.</w:t>
+        <w:rPr>
+          <w:b/>
+        </w:rPr>
+        <w:t>sudo systemctl status hearthbound --no-pager -l</w:t>
       </w:r>
-    </w:p>
-    <w:p>
-      <w:pPr>
-        <w:pStyle w:val="Heading2"/>
-      </w:pPr>
       <w:r>
-        <w:t>Remember sign in</w:t>
-      </w:r>
-    </w:p>
-    <w:p>
-      <w:r>
-        <w:t>New sessions last 30 days by default, including browser closes and service restarts. WEB_SESSION_DAYS accepts whole numbers from 1 to 365. Expiry is fixed from issuance or a new server selection; page views do not extend it indefinitely. Sign Out clears this browser’s cookie. Existing eight-hour sessions keep their old expiry, so sign out and back in once after upgrading.</w:t>
-      </w:r>
-    </w:p>
-    <w:p>
-      <w:r>
-        <w:t>Generate a secret with openssl rand -hex 32. WEB_SESSION_SECRET is independent of Discord and database credentials; keep it stable across restarts. Changing it signs everyone out. Restart after configuration changes. Membership and permissions are still checked on protected requests. Browsers that clear cookies require another login.</w:t>
-      </w:r>
-    </w:p>
-    <w:p>
-      <w:pPr>
-        <w:pStyle w:val="Heading2"/>
-      </w:pPr>
-      <w:r>
-        <w:t>Update the Debian service</w:t>
-      </w:r>
-    </w:p>
-    <w:p>
-      <w:r>
-        <w:t>Back up the live database and configuration, preserve tracked local changes, then update from the application account. Use the actual installation directory and service name:</w:t>
+        <w:rPr>
+          <w:b w:val="0"/>
+        </w:rPr>
+        <w:t xml:space="preserve"> and the journal above. Startup may still be initializing the web listener. For repeated logins, check cookies, a stable session secret, the public HTTPS URL and exact OAuth callback. For denied edits, check the selected server, environment, ownership, visibility and current role or grant.</w:t>
       </w:r>
     </w:p>
     <w:p>
       <w:r>
         <w:rPr>
-          <w:rFonts w:ascii="Consolas" w:hAnsi="Consolas"/>
-          <w:sz w:val="18"/>
+          <w:b w:val="0"/>
         </w:rPr>
-        <w:t>sudo systemctl stop hearthbound</w:t>
-        <w:br/>
-        <w:t>cd ~/AddressBook</w:t>
-        <w:br/>
-        <w:t>git status --short</w:t>
-        <w:br/>
-        <w:t>git pull --ff-only origin master</w:t>
-        <w:br/>
-        <w:t>npm ci</w:t>
-        <w:br/>
-        <w:t>sudo systemctl start hearthbound</w:t>
-        <w:br/>
-        <w:t>sudo systemctl status hearthbound --no-pager</w:t>
+        <w:t xml:space="preserve">Read </w:t>
       </w:r>
-    </w:p>
-    <w:p>
-      <w:r>
-        <w:t>The repository is now skperdue68/HearthBound; existing folder and database names may retain AddressBook. Preserve systemd User, WorkingDirectory, ExecStart, EnvironmentFile and database settings. The remembered-login update needs no database migration or slash-command redeployment.</w:t>
-      </w:r>
-    </w:p>
-    <w:p>
-      <w:r>
-        <w:br w:type="page"/>
-      </w:r>
-    </w:p>
-    <w:p>
-      <w:pPr>
-        <w:pStyle w:val="Heading1"/>
-      </w:pPr>
-      <w:r>
-        <w:t>Database operations and troubleshooting</w:t>
-      </w:r>
-    </w:p>
-    <w:p>
-      <w:pPr>
-        <w:pStyle w:val="Heading2"/>
-      </w:pPr>
-      <w:r>
-        <w:t>Upgrade the configured production database</w:t>
-      </w:r>
-    </w:p>
-    <w:p>
-      <w:r>
-        <w:t>SQLite and MariaDB are supported. Keep DB_TYPE and existing path or connection settings. Normal upgrades use MIGRATE=false. Pulling code alone does not change the database: application startup or npm run db:init applies versioned migrations to the configured backend.</w:t>
-      </w:r>
-    </w:p>
-    <w:p>
-      <w:r>
-        <w:t>Schema 12 adds usage records and owner catalog provenance while retaining existing housing, tours, access grants and progress. Back up before startup and follow docs/upgrade-v1.0.62.md for checks and recovery. Do not replace the Linux production database with an old Windows development copy. Schema 13 adds normalized classification profiles, reusable catalog values and per-house capacity exceptions. Existing registrations and tour links are retained.</w:t>
-      </w:r>
-    </w:p>
-    <w:p>
-      <w:r>
-        <w:t>MIGRATE=true with MIGRATE_CONFIRM=ERASE_TARGET_DATABASE is a separate destructive backend transfer. It validates the source, erases the destination, copies and verifies data, writes a completion marker and exits. It intentionally excludes transient active tour sessions and Share Pass session links. Use independently verified backups and restore MIGRATE=false before normal operation.</w:t>
-      </w:r>
-    </w:p>
-    <w:p>
-      <w:pPr>
-        <w:pStyle w:val="Heading2"/>
-      </w:pPr>
-      <w:r>
-        <w:t>Check service and login problems</w:t>
-      </w:r>
-    </w:p>
-    <w:p>
+      <w:hyperlink r:id="rId11">
+        <w:r>
+          <w:rPr>
+            <w:color w:val="245D91"/>
+            <w:u w:val="single"/>
+          </w:rPr>
+          <w:t>the gallery upgrade guide</w:t>
+        </w:r>
+      </w:hyperlink>
       <w:r>
         <w:rPr>
-          <w:rFonts w:ascii="Consolas" w:hAnsi="Consolas"/>
-          <w:sz w:val="18"/>
+          <w:b w:val="0"/>
         </w:rPr>
-        <w:t>sudo journalctl -u hearthbound -n 100 --no-pager</w:t>
-        <w:br/>
-        <w:t>systemctl show hearthbound -p WorkingDirectory -p EnvironmentFiles</w:t>
-        <w:br/>
-        <w:t>sudo systemctl restart hearthbound</w:t>
+        <w:t xml:space="preserve">, </w:t>
       </w:r>
-    </w:p>
-    <w:p>
+      <w:hyperlink r:id="rId12">
+        <w:r>
+          <w:rPr>
+            <w:color w:val="245D91"/>
+            <w:u w:val="single"/>
+          </w:rPr>
+          <w:t>member guide</w:t>
+        </w:r>
+      </w:hyperlink>
       <w:r>
-        <w:t>Use daemon-reload only after changing the systemd unit file. If startup fails after an upgrade, stop the service and follow the recovery guide with a matching database backup and code version; do not run older code against a newer schema blindly.</w:t>
+        <w:rPr>
+          <w:b w:val="0"/>
+        </w:rPr>
+        <w:t xml:space="preserve"> and </w:t>
       </w:r>
-    </w:p>
-    <w:p>
+      <w:hyperlink r:id="rId13">
+        <w:r>
+          <w:rPr>
+            <w:color w:val="245D91"/>
+            <w:u w:val="single"/>
+          </w:rPr>
+          <w:t>administration reference</w:t>
+        </w:r>
+      </w:hyperlink>
       <w:r>
-        <w:t>Repeated login prompts can indicate cleared cookies, an old session, a changing session secret or conflicting environment sources. Check the public HTTPS URL and exact OAuth callback. If editing is denied, check the selected server, ESO environment, current role or grant, ownership and visibility. Administrator access never overrides another creator’s Private records.</w:t>
-      </w:r>
-    </w:p>
-    <w:p>
-      <w:r>
-        <w:t>Members recover their own legacy unassigned Private records through My Address Book. Administrators recover only provably guild-linked shared tours through Discord or web recovery previews. Catalog conflict warnings require owner review rather than silently overwriting definitions.</w:t>
-      </w:r>
-    </w:p>
-    <w:p>
-      <w:pPr>
-        <w:pStyle w:val="Heading2"/>
-      </w:pPr>
-      <w:r>
-        <w:t>Reference material</w:t>
-      </w:r>
-    </w:p>
-    <w:p>
-      <w:r>
-        <w:t>README.md links to docs/member-guide.md, docs/administration.md, docs/HearthBound-current-state.md and docs/upgrade-v1.0.62.md. docs/historical-documentation.md identifies older AddressBook references and historical design notes. Use the current guides for deployment and the portal; retain older documents only as history.</w:t>
-      </w:r>
-    </w:p>
-    <w:p>
-      <w:r>
-        <w:br w:type="page"/>
-      </w:r>
-    </w:p>
-    <w:p>
-      <w:pPr>
-        <w:pStyle w:val="Heading1"/>
-      </w:pPr>
-      <w:r>
-        <w:t>Expanded web collections and tours</w:t>
-      </w:r>
-    </w:p>
-    <w:p>
-      <w:pPr>
-        <w:pStyle w:val="Heading2"/>
-      </w:pPr>
-      <w:r>
-        <w:t>Access based controls</w:t>
-      </w:r>
-    </w:p>
-    <w:p>
-      <w:r>
-        <w:t>Administration, settings, catalog tools and record actions appear only when your current HearthBound capabilities permit them. Direct URLs and submissions independently recheck membership, ownership, server and ESO environment. Other members’ Private records remain protected even from administrators and bot owners.</w:t>
-      </w:r>
-    </w:p>
-    <w:p>
-      <w:pPr>
-        <w:pStyle w:val="Heading2"/>
-      </w:pPr>
-      <w:r>
-        <w:t>House actions</w:t>
-      </w:r>
-    </w:p>
-    <w:p>
-      <w:r>
-        <w:t>Open a house to favorite it, set Want to Visit or Visited, read or add comments, report a problem and copy ESO access links. Official metadata is available below the house. Authorized editors can change visibility or delete the registration after reviewing the impact. The catalog definition and other registrations remain.</w:t>
-      </w:r>
-    </w:p>
-    <w:p>
-      <w:pPr>
-        <w:pStyle w:val="Heading2"/>
-      </w:pPr>
-      <w:r>
-        <w:t>Saved searches and ordered results</w:t>
-      </w:r>
-    </w:p>
-    <w:p>
-      <w:r>
-        <w:t>Advanced Search supports names, owners, tags, zones, types, styles and visibility. Save filters, run, rename or delete searches from My Address Book. Select multiple results to add to an eligible tour. Checkbox selection order is retained; review and drag stops or use Move up and Move down before saving.</w:t>
-      </w:r>
-    </w:p>
-    <w:p>
-      <w:pPr>
-        <w:pStyle w:val="Heading2"/>
-      </w:pPr>
-      <w:r>
-        <w:t>Independent web player</w:t>
-      </w:r>
-    </w:p>
-    <w:p>
-      <w:r>
-        <w:t>Start or resume a tour to see the current house, notes and jump links. Complete a stop and advance, return to the previous stop or restart deliberately. Progress is saved and reconciled with route changes. The web player does not create or control a live Discord session. Tour editors can update stop titles and notes or confirm tour deletion.</w:t>
-      </w:r>
-    </w:p>
-    <w:p>
-      <w:r>
-        <w:br w:type="page"/>
-      </w:r>
-    </w:p>
-    <w:p>
-      <w:pPr>
-        <w:pStyle w:val="Heading1"/>
-      </w:pPr>
-      <w:r>
-        <w:t>Web sharing and server operations</w:t>
-      </w:r>
-    </w:p>
-    <w:p>
-      <w:pPr>
-        <w:pStyle w:val="Heading2"/>
-      </w:pPr>
-      <w:r>
-        <w:t>Share Passes</w:t>
-      </w:r>
-    </w:p>
-    <w:p>
-      <w:r>
-        <w:t>Create a revocable web link from a house or tour, or choose a Discord channel and optional existing thread. Review and confirm before posting. Both your and the bot’s permissions are checked again before sending. Manage your own passes under My Address Book. Issuing a replacement link invalidates the old token, including old Discord cards.</w:t>
-      </w:r>
-    </w:p>
-    <w:p>
-      <w:pPr>
-        <w:pStyle w:val="Heading2"/>
-      </w:pPr>
-      <w:r>
-        <w:t>Private pass access</w:t>
-      </w:r>
-    </w:p>
-    <w:p>
-      <w:r>
-        <w:t>An explicit pass provides limited viewing without ordinary Private visibility or editing rights. A shared tour supports independent web navigation; copy it to My Address Book to save persistent personal progress. Copies belong to their creators and remain after pass revocation. Further pass access stops when the pass is revoked.</w:t>
-      </w:r>
-    </w:p>
-    <w:p>
-      <w:pPr>
-        <w:pStyle w:val="Heading2"/>
-      </w:pPr>
-      <w:r>
-        <w:t>Configuration and recovery</w:t>
-      </w:r>
-    </w:p>
-    <w:p>
-      <w:r>
-        <w:t>Authorized server settings include channel, timezone, registration roles and policies, Featured expiration and ordering, environment changes and legacy recovery. Environment and recovery actions show impact counts before confirmation. Private recovery applies only to the signed-in creator’s records. Owner-only catalog and Global approval controls retain their existing boundaries.</w:t>
-      </w:r>
-    </w:p>
-    <w:p>
-      <w:pPr>
-        <w:pStyle w:val="Heading2"/>
-      </w:pPr>
-      <w:r>
-        <w:t>Deploying this update</w:t>
-      </w:r>
-    </w:p>
-    <w:p>
-      <w:r>
-        <w:t>The catalog management update adds schema 13. Back up production, pull the merged code, run npm ci and restart hearthbound.service. Startup migrates the configured Linux database in place. Preserve .env, WEB_SESSION_SECRET and the existing database settings. Do not copy a Windows test database to production. Follow docs/upgrade-v1.0.63.md for verification and rollback.</w:t>
-      </w:r>
-    </w:p>
-    <w:p>
-      <w:r>
-        <w:br w:type="page"/>
-      </w:r>
-    </w:p>
-    <w:p>
-      <w:pPr>
-        <w:pStyle w:val="Heading1"/>
-      </w:pPr>
-      <w:r>
-        <w:t>Owner catalog management</w:t>
-      </w:r>
-    </w:p>
-    <w:p>
-      <w:pPr>
-        <w:pStyle w:val="Heading2"/>
-      </w:pPr>
-      <w:r>
-        <w:t>Editing an existing official house</w:t>
-      </w:r>
-    </w:p>
-    <w:p>
-      <w:r>
-        <w:t>Open House Catalog, search by official name or numeric ID, and choose Edit official house. Update the grouped metadata fields, preview the changed fields and explicitly confirm. The in-game ID is fixed. Registrations and tour stops remain linked; edited definitions are protected from startup seed replacement.</w:t>
-      </w:r>
-    </w:p>
-    <w:p>
-      <w:pPr>
-        <w:pStyle w:val="Heading2"/>
-      </w:pPr>
-      <w:r>
-        <w:t>Shared classification profiles</w:t>
-      </w:r>
-    </w:p>
-    <w:p>
-      <w:r>
-        <w:t>Classification profiles store furnishing, collectible and visitor defaults separately for Staple, Classic and Notable homes. Apply selected classification defaults changes only the current house draft; adjust individual fields for exceptions. Changing a shared profile previews the number of existing houses affected before confirmation, while preserving explicit house exceptions.</w:t>
-      </w:r>
-    </w:p>
-    <w:p>
-      <w:pPr>
-        <w:pStyle w:val="Heading2"/>
-      </w:pPr>
-      <w:r>
-        <w:t>Reusable metadata suggestions</w:t>
-      </w:r>
-    </w:p>
-    <w:p>
-      <w:r>
-        <w:t>Styles, zones, subzones, house types, purchase types and availability values live in a shared lookup table. Autocomplete suggests existing values and permits new text. New values become reusable after a house is saved. Shared values also supports adding suggestions, previewing a rename across houses and removing unused values.</w:t>
-      </w:r>
-    </w:p>
-    <w:p>
-      <w:pPr>
-        <w:pStyle w:val="Heading2"/>
-      </w:pPr>
-      <w:r>
-        <w:t>Database upgrade and safety</w:t>
-      </w:r>
-    </w:p>
-    <w:p>
-      <w:r>
-        <w:t>Migration 13 creates house_classifications, house_catalog_values and house_capacity_overrides. Existing flat house fields remain populated for Discord and search compatibility. Startup upgrades the configured backend automatically after a verified backup. Restore matching old code and database together if rollback is necessary.</w:t>
-      </w:r>
-    </w:p>
-    <w:p>
-      <w:pPr>
-        <w:pStyle w:val="Heading2"/>
-      </w:pPr>
-      <w:r>
-        <w:t>Discord and web access</w:t>
-      </w:r>
-    </w:p>
-    <w:p>
-      <w:r>
-        <w:t>Bot owners can use Administration then Edit Official House in Discord for core fields, with lookup, preview and confirmation. Use the web portal for full capacity, purchase and shared-value management. These tools do not expand access to another creator’s Private houses or tours.</w:t>
+        <w:rPr>
+          <w:b w:val="0"/>
+        </w:rPr>
+        <w:t xml:space="preserve"> for full configuration, backup and recovery details. Restore matching code, database and image backups together when rolling back a schema-changing upgrade.</w:t>
       </w:r>
     </w:p>
     <w:sectPr>
       <w:headerReference w:type="default" r:id="rId9"/>
       <w:footerReference w:type="default" r:id="rId10"/>
       <w:pgSz w:w="12240" w:h="15840"/>
-      <w:pgMar w:top="936" w:right="1080" w:bottom="936" w:left="1080" w:header="720" w:footer="720" w:gutter="0"/>
+      <w:pgMar w:top="1008" w:right="1152" w:bottom="1008" w:left="1152" w:header="432" w:footer="432" w:gutter="0"/>
       <w:cols w:space="720"/>
       <w:docGrid w:linePitch="360"/>
     </w:sectPr>
@@ -1660,12 +2265,14 @@
   <w:p>
     <w:pPr>
       <w:pStyle w:val="Footer"/>
+      <w:jc w:val="right"/>
     </w:pPr>
     <w:r>
       <w:rPr>
+        <w:color w:val="65788D"/>
         <w:sz w:val="16"/>
       </w:rPr>
-      <w:t xml:space="preserve">HearthBound  •  24 October 2026                                         </w:t>
+      <w:t xml:space="preserve">HearthBound   |   </w:t>
     </w:r>
     <w:fldSimple w:instr="PAGE"/>
   </w:p>
@@ -1680,9 +2287,10 @@
     </w:pPr>
     <w:r>
       <w:rPr>
+        <w:color w:val="65788D"/>
         <w:sz w:val="16"/>
       </w:rPr>
-      <w:t>HEARTHBOUND  /  USER AND ADMINISTRATOR GUIDE</w:t>
+      <w:t>HEARTHBOUND   /   USER AND ADMINISTRATOR GUIDE</w:t>
     </w:r>
   </w:p>
 </w:hdr>
@@ -1887,6 +2495,34 @@
   </w:num>
   <w:num w:numId="9">
     <w:abstractNumId w:val="0"/>
+  </w:num>
+  <w:abstractNum w:abstractNumId="9">
+    <w:lvl w:ilvl="0">
+      <w:start w:val="1"/>
+      <w:numFmt w:val="decimal"/>
+      <w:lvlText w:val="%1."/>
+      <w:suff w:val="tab"/>
+      <w:pPr>
+        <w:ind w:left="360" w:hanging="360"/>
+      </w:pPr>
+    </w:lvl>
+  </w:abstractNum>
+  <w:num w:numId="10">
+    <w:abstractNumId w:val="9"/>
+  </w:num>
+  <w:abstractNum w:abstractNumId="10">
+    <w:lvl w:ilvl="0">
+      <w:start w:val="1"/>
+      <w:numFmt w:val="decimal"/>
+      <w:lvlText w:val="%1."/>
+      <w:suff w:val="tab"/>
+      <w:pPr>
+        <w:ind w:left="360" w:hanging="360"/>
+      </w:pPr>
+    </w:lvl>
+  </w:abstractNum>
+  <w:num w:numId="11">
+    <w:abstractNumId w:val="10"/>
   </w:num>
 </w:numbering>
 </file>
@@ -2052,12 +2688,12 @@
     <w:qFormat/>
     <w:rsid w:val="00FC693F"/>
     <w:pPr>
-      <w:spacing w:after="140" w:line="254" w:lineRule="auto"/>
+      <w:spacing w:line="259" w:lineRule="auto" w:after="120"/>
     </w:pPr>
     <w:rPr>
-      <w:rFonts w:ascii="Arial" w:hAnsi="Arial"/>
-      <w:color w:val="000000"/>
-      <w:sz w:val="21"/>
+      <w:rFonts w:ascii="Calibri" w:hAnsi="Calibri"/>
+      <w:color w:val="172638"/>
+      <w:sz w:val="22"/>
     </w:rPr>
   </w:style>
   <w:style w:type="paragraph" w:styleId="Header">
@@ -2115,16 +2751,17 @@
     <w:pPr>
       <w:keepNext/>
       <w:keepLines/>
-      <w:spacing w:before="220" w:after="120"/>
+      <w:spacing w:before="200" w:after="100"/>
       <w:outlineLvl w:val="0"/>
     </w:pPr>
     <w:rPr>
-      <w:rFonts w:asciiTheme="majorHAnsi" w:eastAsiaTheme="majorEastAsia" w:hAnsiTheme="majorHAnsi" w:cstheme="majorBidi" w:ascii="Arial" w:hAnsi="Arial"/>
+      <w:rFonts w:asciiTheme="majorHAnsi" w:eastAsiaTheme="majorEastAsia" w:hAnsiTheme="majorHAnsi" w:cstheme="majorBidi" w:ascii="Calibri" w:hAnsi="Calibri"/>
       <w:b/>
       <w:bCs/>
-      <w:color w:val="000000"/>
-      <w:sz w:val="34"/>
+      <w:color w:val="17324D"/>
+      <w:sz w:val="36"/>
       <w:szCs w:val="28"/>
+      <w:u w:val="none"/>
     </w:rPr>
   </w:style>
   <w:style w:type="paragraph" w:styleId="Heading2">
@@ -2139,16 +2776,17 @@
     <w:pPr>
       <w:keepNext/>
       <w:keepLines/>
-      <w:spacing w:before="220" w:after="120"/>
+      <w:spacing w:before="200" w:after="100"/>
       <w:outlineLvl w:val="1"/>
     </w:pPr>
     <w:rPr>
-      <w:rFonts w:asciiTheme="majorHAnsi" w:eastAsiaTheme="majorEastAsia" w:hAnsiTheme="majorHAnsi" w:cstheme="majorBidi" w:ascii="Arial" w:hAnsi="Arial"/>
+      <w:rFonts w:asciiTheme="majorHAnsi" w:eastAsiaTheme="majorEastAsia" w:hAnsiTheme="majorHAnsi" w:cstheme="majorBidi" w:ascii="Calibri" w:hAnsi="Calibri"/>
       <w:b/>
       <w:bCs/>
-      <w:color w:val="000000"/>
+      <w:color w:val="17324D"/>
       <w:sz w:val="24"/>
       <w:szCs w:val="26"/>
+      <w:u w:val="none"/>
     </w:rPr>
   </w:style>
   <w:style w:type="paragraph" w:styleId="Heading3">
@@ -2401,16 +3039,19 @@
     <w:qFormat/>
     <w:rsid w:val="00FC693F"/>
     <w:pPr>
-      <w:spacing w:after="120" w:line="240" w:lineRule="auto" w:before="220"/>
+      <w:keepNext/>
+      <w:spacing w:after="200" w:line="240" w:lineRule="auto" w:before="0"/>
       <w:contextualSpacing/>
     </w:pPr>
     <w:rPr>
-      <w:rFonts w:asciiTheme="majorHAnsi" w:eastAsiaTheme="majorEastAsia" w:hAnsiTheme="majorHAnsi" w:cstheme="majorBidi" w:ascii="Arial" w:hAnsi="Arial"/>
+      <w:rFonts w:asciiTheme="majorHAnsi" w:eastAsiaTheme="majorEastAsia" w:hAnsiTheme="majorHAnsi" w:cstheme="majorBidi" w:ascii="Calibri" w:hAnsi="Calibri"/>
+      <w:b w:val="0"/>
       <w:color w:val="000000"/>
       <w:spacing w:val="5"/>
       <w:kern w:val="28"/>
-      <w:sz w:val="50"/>
+      <w:sz w:val="52"/>
       <w:szCs w:val="52"/>
+      <w:u w:val="none"/>
     </w:rPr>
   </w:style>
   <w:style w:type="character" w:customStyle="1" w:styleId="TitleChar">
@@ -2440,13 +3081,12 @@
       <w:numPr>
         <w:ilvl w:val="1"/>
       </w:numPr>
-      <w:spacing w:before="220" w:after="120"/>
     </w:pPr>
     <w:rPr>
-      <w:rFonts w:asciiTheme="majorHAnsi" w:eastAsiaTheme="majorEastAsia" w:hAnsiTheme="majorHAnsi" w:cstheme="majorBidi" w:ascii="Arial" w:hAnsi="Arial"/>
+      <w:rFonts w:asciiTheme="majorHAnsi" w:eastAsiaTheme="majorEastAsia" w:hAnsiTheme="majorHAnsi" w:cstheme="majorBidi"/>
       <w:i/>
       <w:iCs/>
-      <w:color w:val="000000"/>
+      <w:color w:val="4F81BD" w:themeColor="accent1"/>
       <w:spacing w:val="15"/>
       <w:sz w:val="24"/>
       <w:szCs w:val="24"/>
@@ -2886,9 +3526,6 @@
     <w:qFormat/>
     <w:rsid w:val="00FC693F"/>
     <w:pPr>
-      <w:pBdr>
-        <w:bottom w:val="single" w:sz="4" w:space="4" w:color="4F81BD" w:themeColor="accent1"/>
-      </w:pBdr>
       <w:spacing w:before="200" w:after="280"/>
       <w:ind w:left="936" w:right="936"/>
     </w:pPr>

</xml_diff>

<commit_message>
Polish house discovery, sharing defaults and personal controls
</commit_message>
<xml_diff>
--- a/HearthBound_User_Admin_Guide.docx
+++ b/HearthBound_User_Admin_Guide.docx
@@ -649,7 +649,7 @@
         <w:rPr>
           <w:b w:val="0"/>
         </w:rPr>
-        <w:t>Eligible administrators can copy a shared registration between servers or reassign its Discord submitter to a member of the relevant server. If the original submitter is not in the destination server, the person copying becomes the submitter. The ESO account owner remains a separate field. These administrative tools do not reassign another creator's Private content.</w:t>
+        <w:t>Eligible administrators can copy a shared registration between servers or reassign its Discord submitter to a member of the relevant server. Search members by name and choose from the results; a member ID or mention is also accepted. If the original submitter is not in the destination server, the person copying becomes the submitter. The ESO account owner remains a separate field. These administrative tools do not reassign another creator's Private content.</w:t>
       </w:r>
     </w:p>
     <w:p>
@@ -697,7 +697,7 @@
         <w:rPr>
           <w:b w:val="0"/>
         </w:rPr>
-        <w:t xml:space="preserve"> combines your submitted homes with places you intentionally saved. Favorites, Want to Visit and Visited provide focused collections. Submitted records, recent views, pending submissions, saved searches and tour progress have their own destinations.</w:t>
+        <w:t xml:space="preserve"> combines your submitted homes with places you intentionally saved. Favorites provide a focused collection. Submitted records, recent views, pending submissions, saved searches and tour progress have their own destinations.</w:t>
       </w:r>
     </w:p>
     <w:p>
@@ -705,7 +705,7 @@
         <w:rPr>
           <w:b w:val="0"/>
         </w:rPr>
-        <w:t>Favorite and visit state are independent. Use Unfavorite to remove a favorite. Change the visit selector to Visited after a visit, or choose Not marked to clear it. On the web, visit changes save automatically and report success or failure. Discord house and tour-stop cards expose reversible marks and Add Comment directly.</w:t>
+        <w:t>Use Favorite to save a house and Unfavorite to remove it. Visit-status controls have been retired from both interfaces. On Discord house cards, open Comments to read or add a comment; the count refreshes when you return. Editors use Manage House for editing, visibility and deletion.</w:t>
       </w:r>
     </w:p>
     <w:p>
@@ -745,7 +745,7 @@
         <w:rPr>
           <w:b w:val="0"/>
         </w:rPr>
-        <w:t>Share a detail you enjoyed, an observation or a thank-you. The author and date appear above each comment. Discord's newest-first reader has two comments per page, navigation and a direct page jump. Add Comment from a house or tour-stop card returns to that same card; adding from the reader returns to its newest page.</w:t>
+        <w:t>Share a detail you enjoyed, an observation or a thank-you. The author and date appear above each comment. Discord's newest-first reader has two comments per page, navigation and a direct page jump. Comments opens the reader from a house card. Add Comment from a tour-stop card returns to that stop; adding from the reader returns to its newest page.</w:t>
       </w:r>
     </w:p>
     <w:p>
@@ -793,7 +793,7 @@
         <w:rPr>
           <w:b w:val="0"/>
         </w:rPr>
-        <w:t>. Editors upload an image with an optional caption, choose a cover, edit captions or remove images. With no image, the house stays readable as a text card; no fake screenshot is substituted.</w:t>
+        <w:t>. Editors upload an image with an optional caption, choose a cover, move screenshots earlier or later, edit captions or remove images. With no image, the house stays readable as a text card; no fake screenshot is substituted.</w:t>
       </w:r>
     </w:p>
     <w:p>
@@ -1273,7 +1273,7 @@
         <w:rPr>
           <w:b w:val="0"/>
         </w:rPr>
-        <w:t xml:space="preserve"> to create or post a Share Pass. Choose an accessible channel and, if offered, an optional thread, then confirm the destination. A pass is limited to its configured environment and can be revoked. Copy and editing actions appear only where the applicable access rules permit them.</w:t>
+        <w:t xml:space="preserve"> to create or post a Share Pass. Choose an accessible channel and, if offered, an optional thread, then confirm the destination. Your last successful channel or thread in that server is offered again when permissions still allow it. A pass is limited to its configured environment and can be revoked. Copy and editing actions appear only where the applicable access rules permit them.</w:t>
       </w:r>
     </w:p>
     <w:p>
@@ -1339,7 +1339,7 @@
         <w:rPr>
           <w:b w:val="0"/>
         </w:rPr>
-        <w:t xml:space="preserve"> displays richer house cards and curated tours. House selections rotate weekly. Favorites and recorded visit interest modestly influence selection while variety and randomness remain; popularity does not determine every result. Previous-cycle destinations are avoided when enough alternatives exist. Each featured category is capped at four entries.</w:t>
+        <w:t xml:space="preserve"> displays richer house cards and curated tours. House selections rotate weekly. Favorites and previously recorded visit interest modestly influence selection while variety and randomness remain; popularity does not determine every result. Previous-cycle destinations are avoided when enough alternatives exist. Each featured category is capped at four entries.</w:t>
       </w:r>
     </w:p>
     <w:p>
@@ -1347,7 +1347,7 @@
         <w:rPr>
           <w:b w:val="0"/>
         </w:rPr>
-        <w:t>HearthBound records app actions, not actual movement inside ESO. Marking Visited is a member's saved state, not a measured in-game visit.</w:t>
+        <w:t>HearthBound records app actions, not actual movement inside ESO. Past personal visit-state records are retained, but their controls are no longer displayed.</w:t>
       </w:r>
     </w:p>
     <w:p>

</xml_diff>